<commit_message>
Me cago en mara y los calculos que tuve que hacergit add .git add .! 7 HORAS CON UN WORD
</commit_message>
<xml_diff>
--- a/Marketing.docx
+++ b/Marketing.docx
@@ -489,94 +489,293 @@
         <w:rPr>
           <w:lang w:val="es-ES"/>
         </w:rPr>
-        <w:t>EJEMPLO:</w:t>
-      </w:r>
-      <w:r>
-        <w:rPr>
-          <w:lang w:val="es-ES"/>
-        </w:rPr>
-        <w:t xml:space="preserve"> 10 * 10% finito</w:t>
-      </w:r>
-    </w:p>
-    <w:p>
-      <w:pPr>
-        <w:rPr>
-          <w:lang w:val="es-ES"/>
-        </w:rPr>
-      </w:pPr>
-      <w:r>
-        <w:rPr>
-          <w:lang w:val="es-ES"/>
-        </w:rPr>
-        <w:t>20 * 10% grande</w:t>
-      </w:r>
-    </w:p>
-    <w:p>
-      <w:pPr>
-        <w:rPr>
-          <w:lang w:val="es-ES"/>
-        </w:rPr>
-      </w:pPr>
-      <w:r>
-        <w:rPr>
-          <w:lang w:val="es-ES"/>
-        </w:rPr>
-        <w:t>30 * 10% enciclopedia</w:t>
-      </w:r>
-    </w:p>
-    <w:p>
-      <w:pPr>
-        <w:rPr>
-          <w:lang w:val="es-ES"/>
-        </w:rPr>
-      </w:pPr>
-      <w:r>
-        <w:rPr>
-          <w:lang w:val="es-ES"/>
-        </w:rPr>
         <w:t>-----------------------------------------</w:t>
       </w:r>
     </w:p>
-    <w:p>
-      <w:pPr>
-        <w:rPr>
-          <w:lang w:val="es-ES"/>
-        </w:rPr>
-      </w:pPr>
-      <w:r>
-        <w:rPr>
+    <w:tbl>
+      <w:tblPr>
+        <w:tblStyle w:val="Tablaconcuadrcula"/>
+        <w:tblW w:w="0" w:type="auto"/>
+        <w:tblLook w:val="04A0" w:firstRow="1" w:lastRow="0" w:firstColumn="1" w:lastColumn="0" w:noHBand="0" w:noVBand="1"/>
+      </w:tblPr>
+      <w:tblGrid>
+        <w:gridCol w:w="2830"/>
+        <w:gridCol w:w="2410"/>
+      </w:tblGrid>
+      <w:tr>
+        <w:trPr>
+          <w:trHeight w:val="840"/>
+        </w:trPr>
+        <w:tc>
+          <w:tcPr>
+            <w:tcW w:w="2830" w:type="dxa"/>
+          </w:tcPr>
+          <w:p>
+            <w:pPr>
+              <w:rPr>
+                <w:lang w:val="es-ES"/>
+              </w:rPr>
+            </w:pPr>
+            <w:r>
+              <w:rPr>
+                <w:lang w:val="es-ES"/>
+              </w:rPr>
+              <w:t>Costo Producción Total</w:t>
+            </w:r>
+          </w:p>
+        </w:tc>
+        <w:tc>
+          <w:tcPr>
+            <w:tcW w:w="2410" w:type="dxa"/>
+          </w:tcPr>
+          <w:p>
+            <w:pPr>
+              <w:rPr>
+                <w:lang w:val="es-ES"/>
+              </w:rPr>
+            </w:pPr>
+            <w:r>
+              <w:rPr>
+                <w:lang w:val="es-ES"/>
+              </w:rPr>
+              <w:t>9</w:t>
+            </w:r>
+            <w:r>
+              <w:rPr>
+                <w:lang w:val="es-ES"/>
+              </w:rPr>
+              <w:t>55</w:t>
+            </w:r>
+            <w:r>
+              <w:rPr>
+                <w:lang w:val="es-ES"/>
+              </w:rPr>
+              <w:t>0</w:t>
+            </w:r>
+          </w:p>
+        </w:tc>
+      </w:tr>
+      <w:tr>
+        <w:trPr>
+          <w:trHeight w:val="889"/>
+        </w:trPr>
+        <w:tc>
+          <w:tcPr>
+            <w:tcW w:w="2830" w:type="dxa"/>
+          </w:tcPr>
+          <w:p>
+            <w:pPr>
+              <w:rPr>
+                <w:lang w:val="es-ES"/>
+              </w:rPr>
+            </w:pPr>
+            <w:r>
+              <w:rPr>
+                <w:lang w:val="es-ES"/>
+              </w:rPr>
+              <w:t>PTV (CPT + 10%)</w:t>
+            </w:r>
+          </w:p>
+        </w:tc>
+        <w:tc>
+          <w:tcPr>
+            <w:tcW w:w="2410" w:type="dxa"/>
+          </w:tcPr>
+          <w:p>
+            <w:pPr>
+              <w:rPr>
+                <w:lang w:val="es-ES"/>
+              </w:rPr>
+            </w:pPr>
+            <w:r>
+              <w:rPr>
+                <w:lang w:val="es-ES"/>
+              </w:rPr>
+              <w:t>9766,7</w:t>
+            </w:r>
+          </w:p>
+        </w:tc>
+      </w:tr>
+      <w:tr>
+        <w:trPr>
+          <w:trHeight w:val="840"/>
+        </w:trPr>
+        <w:tc>
+          <w:tcPr>
+            <w:tcW w:w="2830" w:type="dxa"/>
+          </w:tcPr>
+          <w:p>
+            <w:pPr>
+              <w:rPr>
+                <w:lang w:val="es-ES"/>
+              </w:rPr>
+            </w:pPr>
+            <w:r>
+              <w:rPr>
+                <w:lang w:val="es-ES"/>
+              </w:rPr>
+              <w:t>Ganancia Neta</w:t>
+            </w:r>
+          </w:p>
+        </w:tc>
+        <w:tc>
+          <w:tcPr>
+            <w:tcW w:w="2410" w:type="dxa"/>
+          </w:tcPr>
+          <w:p>
+            <w:pPr>
+              <w:rPr>
+                <w:lang w:val="es-ES"/>
+              </w:rPr>
+            </w:pPr>
+            <w:r>
+              <w:rPr>
+                <w:lang w:val="es-ES"/>
+              </w:rPr>
+              <w:t>96,7</w:t>
+            </w:r>
+          </w:p>
+        </w:tc>
+      </w:tr>
+    </w:tbl>
+    <w:p>
+      <w:pPr>
+        <w:rPr>
+          <w:lang w:val="es-ES"/>
+        </w:rPr>
+      </w:pPr>
+    </w:p>
+    <w:p>
+      <w:pPr>
+        <w:rPr>
+          <w:lang w:val="es-ES"/>
+        </w:rPr>
+        <w:sectPr>
+          <w:type w:val="continuous"/>
+          <w:pgSz w:w="11906" w:h="16838"/>
+          <w:pgMar w:top="1417" w:right="1701" w:bottom="1417" w:left="1701" w:header="708" w:footer="708" w:gutter="0"/>
+          <w:cols w:space="708"/>
+          <w:docGrid w:linePitch="360"/>
+        </w:sectPr>
+      </w:pPr>
+    </w:p>
+    <w:p>
+      <w:pPr>
+        <w:rPr>
+          <w:b/>
+          <w:bCs/>
+          <w:highlight w:val="cyan"/>
+          <w:u w:val="single"/>
+          <w:lang w:val="es-ES"/>
+        </w:rPr>
+      </w:pPr>
+      <w:r>
+        <w:rPr>
+          <w:b/>
+          <w:bCs/>
+          <w:highlight w:val="cyan"/>
+          <w:u w:val="single"/>
+          <w:lang w:val="es-ES"/>
+        </w:rPr>
+        <w:t>Costo de Producción</w:t>
+      </w:r>
+    </w:p>
+    <w:p>
+      <w:pPr>
+        <w:rPr>
+          <w:highlight w:val="cyan"/>
+          <w:lang w:val="es-ES"/>
+        </w:rPr>
+      </w:pPr>
+      <w:r>
+        <w:rPr>
+          <w:highlight w:val="cyan"/>
+          <w:lang w:val="es-ES"/>
+        </w:rPr>
+        <w:t>$</w:t>
+      </w:r>
+      <w:r>
+        <w:rPr>
+          <w:highlight w:val="cyan"/>
           <w:lang w:val="es-ES"/>
         </w:rPr>
         <w:t>100 tinta agua</w:t>
       </w:r>
       <w:r>
         <w:rPr>
-          <w:lang w:val="es-ES"/>
-        </w:rPr>
-        <w:t xml:space="preserve"> (rinde 10litros = 10k libros)</w:t>
-      </w:r>
-    </w:p>
-    <w:p>
-      <w:pPr>
-        <w:rPr>
-          <w:lang w:val="es-ES"/>
-        </w:rPr>
-      </w:pPr>
-      <w:r>
-        <w:rPr>
-          <w:lang w:val="es-ES"/>
-        </w:rPr>
-        <w:t>500 libro reciclado</w:t>
-      </w:r>
-    </w:p>
-    <w:p>
-      <w:pPr>
-        <w:rPr>
-          <w:lang w:val="es-ES"/>
-        </w:rPr>
-      </w:pPr>
-      <w:r>
-        <w:rPr>
+          <w:highlight w:val="cyan"/>
+          <w:lang w:val="es-ES"/>
+        </w:rPr>
+        <w:t xml:space="preserve"> (10k libros)</w:t>
+      </w:r>
+    </w:p>
+    <w:p>
+      <w:pPr>
+        <w:rPr>
+          <w:highlight w:val="cyan"/>
+          <w:lang w:val="es-ES"/>
+        </w:rPr>
+      </w:pPr>
+      <w:r>
+        <w:rPr>
+          <w:highlight w:val="cyan"/>
+          <w:lang w:val="es-ES"/>
+        </w:rPr>
+        <w:t>$</w:t>
+      </w:r>
+      <w:r>
+        <w:rPr>
+          <w:highlight w:val="cyan"/>
+          <w:lang w:val="es-ES"/>
+        </w:rPr>
+        <w:t>50</w:t>
+      </w:r>
+      <w:r>
+        <w:rPr>
+          <w:highlight w:val="cyan"/>
+          <w:lang w:val="es-ES"/>
+        </w:rPr>
+        <w:t>0</w:t>
+      </w:r>
+      <w:r>
+        <w:rPr>
+          <w:highlight w:val="cyan"/>
+          <w:lang w:val="es-ES"/>
+        </w:rPr>
+        <w:t xml:space="preserve">0 </w:t>
+      </w:r>
+      <w:r>
+        <w:rPr>
+          <w:highlight w:val="cyan"/>
+          <w:lang w:val="es-ES"/>
+        </w:rPr>
+        <w:t>hojas recicladas</w:t>
+      </w:r>
+      <w:r>
+        <w:rPr>
+          <w:highlight w:val="cyan"/>
+          <w:lang w:val="es-ES"/>
+        </w:rPr>
+        <w:t xml:space="preserve"> + 5% por margen de error</w:t>
+      </w:r>
+    </w:p>
+    <w:p>
+      <w:pPr>
+        <w:rPr>
+          <w:highlight w:val="cyan"/>
+          <w:lang w:val="es-ES"/>
+        </w:rPr>
+      </w:pPr>
+      <w:r>
+        <w:rPr>
+          <w:highlight w:val="cyan"/>
+          <w:lang w:val="es-ES"/>
+        </w:rPr>
+        <w:t>$</w:t>
+      </w:r>
+      <w:r>
+        <w:rPr>
+          <w:highlight w:val="cyan"/>
           <w:lang w:val="es-ES"/>
         </w:rPr>
         <w:t>80 tapa contratapa</w:t>
@@ -585,50 +784,430 @@
     <w:p>
       <w:pPr>
         <w:rPr>
-          <w:lang w:val="es-ES"/>
-        </w:rPr>
-      </w:pPr>
-      <w:r>
-        <w:rPr>
-          <w:lang w:val="es-ES"/>
-        </w:rPr>
-        <w:t>680 c/libro</w:t>
-      </w:r>
-    </w:p>
-    <w:p>
-      <w:pPr>
-        <w:rPr>
-          <w:lang w:val="es-ES"/>
-        </w:rPr>
-      </w:pPr>
-      <w:r>
-        <w:rPr>
-          <w:lang w:val="es-ES"/>
-        </w:rPr>
-        <w:t>1000 $6800</w:t>
-      </w:r>
-    </w:p>
-    <w:p>
-      <w:pPr>
-        <w:rPr>
-          <w:lang w:val="es-ES"/>
-        </w:rPr>
-      </w:pPr>
-      <w:r>
-        <w:rPr>
-          <w:lang w:val="es-ES"/>
-        </w:rPr>
-        <w:t>10000 $68000</w:t>
-      </w:r>
-    </w:p>
-    <w:p>
-      <w:pPr>
-        <w:rPr>
-          <w:lang w:val="es-ES"/>
-        </w:rPr>
-      </w:pPr>
-      <w:r>
-        <w:rPr>
+          <w:highlight w:val="cyan"/>
+          <w:lang w:val="es-ES"/>
+        </w:rPr>
+      </w:pPr>
+      <w:r>
+        <w:rPr>
+          <w:highlight w:val="cyan"/>
+          <w:lang w:val="es-ES"/>
+        </w:rPr>
+        <w:t xml:space="preserve">$10 almacenamiento seguro </w:t>
+      </w:r>
+    </w:p>
+    <w:p>
+      <w:pPr>
+        <w:rPr>
+          <w:highlight w:val="cyan"/>
+          <w:lang w:val="es-ES"/>
+        </w:rPr>
+      </w:pPr>
+      <w:r>
+        <w:rPr>
+          <w:highlight w:val="cyan"/>
+          <w:lang w:val="es-ES"/>
+        </w:rPr>
+        <w:t>$2500 mantenimiento impresora</w:t>
+      </w:r>
+    </w:p>
+    <w:p>
+      <w:pPr>
+        <w:rPr>
+          <w:highlight w:val="cyan"/>
+          <w:lang w:val="es-ES"/>
+        </w:rPr>
+      </w:pPr>
+      <w:r>
+        <w:rPr>
+          <w:highlight w:val="cyan"/>
+          <w:lang w:val="es-ES"/>
+        </w:rPr>
+        <w:t>$10 software diseño</w:t>
+      </w:r>
+    </w:p>
+    <w:p>
+      <w:pPr>
+        <w:rPr>
+          <w:highlight w:val="cyan"/>
+          <w:lang w:val="es-ES"/>
+        </w:rPr>
+      </w:pPr>
+      <w:r>
+        <w:rPr>
+          <w:highlight w:val="cyan"/>
+          <w:lang w:val="es-ES"/>
+        </w:rPr>
+        <w:t>$1500 mantenimiento encuadre</w:t>
+      </w:r>
+    </w:p>
+    <w:p>
+      <w:pPr>
+        <w:rPr>
+          <w:highlight w:val="cyan"/>
+          <w:lang w:val="es-ES"/>
+        </w:rPr>
+      </w:pPr>
+      <w:r>
+        <w:rPr>
+          <w:highlight w:val="cyan"/>
+          <w:lang w:val="es-ES"/>
+        </w:rPr>
+        <w:t>$100 herramientas extras</w:t>
+      </w:r>
+    </w:p>
+    <w:p>
+      <w:pPr>
+        <w:rPr>
+          <w:highlight w:val="cyan"/>
+          <w:lang w:val="es-ES"/>
+        </w:rPr>
+      </w:pPr>
+      <w:r>
+        <w:rPr>
+          <w:highlight w:val="cyan"/>
+          <w:lang w:val="es-ES"/>
+        </w:rPr>
+        <w:t>$</w:t>
+      </w:r>
+      <w:r>
+        <w:rPr>
+          <w:highlight w:val="cyan"/>
+          <w:lang w:val="es-ES"/>
+        </w:rPr>
+        <w:t>9</w:t>
+      </w:r>
+      <w:r>
+        <w:rPr>
+          <w:highlight w:val="cyan"/>
+          <w:lang w:val="es-ES"/>
+        </w:rPr>
+        <w:t>,</w:t>
+      </w:r>
+      <w:r>
+        <w:rPr>
+          <w:highlight w:val="cyan"/>
+          <w:lang w:val="es-ES"/>
+        </w:rPr>
+        <w:t>5</w:t>
+      </w:r>
+      <w:r>
+        <w:rPr>
+          <w:highlight w:val="cyan"/>
+          <w:lang w:val="es-ES"/>
+        </w:rPr>
+        <w:t>5</w:t>
+      </w:r>
+      <w:r>
+        <w:rPr>
+          <w:highlight w:val="cyan"/>
+          <w:lang w:val="es-ES"/>
+        </w:rPr>
+        <w:t xml:space="preserve"> c/libro</w:t>
+      </w:r>
+    </w:p>
+    <w:p>
+      <w:pPr>
+        <w:rPr>
+          <w:highlight w:val="cyan"/>
+          <w:lang w:val="es-ES"/>
+        </w:rPr>
+      </w:pPr>
+      <w:r>
+        <w:rPr>
+          <w:highlight w:val="cyan"/>
+          <w:lang w:val="es-ES"/>
+        </w:rPr>
+        <w:t>10</w:t>
+      </w:r>
+      <w:r>
+        <w:rPr>
+          <w:highlight w:val="cyan"/>
+          <w:lang w:val="es-ES"/>
+        </w:rPr>
+        <w:t>u</w:t>
+      </w:r>
+      <w:r>
+        <w:rPr>
+          <w:highlight w:val="cyan"/>
+          <w:lang w:val="es-ES"/>
+        </w:rPr>
+        <w:t xml:space="preserve"> $</w:t>
+      </w:r>
+      <w:r>
+        <w:rPr>
+          <w:highlight w:val="cyan"/>
+          <w:lang w:val="es-ES"/>
+        </w:rPr>
+        <w:t>9</w:t>
+      </w:r>
+      <w:r>
+        <w:rPr>
+          <w:highlight w:val="cyan"/>
+          <w:lang w:val="es-ES"/>
+        </w:rPr>
+        <w:t>5</w:t>
+      </w:r>
+      <w:r>
+        <w:rPr>
+          <w:highlight w:val="cyan"/>
+          <w:lang w:val="es-ES"/>
+        </w:rPr>
+        <w:t>,</w:t>
+      </w:r>
+      <w:r>
+        <w:rPr>
+          <w:highlight w:val="cyan"/>
+          <w:lang w:val="es-ES"/>
+        </w:rPr>
+        <w:t>5</w:t>
+      </w:r>
+    </w:p>
+    <w:p>
+      <w:pPr>
+        <w:rPr>
+          <w:highlight w:val="cyan"/>
+          <w:lang w:val="es-ES"/>
+        </w:rPr>
+      </w:pPr>
+      <w:r>
+        <w:rPr>
+          <w:highlight w:val="cyan"/>
+          <w:lang w:val="es-ES"/>
+        </w:rPr>
+        <w:t>100</w:t>
+      </w:r>
+      <w:r>
+        <w:rPr>
+          <w:highlight w:val="cyan"/>
+          <w:lang w:val="es-ES"/>
+        </w:rPr>
+        <w:t>u</w:t>
+      </w:r>
+      <w:r>
+        <w:rPr>
+          <w:highlight w:val="cyan"/>
+          <w:lang w:val="es-ES"/>
+        </w:rPr>
+        <w:t xml:space="preserve"> $</w:t>
+      </w:r>
+      <w:r>
+        <w:rPr>
+          <w:highlight w:val="cyan"/>
+          <w:lang w:val="es-ES"/>
+        </w:rPr>
+        <w:t>9</w:t>
+      </w:r>
+      <w:r>
+        <w:rPr>
+          <w:highlight w:val="cyan"/>
+          <w:lang w:val="es-ES"/>
+        </w:rPr>
+        <w:t>5</w:t>
+      </w:r>
+      <w:r>
+        <w:rPr>
+          <w:highlight w:val="cyan"/>
+          <w:lang w:val="es-ES"/>
+        </w:rPr>
+        <w:t>5</w:t>
+      </w:r>
+    </w:p>
+    <w:p>
+      <w:pPr>
+        <w:rPr>
+          <w:highlight w:val="cyan"/>
+          <w:lang w:val="es-ES"/>
+        </w:rPr>
+      </w:pPr>
+      <w:r>
+        <w:rPr>
+          <w:highlight w:val="cyan"/>
+          <w:lang w:val="es-ES"/>
+        </w:rPr>
+        <w:t>1000</w:t>
+      </w:r>
+      <w:r>
+        <w:rPr>
+          <w:highlight w:val="cyan"/>
+          <w:lang w:val="es-ES"/>
+        </w:rPr>
+        <w:t>u</w:t>
+      </w:r>
+      <w:r>
+        <w:rPr>
+          <w:highlight w:val="cyan"/>
+          <w:lang w:val="es-ES"/>
+        </w:rPr>
+        <w:t xml:space="preserve"> </w:t>
+      </w:r>
+      <w:r>
+        <w:rPr>
+          <w:highlight w:val="cyan"/>
+          <w:lang w:val="es-ES"/>
+        </w:rPr>
+        <w:t>$</w:t>
+      </w:r>
+      <w:r>
+        <w:rPr>
+          <w:highlight w:val="cyan"/>
+          <w:lang w:val="es-ES"/>
+        </w:rPr>
+        <w:t>9</w:t>
+      </w:r>
+      <w:r>
+        <w:rPr>
+          <w:highlight w:val="cyan"/>
+          <w:lang w:val="es-ES"/>
+        </w:rPr>
+        <w:t>5</w:t>
+      </w:r>
+      <w:r>
+        <w:rPr>
+          <w:highlight w:val="cyan"/>
+          <w:lang w:val="es-ES"/>
+        </w:rPr>
+        <w:t>5</w:t>
+      </w:r>
+      <w:r>
+        <w:rPr>
+          <w:highlight w:val="cyan"/>
+          <w:lang w:val="es-ES"/>
+        </w:rPr>
+        <w:t>0</w:t>
+      </w:r>
+      <w:r>
+        <w:rPr>
+          <w:lang w:val="es-ES"/>
+        </w:rPr>
+        <w:t xml:space="preserve"> (un Lote)</w:t>
+      </w:r>
+    </w:p>
+    <w:p>
+      <w:pPr>
+        <w:rPr>
+          <w:lang w:val="es-ES"/>
+        </w:rPr>
+      </w:pPr>
+      <w:r>
+        <w:rPr>
+          <w:highlight w:val="cyan"/>
+          <w:lang w:val="es-ES"/>
+        </w:rPr>
+        <w:t>10000</w:t>
+      </w:r>
+      <w:r>
+        <w:rPr>
+          <w:highlight w:val="cyan"/>
+          <w:lang w:val="es-ES"/>
+        </w:rPr>
+        <w:t>u</w:t>
+      </w:r>
+      <w:r>
+        <w:rPr>
+          <w:highlight w:val="cyan"/>
+          <w:lang w:val="es-ES"/>
+        </w:rPr>
+        <w:t xml:space="preserve"> </w:t>
+      </w:r>
+      <w:r>
+        <w:rPr>
+          <w:highlight w:val="cyan"/>
+          <w:lang w:val="es-ES"/>
+        </w:rPr>
+        <w:t>$</w:t>
+      </w:r>
+      <w:r>
+        <w:rPr>
+          <w:highlight w:val="cyan"/>
+          <w:lang w:val="es-ES"/>
+        </w:rPr>
+        <w:t>9</w:t>
+      </w:r>
+      <w:r>
+        <w:rPr>
+          <w:highlight w:val="cyan"/>
+          <w:lang w:val="es-ES"/>
+        </w:rPr>
+        <w:t>5</w:t>
+      </w:r>
+      <w:r>
+        <w:rPr>
+          <w:highlight w:val="cyan"/>
+          <w:lang w:val="es-ES"/>
+        </w:rPr>
+        <w:t>5</w:t>
+      </w:r>
+      <w:r>
+        <w:rPr>
+          <w:highlight w:val="cyan"/>
+          <w:lang w:val="es-ES"/>
+        </w:rPr>
+        <w:t>00</w:t>
+      </w:r>
+      <w:r>
+        <w:rPr>
+          <w:lang w:val="es-ES"/>
+        </w:rPr>
+        <w:t xml:space="preserve"> </w:t>
+      </w:r>
+    </w:p>
+    <w:p>
+      <w:pPr>
+        <w:rPr>
+          <w:b/>
+          <w:bCs/>
+          <w:u w:val="single"/>
+          <w:lang w:val="es-ES"/>
+        </w:rPr>
+      </w:pPr>
+      <w:r>
+        <w:rPr>
+          <w:b/>
+          <w:bCs/>
+          <w:highlight w:val="cyan"/>
+          <w:u w:val="single"/>
+          <w:lang w:val="es-ES"/>
+        </w:rPr>
+        <w:t>Costo Producción</w:t>
+      </w:r>
+      <w:r>
+        <w:rPr>
+          <w:b/>
+          <w:bCs/>
+          <w:u w:val="single"/>
+          <w:lang w:val="es-ES"/>
+        </w:rPr>
+        <w:t xml:space="preserve"> + </w:t>
+      </w:r>
+      <w:r>
+        <w:rPr>
+          <w:b/>
+          <w:bCs/>
+          <w:highlight w:val="magenta"/>
+          <w:u w:val="single"/>
+          <w:lang w:val="es-ES"/>
+        </w:rPr>
+        <w:t>Gastos Operativos</w:t>
+      </w:r>
+    </w:p>
+    <w:p>
+      <w:pPr>
+        <w:rPr>
+          <w:highlight w:val="magenta"/>
+          <w:lang w:val="es-ES"/>
+        </w:rPr>
+      </w:pPr>
+      <w:r>
+        <w:rPr>
+          <w:highlight w:val="magenta"/>
+          <w:lang w:val="es-ES"/>
+        </w:rPr>
+        <w:t>$</w:t>
+      </w:r>
+      <w:r>
+        <w:rPr>
+          <w:highlight w:val="magenta"/>
           <w:lang w:val="es-ES"/>
         </w:rPr>
         <w:t>60 alquiler</w:t>
@@ -637,11 +1216,20 @@
     <w:p>
       <w:pPr>
         <w:rPr>
-          <w:lang w:val="es-ES"/>
-        </w:rPr>
-      </w:pPr>
-      <w:r>
-        <w:rPr>
+          <w:highlight w:val="magenta"/>
+          <w:lang w:val="es-ES"/>
+        </w:rPr>
+      </w:pPr>
+      <w:r>
+        <w:rPr>
+          <w:highlight w:val="magenta"/>
+          <w:lang w:val="es-ES"/>
+        </w:rPr>
+        <w:t>$</w:t>
+      </w:r>
+      <w:r>
+        <w:rPr>
+          <w:highlight w:val="magenta"/>
           <w:lang w:val="es-ES"/>
         </w:rPr>
         <w:t>40 transporte</w:t>
@@ -650,11 +1238,20 @@
     <w:p>
       <w:pPr>
         <w:rPr>
-          <w:lang w:val="es-ES"/>
-        </w:rPr>
-      </w:pPr>
-      <w:r>
-        <w:rPr>
+          <w:highlight w:val="magenta"/>
+          <w:lang w:val="es-ES"/>
+        </w:rPr>
+      </w:pPr>
+      <w:r>
+        <w:rPr>
+          <w:highlight w:val="magenta"/>
+          <w:lang w:val="es-ES"/>
+        </w:rPr>
+        <w:t>$</w:t>
+      </w:r>
+      <w:r>
+        <w:rPr>
+          <w:highlight w:val="magenta"/>
           <w:lang w:val="es-ES"/>
         </w:rPr>
         <w:t>10 luz, wifi, agua</w:t>
@@ -663,11 +1260,20 @@
     <w:p>
       <w:pPr>
         <w:rPr>
-          <w:lang w:val="es-ES"/>
-        </w:rPr>
-      </w:pPr>
-      <w:r>
-        <w:rPr>
+          <w:highlight w:val="magenta"/>
+          <w:lang w:val="es-ES"/>
+        </w:rPr>
+      </w:pPr>
+      <w:r>
+        <w:rPr>
+          <w:highlight w:val="magenta"/>
+          <w:lang w:val="es-ES"/>
+        </w:rPr>
+        <w:t>$</w:t>
+      </w:r>
+      <w:r>
+        <w:rPr>
+          <w:highlight w:val="magenta"/>
           <w:lang w:val="es-ES"/>
         </w:rPr>
         <w:t>5 cuentas bancarias</w:t>
@@ -676,23 +1282,41 @@
     <w:p>
       <w:pPr>
         <w:rPr>
-          <w:lang w:val="es-ES"/>
-        </w:rPr>
-      </w:pPr>
-      <w:r>
-        <w:rPr>
+          <w:highlight w:val="magenta"/>
+          <w:lang w:val="es-ES"/>
+        </w:rPr>
+        <w:sectPr>
+          <w:type w:val="continuous"/>
+          <w:pgSz w:w="11906" w:h="16838"/>
+          <w:pgMar w:top="1417" w:right="1701" w:bottom="1417" w:left="1701" w:header="708" w:footer="708" w:gutter="0"/>
+          <w:cols w:num="2" w:space="708"/>
+          <w:docGrid w:linePitch="360"/>
+        </w:sectPr>
+      </w:pPr>
+      <w:r>
+        <w:rPr>
+          <w:highlight w:val="magenta"/>
+          <w:lang w:val="es-ES"/>
+        </w:rPr>
+        <w:t>$</w:t>
+      </w:r>
+      <w:r>
+        <w:rPr>
+          <w:highlight w:val="magenta"/>
           <w:lang w:val="es-ES"/>
         </w:rPr>
         <w:t>5 dominio p</w:t>
       </w:r>
       <w:r>
         <w:rPr>
+          <w:highlight w:val="magenta"/>
           <w:lang w:val="es-ES"/>
         </w:rPr>
         <w:t>á</w:t>
       </w:r>
       <w:r>
         <w:rPr>
+          <w:highlight w:val="magenta"/>
           <w:lang w:val="es-ES"/>
         </w:rPr>
         <w:t>gina web</w:t>
@@ -701,41 +1325,158 @@
     <w:p>
       <w:pPr>
         <w:rPr>
-          <w:lang w:val="es-ES"/>
-        </w:rPr>
-      </w:pPr>
-      <w:r>
-        <w:rPr>
-          <w:lang w:val="es-ES"/>
-        </w:rPr>
-        <w:t>10 almacenamiento seguro</w:t>
-      </w:r>
-    </w:p>
-    <w:p>
-      <w:pPr>
-        <w:rPr>
-          <w:lang w:val="es-ES"/>
-        </w:rPr>
-      </w:pPr>
-      <w:r>
-        <w:rPr>
-          <w:lang w:val="es-ES"/>
-        </w:rPr>
-        <w:t xml:space="preserve">Lotes de producción a la fabrica $68000 </w:t>
-      </w:r>
-    </w:p>
-    <w:p>
-      <w:pPr>
-        <w:rPr>
-          <w:lang w:val="es-ES"/>
-        </w:rPr>
-      </w:pPr>
-      <w:r>
-        <w:rPr>
-          <w:lang w:val="es-ES"/>
-        </w:rPr>
-        <w:t>CPT 68130</w:t>
-      </w:r>
+          <w:highlight w:val="yellow"/>
+          <w:lang w:val="es-ES"/>
+        </w:rPr>
+      </w:pPr>
+      <w:r>
+        <w:rPr>
+          <w:highlight w:val="yellow"/>
+          <w:lang w:val="es-ES"/>
+        </w:rPr>
+        <w:t>Precio de Venta Total</w:t>
+      </w:r>
+    </w:p>
+    <w:p>
+      <w:pPr>
+        <w:rPr>
+          <w:highlight w:val="yellow"/>
+          <w:lang w:val="es-ES"/>
+        </w:rPr>
+      </w:pPr>
+      <w:r>
+        <w:rPr>
+          <w:highlight w:val="yellow"/>
+          <w:lang w:val="es-ES"/>
+        </w:rPr>
+        <w:t>$9,</w:t>
+      </w:r>
+      <w:r>
+        <w:rPr>
+          <w:highlight w:val="yellow"/>
+          <w:lang w:val="es-ES"/>
+        </w:rPr>
+        <w:t>7667</w:t>
+      </w:r>
+      <w:r>
+        <w:rPr>
+          <w:highlight w:val="yellow"/>
+          <w:lang w:val="es-ES"/>
+        </w:rPr>
+        <w:t xml:space="preserve"> c/libro</w:t>
+      </w:r>
+    </w:p>
+    <w:p>
+      <w:pPr>
+        <w:rPr>
+          <w:highlight w:val="yellow"/>
+          <w:lang w:val="es-ES"/>
+        </w:rPr>
+      </w:pPr>
+      <w:r>
+        <w:rPr>
+          <w:highlight w:val="yellow"/>
+          <w:lang w:val="es-ES"/>
+        </w:rPr>
+        <w:t>10u $9</w:t>
+      </w:r>
+      <w:r>
+        <w:rPr>
+          <w:highlight w:val="yellow"/>
+          <w:lang w:val="es-ES"/>
+        </w:rPr>
+        <w:t>7,667</w:t>
+      </w:r>
+    </w:p>
+    <w:p>
+      <w:pPr>
+        <w:rPr>
+          <w:highlight w:val="yellow"/>
+          <w:lang w:val="es-ES"/>
+        </w:rPr>
+      </w:pPr>
+      <w:r>
+        <w:rPr>
+          <w:highlight w:val="yellow"/>
+          <w:lang w:val="es-ES"/>
+        </w:rPr>
+        <w:t>100u $9</w:t>
+      </w:r>
+      <w:r>
+        <w:rPr>
+          <w:highlight w:val="yellow"/>
+          <w:lang w:val="es-ES"/>
+        </w:rPr>
+        <w:t>76,67</w:t>
+      </w:r>
+    </w:p>
+    <w:p>
+      <w:pPr>
+        <w:rPr>
+          <w:lang w:val="es-ES"/>
+        </w:rPr>
+        <w:sectPr>
+          <w:type w:val="continuous"/>
+          <w:pgSz w:w="11906" w:h="16838"/>
+          <w:pgMar w:top="1417" w:right="1701" w:bottom="1417" w:left="1701" w:header="708" w:footer="708" w:gutter="0"/>
+          <w:cols w:num="2" w:space="708"/>
+          <w:docGrid w:linePitch="360"/>
+        </w:sectPr>
+      </w:pPr>
+      <w:r>
+        <w:rPr>
+          <w:highlight w:val="yellow"/>
+          <w:lang w:val="es-ES"/>
+        </w:rPr>
+        <w:t>1000u $</w:t>
+      </w:r>
+      <w:r>
+        <w:rPr>
+          <w:highlight w:val="yellow"/>
+          <w:lang w:val="es-ES"/>
+        </w:rPr>
+        <w:t>9</w:t>
+      </w:r>
+      <w:r>
+        <w:rPr>
+          <w:highlight w:val="yellow"/>
+          <w:lang w:val="es-ES"/>
+        </w:rPr>
+        <w:t>766,7</w:t>
+      </w:r>
+      <w:r>
+        <w:rPr>
+          <w:lang w:val="es-ES"/>
+        </w:rPr>
+        <w:t xml:space="preserve"> (</w:t>
+      </w:r>
+      <w:r>
+        <w:rPr>
+          <w:lang w:val="es-ES"/>
+        </w:rPr>
+        <w:t>un Lote)</w:t>
+      </w:r>
+    </w:p>
+    <w:p>
+      <w:pPr>
+        <w:rPr>
+          <w:lang w:val="es-ES"/>
+        </w:rPr>
+        <w:sectPr>
+          <w:type w:val="continuous"/>
+          <w:pgSz w:w="11906" w:h="16838"/>
+          <w:pgMar w:top="1417" w:right="1701" w:bottom="1417" w:left="1701" w:header="708" w:footer="708" w:gutter="0"/>
+          <w:cols w:space="708"/>
+          <w:docGrid w:linePitch="360"/>
+        </w:sectPr>
+      </w:pPr>
+    </w:p>
+    <w:p>
+      <w:pPr>
+        <w:rPr>
+          <w:lang w:val="es-ES"/>
+        </w:rPr>
+      </w:pPr>
     </w:p>
     <w:p>
       <w:pPr>
@@ -749,42 +1490,330 @@
         </w:rPr>
         <w:t>Maquina impresora $50.000 (patrimonio)</w:t>
       </w:r>
-    </w:p>
-    <w:p>
-      <w:pPr>
-        <w:rPr>
-          <w:lang w:val="es-ES"/>
-        </w:rPr>
-      </w:pPr>
-      <w:r>
-        <w:rPr>
-          <w:lang w:val="es-ES"/>
-        </w:rPr>
-        <w:t>68</w:t>
-      </w:r>
-      <w:r>
-        <w:rPr>
-          <w:lang w:val="es-ES"/>
-        </w:rPr>
-        <w:t>130</w:t>
-      </w:r>
-      <w:r>
-        <w:rPr>
-          <w:lang w:val="es-ES"/>
-        </w:rPr>
-        <w:t>k + 10% = 74</w:t>
-      </w:r>
-      <w:r>
-        <w:rPr>
-          <w:lang w:val="es-ES"/>
-        </w:rPr>
-        <w:t>,943</w:t>
-      </w:r>
-      <w:r>
-        <w:rPr>
-          <w:lang w:val="es-ES"/>
-        </w:rPr>
-        <w:t xml:space="preserve"> (6800)</w:t>
+      <w:r>
+        <w:rPr>
+          <w:lang w:val="es-ES"/>
+        </w:rPr>
+        <w:t xml:space="preserve"> + 5% de mantenimiento</w:t>
+      </w:r>
+    </w:p>
+    <w:tbl>
+      <w:tblPr>
+        <w:tblpPr w:leftFromText="141" w:rightFromText="141" w:vertAnchor="page" w:horzAnchor="margin" w:tblpXSpec="center" w:tblpY="4923"/>
+        <w:tblW w:w="0" w:type="auto"/>
+        <w:tblBorders>
+          <w:top w:val="single" w:sz="4" w:space="0" w:color="auto"/>
+          <w:left w:val="single" w:sz="4" w:space="0" w:color="auto"/>
+          <w:bottom w:val="single" w:sz="4" w:space="0" w:color="auto"/>
+          <w:right w:val="single" w:sz="4" w:space="0" w:color="auto"/>
+          <w:insideH w:val="single" w:sz="4" w:space="0" w:color="auto"/>
+          <w:insideV w:val="single" w:sz="4" w:space="0" w:color="auto"/>
+        </w:tblBorders>
+        <w:tblCellMar>
+          <w:left w:w="70" w:type="dxa"/>
+          <w:right w:w="70" w:type="dxa"/>
+        </w:tblCellMar>
+        <w:tblLook w:val="0000" w:firstRow="0" w:lastRow="0" w:firstColumn="0" w:lastColumn="0" w:noHBand="0" w:noVBand="0"/>
+      </w:tblPr>
+      <w:tblGrid>
+        <w:gridCol w:w="6806"/>
+        <w:gridCol w:w="9"/>
+      </w:tblGrid>
+      <w:tr>
+        <w:tblPrEx>
+          <w:tblCellMar>
+            <w:top w:w="0" w:type="dxa"/>
+            <w:bottom w:w="0" w:type="dxa"/>
+          </w:tblCellMar>
+        </w:tblPrEx>
+        <w:trPr>
+          <w:trHeight w:val="400"/>
+        </w:trPr>
+        <w:tc>
+          <w:tcPr>
+            <w:tcW w:w="6815" w:type="dxa"/>
+            <w:gridSpan w:val="2"/>
+            <w:vAlign w:val="center"/>
+          </w:tcPr>
+          <w:p>
+            <w:pPr>
+              <w:spacing w:after="0"/>
+              <w:ind w:left="60"/>
+              <w:jc w:val="center"/>
+              <w:rPr>
+                <w:lang w:val="es-ES"/>
+              </w:rPr>
+            </w:pPr>
+            <w:r>
+              <w:rPr>
+                <w:sz w:val="28"/>
+                <w:szCs w:val="28"/>
+                <w:lang w:val="es-ES"/>
+              </w:rPr>
+              <w:t>Patrimonio</w:t>
+            </w:r>
+          </w:p>
+        </w:tc>
+      </w:tr>
+      <w:tr>
+        <w:tblPrEx>
+          <w:tblCellMar>
+            <w:top w:w="0" w:type="dxa"/>
+            <w:bottom w:w="0" w:type="dxa"/>
+          </w:tblCellMar>
+        </w:tblPrEx>
+        <w:trPr>
+          <w:gridAfter w:val="1"/>
+          <w:wAfter w:w="9" w:type="dxa"/>
+          <w:trHeight w:val="971"/>
+        </w:trPr>
+        <w:tc>
+          <w:tcPr>
+            <w:tcW w:w="6806" w:type="dxa"/>
+            <w:vAlign w:val="center"/>
+          </w:tcPr>
+          <w:p>
+            <w:pPr>
+              <w:ind w:left="60"/>
+              <w:jc w:val="center"/>
+              <w:rPr>
+                <w:sz w:val="24"/>
+                <w:szCs w:val="24"/>
+                <w:lang w:val="es-ES"/>
+              </w:rPr>
+            </w:pPr>
+            <w:r>
+              <w:rPr>
+                <w:sz w:val="24"/>
+                <w:szCs w:val="24"/>
+                <w:lang w:val="es-ES"/>
+              </w:rPr>
+              <w:t>Activo</w:t>
+            </w:r>
+            <w:r>
+              <w:rPr>
+                <w:lang w:val="es-ES"/>
+              </w:rPr>
+              <w:t>: 50000 + 30000 + 1000 + 5</w:t>
+            </w:r>
+            <w:r>
+              <w:rPr>
+                <w:lang w:val="es-ES"/>
+              </w:rPr>
+              <w:t>25</w:t>
+            </w:r>
+            <w:r>
+              <w:rPr>
+                <w:lang w:val="es-ES"/>
+              </w:rPr>
+              <w:t>0 + 100 + 100</w:t>
+            </w:r>
+          </w:p>
+        </w:tc>
+      </w:tr>
+      <w:tr>
+        <w:tblPrEx>
+          <w:tblCellMar>
+            <w:top w:w="0" w:type="dxa"/>
+            <w:bottom w:w="0" w:type="dxa"/>
+          </w:tblCellMar>
+        </w:tblPrEx>
+        <w:trPr>
+          <w:gridAfter w:val="1"/>
+          <w:wAfter w:w="9" w:type="dxa"/>
+          <w:trHeight w:val="687"/>
+        </w:trPr>
+        <w:tc>
+          <w:tcPr>
+            <w:tcW w:w="6806" w:type="dxa"/>
+            <w:vAlign w:val="center"/>
+          </w:tcPr>
+          <w:p>
+            <w:pPr>
+              <w:ind w:left="60"/>
+              <w:jc w:val="center"/>
+              <w:rPr>
+                <w:sz w:val="24"/>
+                <w:szCs w:val="24"/>
+                <w:lang w:val="es-ES"/>
+              </w:rPr>
+            </w:pPr>
+            <w:r>
+              <w:rPr>
+                <w:sz w:val="24"/>
+                <w:szCs w:val="24"/>
+                <w:lang w:val="es-ES"/>
+              </w:rPr>
+              <w:t>Pasivo</w:t>
+            </w:r>
+            <w:r>
+              <w:rPr>
+                <w:lang w:val="es-ES"/>
+              </w:rPr>
+              <w:t xml:space="preserve">: </w:t>
+            </w:r>
+            <w:r>
+              <w:rPr>
+                <w:lang w:val="es-ES"/>
+              </w:rPr>
+              <w:t>0</w:t>
+            </w:r>
+          </w:p>
+        </w:tc>
+      </w:tr>
+      <w:tr>
+        <w:tblPrEx>
+          <w:tblCellMar>
+            <w:top w:w="0" w:type="dxa"/>
+            <w:bottom w:w="0" w:type="dxa"/>
+          </w:tblCellMar>
+        </w:tblPrEx>
+        <w:trPr>
+          <w:gridAfter w:val="1"/>
+          <w:wAfter w:w="9" w:type="dxa"/>
+          <w:trHeight w:val="687"/>
+        </w:trPr>
+        <w:tc>
+          <w:tcPr>
+            <w:tcW w:w="6806" w:type="dxa"/>
+            <w:vAlign w:val="center"/>
+          </w:tcPr>
+          <w:p>
+            <w:pPr>
+              <w:ind w:left="60"/>
+              <w:jc w:val="center"/>
+              <w:rPr>
+                <w:sz w:val="24"/>
+                <w:szCs w:val="24"/>
+                <w:lang w:val="es-ES"/>
+              </w:rPr>
+            </w:pPr>
+            <w:r>
+              <w:rPr>
+                <w:sz w:val="24"/>
+                <w:szCs w:val="24"/>
+                <w:lang w:val="es-ES"/>
+              </w:rPr>
+              <w:t xml:space="preserve">Neto: </w:t>
+            </w:r>
+            <w:r>
+              <w:rPr>
+                <w:sz w:val="24"/>
+                <w:szCs w:val="24"/>
+                <w:lang w:val="es-ES"/>
+              </w:rPr>
+              <w:t>86450</w:t>
+            </w:r>
+          </w:p>
+        </w:tc>
+      </w:tr>
+    </w:tbl>
+    <w:p>
+      <w:pPr>
+        <w:rPr>
+          <w:lang w:val="es-ES"/>
+        </w:rPr>
+      </w:pPr>
+      <w:r>
+        <w:rPr>
+          <w:lang w:val="es-ES"/>
+        </w:rPr>
+        <w:t>$</w:t>
+      </w:r>
+      <w:r>
+        <w:rPr>
+          <w:lang w:val="es-ES"/>
+        </w:rPr>
+        <w:t>100</w:t>
+      </w:r>
+      <w:r>
+        <w:rPr>
+          <w:lang w:val="es-ES"/>
+        </w:rPr>
+        <w:t xml:space="preserve">0 </w:t>
+      </w:r>
+      <w:r>
+        <w:rPr>
+          <w:lang w:val="es-ES"/>
+        </w:rPr>
+        <w:t>computadora</w:t>
+      </w:r>
+    </w:p>
+    <w:p>
+      <w:pPr>
+        <w:rPr>
+          <w:lang w:val="es-ES"/>
+        </w:rPr>
+      </w:pPr>
+      <w:r>
+        <w:rPr>
+          <w:lang w:val="es-ES"/>
+        </w:rPr>
+        <w:t xml:space="preserve">Maquina encuadernación </w:t>
+      </w:r>
+      <w:r>
+        <w:rPr>
+          <w:lang w:val="es-ES"/>
+        </w:rPr>
+        <w:t>$</w:t>
+      </w:r>
+      <w:r>
+        <w:rPr>
+          <w:lang w:val="es-ES"/>
+        </w:rPr>
+        <w:t>30000</w:t>
+      </w:r>
+    </w:p>
+    <w:p>
+      <w:pPr>
+        <w:rPr>
+          <w:lang w:val="es-ES"/>
+        </w:rPr>
+      </w:pPr>
+      <w:r>
+        <w:rPr>
+          <w:lang w:val="es-ES"/>
+        </w:rPr>
+        <w:t xml:space="preserve">Sistema con orden </w:t>
+      </w:r>
+      <w:r>
+        <w:rPr>
+          <w:lang w:val="es-ES"/>
+        </w:rPr>
+        <w:t>de</w:t>
+      </w:r>
+      <w:r>
+        <w:rPr>
+          <w:lang w:val="es-ES"/>
+        </w:rPr>
+        <w:t xml:space="preserve"> prioridad al a hora de reserva, evitar conflictos para asignación y confirmación de libros adquiridos a auspiciantes.</w:t>
+      </w:r>
+    </w:p>
+    <w:p>
+      <w:pPr>
+        <w:rPr>
+          <w:lang w:val="es-ES"/>
+        </w:rPr>
+        <w:sectPr>
+          <w:type w:val="continuous"/>
+          <w:pgSz w:w="11906" w:h="16838"/>
+          <w:pgMar w:top="1417" w:right="1701" w:bottom="1417" w:left="1701" w:header="708" w:footer="708" w:gutter="0"/>
+          <w:cols w:space="708"/>
+          <w:docGrid w:linePitch="360"/>
+        </w:sectPr>
+      </w:pPr>
+    </w:p>
+    <w:p>
+      <w:pPr>
+        <w:rPr>
+          <w:lang w:val="es-ES"/>
+        </w:rPr>
+      </w:pPr>
+      <w:r>
+        <w:rPr>
+          <w:lang w:val="es-ES"/>
+        </w:rPr>
+        <w:t>Prioridad alta según la especificación, plan de reserva por tiempo y en caso de que no se valide, se vuelve al estado de disponible.</w:t>
       </w:r>
     </w:p>
     <w:p>
@@ -828,7 +1857,7 @@
         <v:path o:extrusionok="f" gradientshapeok="t" o:connecttype="rect"/>
         <o:lock v:ext="edit" aspectratio="t"/>
       </v:shapetype>
-      <v:shape id="_x0000_i1059" type="#_x0000_t75" style="width:11.25pt;height:11.25pt" o:bullet="t">
+      <v:shape id="_x0000_i1141" type="#_x0000_t75" style="width:11.2pt;height:11.2pt" o:bullet="t">
         <v:imagedata r:id="rId1" o:title="mso4FA2"/>
       </v:shape>
     </w:pict>
@@ -1390,6 +2419,25 @@
       <w:contextualSpacing/>
     </w:pPr>
   </w:style>
+  <w:style w:type="table" w:styleId="Tablaconcuadrcula">
+    <w:name w:val="Table Grid"/>
+    <w:basedOn w:val="Tablanormal"/>
+    <w:uiPriority w:val="39"/>
+    <w:rsid w:val="00862CDE"/>
+    <w:pPr>
+      <w:spacing w:after="0" w:line="240" w:lineRule="auto"/>
+    </w:pPr>
+    <w:tblPr>
+      <w:tblBorders>
+        <w:top w:val="single" w:sz="4" w:space="0" w:color="auto"/>
+        <w:left w:val="single" w:sz="4" w:space="0" w:color="auto"/>
+        <w:bottom w:val="single" w:sz="4" w:space="0" w:color="auto"/>
+        <w:right w:val="single" w:sz="4" w:space="0" w:color="auto"/>
+        <w:insideH w:val="single" w:sz="4" w:space="0" w:color="auto"/>
+        <w:insideV w:val="single" w:sz="4" w:space="0" w:color="auto"/>
+      </w:tblBorders>
+    </w:tblPr>
+  </w:style>
 </w:styles>
 </file>
 

</xml_diff>

<commit_message>
Entregamos el trabajo Simongit add .!
</commit_message>
<xml_diff>
--- a/Marketing.docx
+++ b/Marketing.docx
@@ -7,13 +7,14 @@
         <w:spacing w:line="276" w:lineRule="auto"/>
         <w:jc w:val="both"/>
         <w:rPr>
-          <w:rFonts w:ascii="Times New Roman" w:hAnsi="Times New Roman" w:cs="Times New Roman"/>
-          <w:lang w:val="es-ES"/>
-        </w:rPr>
-      </w:pPr>
-      <w:r>
-        <w:rPr>
-          <w:rFonts w:ascii="Times New Roman" w:hAnsi="Times New Roman" w:cs="Times New Roman"/>
+          <w:rFonts w:ascii="Arial" w:hAnsi="Arial" w:cs="Arial"/>
+          <w:lang w:val="es-ES"/>
+        </w:rPr>
+      </w:pPr>
+      <w:bookmarkStart w:id="0" w:name="_Hlk241239725"/>
+      <w:r>
+        <w:rPr>
+          <w:rFonts w:ascii="Arial" w:hAnsi="Arial" w:cs="Arial"/>
           <w:highlight w:val="yellow"/>
           <w:lang w:val="es-ES"/>
         </w:rPr>
@@ -25,13 +26,13 @@
         <w:spacing w:line="276" w:lineRule="auto"/>
         <w:jc w:val="both"/>
         <w:rPr>
-          <w:rFonts w:ascii="Times New Roman" w:hAnsi="Times New Roman" w:cs="Times New Roman"/>
-          <w:lang w:val="es-ES"/>
-        </w:rPr>
-      </w:pPr>
-      <w:r>
-        <w:rPr>
-          <w:rFonts w:ascii="Times New Roman" w:hAnsi="Times New Roman" w:cs="Times New Roman"/>
+          <w:rFonts w:ascii="Arial" w:hAnsi="Arial" w:cs="Arial"/>
+          <w:lang w:val="es-ES"/>
+        </w:rPr>
+      </w:pPr>
+      <w:r>
+        <w:rPr>
+          <w:rFonts w:ascii="Arial" w:hAnsi="Arial" w:cs="Arial"/>
           <w:highlight w:val="yellow"/>
           <w:lang w:val="es-ES"/>
         </w:rPr>
@@ -43,13 +44,13 @@
         <w:spacing w:line="276" w:lineRule="auto"/>
         <w:jc w:val="both"/>
         <w:rPr>
-          <w:rFonts w:ascii="Times New Roman" w:hAnsi="Times New Roman" w:cs="Times New Roman"/>
-          <w:lang w:val="es-ES"/>
-        </w:rPr>
-      </w:pPr>
-      <w:r>
-        <w:rPr>
-          <w:rFonts w:ascii="Times New Roman" w:hAnsi="Times New Roman" w:cs="Times New Roman"/>
+          <w:rFonts w:ascii="Arial" w:hAnsi="Arial" w:cs="Arial"/>
+          <w:lang w:val="es-ES"/>
+        </w:rPr>
+      </w:pPr>
+      <w:r>
+        <w:rPr>
+          <w:rFonts w:ascii="Arial" w:hAnsi="Arial" w:cs="Arial"/>
           <w:highlight w:val="yellow"/>
           <w:lang w:val="es-ES"/>
         </w:rPr>
@@ -61,13 +62,13 @@
         <w:spacing w:line="276" w:lineRule="auto"/>
         <w:jc w:val="both"/>
         <w:rPr>
-          <w:rFonts w:ascii="Times New Roman" w:hAnsi="Times New Roman" w:cs="Times New Roman"/>
-          <w:lang w:val="es-ES"/>
-        </w:rPr>
-      </w:pPr>
-      <w:r>
-        <w:rPr>
-          <w:rFonts w:ascii="Times New Roman" w:hAnsi="Times New Roman" w:cs="Times New Roman"/>
+          <w:rFonts w:ascii="Arial" w:hAnsi="Arial" w:cs="Arial"/>
+          <w:lang w:val="es-ES"/>
+        </w:rPr>
+      </w:pPr>
+      <w:r>
+        <w:rPr>
+          <w:rFonts w:ascii="Arial" w:hAnsi="Arial" w:cs="Arial"/>
           <w:highlight w:val="yellow"/>
           <w:lang w:val="es-ES"/>
         </w:rPr>
@@ -75,7 +76,7 @@
       </w:r>
       <w:r>
         <w:rPr>
-          <w:rFonts w:ascii="Times New Roman" w:hAnsi="Times New Roman" w:cs="Times New Roman"/>
+          <w:rFonts w:ascii="Arial" w:hAnsi="Arial" w:cs="Arial"/>
           <w:lang w:val="es-ES"/>
         </w:rPr>
         <w:t xml:space="preserve"> </w:t>
@@ -86,13 +87,13 @@
         <w:spacing w:line="276" w:lineRule="auto"/>
         <w:jc w:val="both"/>
         <w:rPr>
-          <w:rFonts w:ascii="Times New Roman" w:hAnsi="Times New Roman" w:cs="Times New Roman"/>
-          <w:lang w:val="es-ES"/>
-        </w:rPr>
-      </w:pPr>
-      <w:r>
-        <w:rPr>
-          <w:rFonts w:ascii="Times New Roman" w:hAnsi="Times New Roman" w:cs="Times New Roman"/>
+          <w:rFonts w:ascii="Arial" w:hAnsi="Arial" w:cs="Arial"/>
+          <w:lang w:val="es-ES"/>
+        </w:rPr>
+      </w:pPr>
+      <w:r>
+        <w:rPr>
+          <w:rFonts w:ascii="Arial" w:hAnsi="Arial" w:cs="Arial"/>
           <w:lang w:val="es-ES"/>
         </w:rPr>
         <w:t>Detallar capital necesario</w:t>
@@ -103,13 +104,13 @@
         <w:spacing w:line="276" w:lineRule="auto"/>
         <w:jc w:val="both"/>
         <w:rPr>
-          <w:rFonts w:ascii="Times New Roman" w:hAnsi="Times New Roman" w:cs="Times New Roman"/>
-          <w:lang w:val="es-ES"/>
-        </w:rPr>
-      </w:pPr>
-      <w:r>
-        <w:rPr>
-          <w:rFonts w:ascii="Times New Roman" w:hAnsi="Times New Roman" w:cs="Times New Roman"/>
+          <w:rFonts w:ascii="Arial" w:hAnsi="Arial" w:cs="Arial"/>
+          <w:lang w:val="es-ES"/>
+        </w:rPr>
+      </w:pPr>
+      <w:r>
+        <w:rPr>
+          <w:rFonts w:ascii="Arial" w:hAnsi="Arial" w:cs="Arial"/>
           <w:highlight w:val="yellow"/>
           <w:lang w:val="es-ES"/>
         </w:rPr>
@@ -121,13 +122,13 @@
         <w:spacing w:line="276" w:lineRule="auto"/>
         <w:jc w:val="both"/>
         <w:rPr>
-          <w:rFonts w:ascii="Times New Roman" w:hAnsi="Times New Roman" w:cs="Times New Roman"/>
-          <w:lang w:val="es-ES"/>
-        </w:rPr>
-      </w:pPr>
-      <w:r>
-        <w:rPr>
-          <w:rFonts w:ascii="Times New Roman" w:hAnsi="Times New Roman" w:cs="Times New Roman"/>
+          <w:rFonts w:ascii="Arial" w:hAnsi="Arial" w:cs="Arial"/>
+          <w:lang w:val="es-ES"/>
+        </w:rPr>
+      </w:pPr>
+      <w:r>
+        <w:rPr>
+          <w:rFonts w:ascii="Arial" w:hAnsi="Arial" w:cs="Arial"/>
           <w:highlight w:val="yellow"/>
           <w:lang w:val="es-ES"/>
         </w:rPr>
@@ -139,13 +140,13 @@
         <w:spacing w:line="276" w:lineRule="auto"/>
         <w:jc w:val="both"/>
         <w:rPr>
-          <w:rFonts w:ascii="Times New Roman" w:hAnsi="Times New Roman" w:cs="Times New Roman"/>
-          <w:lang w:val="es-ES"/>
-        </w:rPr>
-      </w:pPr>
-      <w:r>
-        <w:rPr>
-          <w:rFonts w:ascii="Times New Roman" w:hAnsi="Times New Roman" w:cs="Times New Roman"/>
+          <w:rFonts w:ascii="Arial" w:hAnsi="Arial" w:cs="Arial"/>
+          <w:lang w:val="es-ES"/>
+        </w:rPr>
+      </w:pPr>
+      <w:r>
+        <w:rPr>
+          <w:rFonts w:ascii="Arial" w:hAnsi="Arial" w:cs="Arial"/>
           <w:lang w:val="es-ES"/>
         </w:rPr>
         <w:t>Elaborar un presupuesto</w:t>
@@ -156,19 +157,19 @@
         <w:spacing w:line="276" w:lineRule="auto"/>
         <w:jc w:val="both"/>
         <w:rPr>
-          <w:rFonts w:ascii="Times New Roman" w:hAnsi="Times New Roman" w:cs="Times New Roman"/>
-        </w:rPr>
-      </w:pPr>
-      <w:r>
-        <w:rPr>
-          <w:rFonts w:ascii="Times New Roman" w:hAnsi="Times New Roman" w:cs="Times New Roman"/>
+          <w:rFonts w:ascii="Arial" w:hAnsi="Arial" w:cs="Arial"/>
+        </w:rPr>
+      </w:pPr>
+      <w:r>
+        <w:rPr>
+          <w:rFonts w:ascii="Arial" w:hAnsi="Arial" w:cs="Arial"/>
           <w:lang w:val="es-ES"/>
         </w:rPr>
         <w:t xml:space="preserve">Enumera </w:t>
       </w:r>
       <w:r>
         <w:rPr>
-          <w:rFonts w:ascii="Times New Roman" w:hAnsi="Times New Roman" w:cs="Times New Roman"/>
+          <w:rFonts w:ascii="Arial" w:hAnsi="Arial" w:cs="Arial"/>
         </w:rPr>
         <w:t>los trámites correspondientes a aspectos legales, impositivos, de seguridad e higiene entre otros que debas investigar para su puesta en marcha</w:t>
       </w:r>
@@ -178,21 +179,21 @@
         <w:spacing w:line="276" w:lineRule="auto"/>
         <w:jc w:val="both"/>
         <w:rPr>
-          <w:rFonts w:ascii="Times New Roman" w:hAnsi="Times New Roman" w:cs="Times New Roman"/>
-        </w:rPr>
-      </w:pPr>
-    </w:p>
-    <w:p>
-      <w:pPr>
-        <w:spacing w:line="276" w:lineRule="auto"/>
-        <w:jc w:val="both"/>
-        <w:rPr>
-          <w:rFonts w:ascii="Times New Roman" w:hAnsi="Times New Roman" w:cs="Times New Roman"/>
-        </w:rPr>
-      </w:pPr>
-      <w:r>
-        <w:rPr>
-          <w:rFonts w:ascii="Times New Roman" w:hAnsi="Times New Roman" w:cs="Times New Roman"/>
+          <w:rFonts w:ascii="Arial" w:hAnsi="Arial" w:cs="Arial"/>
+        </w:rPr>
+      </w:pPr>
+    </w:p>
+    <w:p>
+      <w:pPr>
+        <w:spacing w:line="276" w:lineRule="auto"/>
+        <w:jc w:val="both"/>
+        <w:rPr>
+          <w:rFonts w:ascii="Arial" w:hAnsi="Arial" w:cs="Arial"/>
+        </w:rPr>
+      </w:pPr>
+      <w:r>
+        <w:rPr>
+          <w:rFonts w:ascii="Arial" w:hAnsi="Arial" w:cs="Arial"/>
           <w:highlight w:val="yellow"/>
         </w:rPr>
         <w:t>Marketing</w:t>
@@ -203,101 +204,175 @@
         <w:spacing w:line="276" w:lineRule="auto"/>
         <w:jc w:val="both"/>
         <w:rPr>
-          <w:rFonts w:ascii="Times New Roman" w:hAnsi="Times New Roman" w:cs="Times New Roman"/>
-        </w:rPr>
-      </w:pPr>
-      <w:r>
-        <w:rPr>
-          <w:rFonts w:ascii="Times New Roman" w:hAnsi="Times New Roman" w:cs="Times New Roman"/>
-        </w:rPr>
-        <w:t>Producto: Libros producidos a base de papel reciclado, cubre la necesidad de la educación y el saber. Además del conocimiento del libro, permite que los leyentes puedan desarrollar el pensamiento crítico en casos de cierta lectura, y la distracción de la realidad en caso de otras.</w:t>
-      </w:r>
-    </w:p>
-    <w:p>
-      <w:pPr>
-        <w:spacing w:line="276" w:lineRule="auto"/>
-        <w:jc w:val="both"/>
-        <w:rPr>
-          <w:rFonts w:ascii="Times New Roman" w:hAnsi="Times New Roman" w:cs="Times New Roman"/>
-        </w:rPr>
-      </w:pPr>
-      <w:r>
-        <w:rPr>
-          <w:rFonts w:ascii="Times New Roman" w:hAnsi="Times New Roman" w:cs="Times New Roman"/>
-        </w:rPr>
-        <w:t xml:space="preserve">Precio: el precio es indiferente, ya que proveemos donaciones de libros, sin necesidad de pago. Aunque si ofrecemos una sección de libros sin </w:t>
-      </w:r>
-      <w:r>
-        <w:rPr>
-          <w:rFonts w:ascii="Times New Roman" w:hAnsi="Times New Roman" w:cs="Times New Roman"/>
+          <w:rFonts w:ascii="Arial" w:hAnsi="Arial" w:cs="Arial"/>
+        </w:rPr>
+      </w:pPr>
+      <w:r>
+        <w:rPr>
+          <w:rFonts w:ascii="Arial" w:hAnsi="Arial" w:cs="Arial"/>
+        </w:rPr>
+        <w:t xml:space="preserve">Producto: Libros producidos a base de papel reciclado, cubre la </w:t>
+      </w:r>
+      <w:r>
+        <w:rPr>
+          <w:rFonts w:ascii="Arial" w:hAnsi="Arial" w:cs="Arial"/>
+        </w:rPr>
+        <w:t>carencia de recursos educativos en espacios rurales o marginados</w:t>
+      </w:r>
+      <w:r>
+        <w:rPr>
+          <w:rFonts w:ascii="Arial" w:hAnsi="Arial" w:cs="Arial"/>
+        </w:rPr>
+        <w:t xml:space="preserve">. Además </w:t>
+      </w:r>
+      <w:r>
+        <w:rPr>
+          <w:rFonts w:ascii="Arial" w:hAnsi="Arial" w:cs="Arial"/>
+        </w:rPr>
+        <w:t>de lo que los libros muestran, los lectores pueden desarrollar</w:t>
+      </w:r>
+      <w:r>
+        <w:rPr>
+          <w:rFonts w:ascii="Arial" w:hAnsi="Arial" w:cs="Arial"/>
+        </w:rPr>
+        <w:t xml:space="preserve"> el pensamiento crítico en casos de cierta lectura, y la distracción de la realidad en caso de otras.</w:t>
+      </w:r>
+    </w:p>
+    <w:p>
+      <w:pPr>
+        <w:spacing w:line="276" w:lineRule="auto"/>
+        <w:jc w:val="both"/>
+        <w:rPr>
+          <w:rFonts w:ascii="Arial" w:hAnsi="Arial" w:cs="Arial"/>
+        </w:rPr>
+      </w:pPr>
+      <w:r>
+        <w:rPr>
+          <w:rFonts w:ascii="Arial" w:hAnsi="Arial" w:cs="Arial"/>
+        </w:rPr>
+        <w:t>Precio: el precio</w:t>
+      </w:r>
+      <w:r>
+        <w:rPr>
+          <w:rFonts w:ascii="Arial" w:hAnsi="Arial" w:cs="Arial"/>
+        </w:rPr>
+        <w:t xml:space="preserve"> no es relevante para los lectores, pero si se establece un precio hacia quienes buscan querer un espacio publicitario en los libros</w:t>
+      </w:r>
+      <w:r>
+        <w:rPr>
+          <w:rFonts w:ascii="Arial" w:hAnsi="Arial" w:cs="Arial"/>
+        </w:rPr>
+        <w:t>. Aunque si ofrecemos una sección</w:t>
+      </w:r>
+      <w:r>
+        <w:rPr>
+          <w:rFonts w:ascii="Arial" w:hAnsi="Arial" w:cs="Arial"/>
+        </w:rPr>
+        <w:t xml:space="preserve"> donde pueden comprar</w:t>
+      </w:r>
+      <w:r>
+        <w:rPr>
+          <w:rFonts w:ascii="Arial" w:hAnsi="Arial" w:cs="Arial"/>
+        </w:rPr>
+        <w:t xml:space="preserve"> libros sin </w:t>
+      </w:r>
+      <w:r>
+        <w:rPr>
+          <w:rFonts w:ascii="Arial" w:hAnsi="Arial" w:cs="Arial"/>
         </w:rPr>
         <w:t>anuncios,</w:t>
       </w:r>
       <w:r>
         <w:rPr>
-          <w:rFonts w:ascii="Times New Roman" w:hAnsi="Times New Roman" w:cs="Times New Roman"/>
+          <w:rFonts w:ascii="Arial" w:hAnsi="Arial" w:cs="Arial"/>
         </w:rPr>
         <w:t xml:space="preserve"> pero con un coste un poco m</w:t>
       </w:r>
       <w:r>
         <w:rPr>
-          <w:rFonts w:ascii="Times New Roman" w:hAnsi="Times New Roman" w:cs="Times New Roman"/>
+          <w:rFonts w:ascii="Arial" w:hAnsi="Arial" w:cs="Arial"/>
         </w:rPr>
         <w:t>á</w:t>
       </w:r>
       <w:r>
         <w:rPr>
-          <w:rFonts w:ascii="Times New Roman" w:hAnsi="Times New Roman" w:cs="Times New Roman"/>
-        </w:rPr>
-        <w:t>s elevado.</w:t>
-      </w:r>
-    </w:p>
-    <w:p>
-      <w:pPr>
-        <w:spacing w:line="276" w:lineRule="auto"/>
-        <w:jc w:val="both"/>
-        <w:rPr>
-          <w:rFonts w:ascii="Times New Roman" w:hAnsi="Times New Roman" w:cs="Times New Roman"/>
-          <w:lang w:val="es-ES"/>
-        </w:rPr>
-      </w:pPr>
-      <w:r>
-        <w:rPr>
-          <w:rFonts w:ascii="Times New Roman" w:hAnsi="Times New Roman" w:cs="Times New Roman"/>
-          <w:lang w:val="es-ES"/>
-        </w:rPr>
-        <w:t>Punto de venta: Nos localizamos en Argentina, y además tenemos alcance a todo el territorio, el envío tiene un coste dependiendo del medio de transporte deseado por el adquisidor.</w:t>
-      </w:r>
-    </w:p>
-    <w:p>
-      <w:pPr>
-        <w:spacing w:line="276" w:lineRule="auto"/>
-        <w:jc w:val="both"/>
-        <w:rPr>
-          <w:rFonts w:ascii="Times New Roman" w:hAnsi="Times New Roman" w:cs="Times New Roman"/>
-          <w:lang w:val="es-ES"/>
-        </w:rPr>
-      </w:pPr>
-      <w:r>
-        <w:rPr>
-          <w:rFonts w:ascii="Times New Roman" w:hAnsi="Times New Roman" w:cs="Times New Roman"/>
-          <w:lang w:val="es-ES"/>
-        </w:rPr>
-        <w:t>Promoción: Se realiza a través de redes sociales y en boca en boca de los leyentes.</w:t>
-      </w:r>
-    </w:p>
-    <w:p>
-      <w:pPr>
-        <w:spacing w:line="276" w:lineRule="auto"/>
-        <w:jc w:val="both"/>
-        <w:rPr>
-          <w:rFonts w:ascii="Times New Roman" w:hAnsi="Times New Roman" w:cs="Times New Roman"/>
-          <w:lang w:val="es-ES"/>
-        </w:rPr>
-      </w:pPr>
-      <w:r>
-        <w:rPr>
-          <w:rFonts w:ascii="Times New Roman" w:hAnsi="Times New Roman" w:cs="Times New Roman"/>
+          <w:rFonts w:ascii="Arial" w:hAnsi="Arial" w:cs="Arial"/>
+        </w:rPr>
+        <w:t>s elevado</w:t>
+      </w:r>
+      <w:r>
+        <w:rPr>
+          <w:rFonts w:ascii="Arial" w:hAnsi="Arial" w:cs="Arial"/>
+        </w:rPr>
+        <w:t>, debido a exclusividad de este producto</w:t>
+      </w:r>
+      <w:r>
+        <w:rPr>
+          <w:rFonts w:ascii="Arial" w:hAnsi="Arial" w:cs="Arial"/>
+        </w:rPr>
+        <w:t>.</w:t>
+      </w:r>
+    </w:p>
+    <w:p>
+      <w:pPr>
+        <w:spacing w:line="276" w:lineRule="auto"/>
+        <w:jc w:val="both"/>
+        <w:rPr>
+          <w:rFonts w:ascii="Arial" w:hAnsi="Arial" w:cs="Arial"/>
+          <w:lang w:val="es-ES"/>
+        </w:rPr>
+      </w:pPr>
+      <w:r>
+        <w:rPr>
+          <w:rFonts w:ascii="Arial" w:hAnsi="Arial" w:cs="Arial"/>
+          <w:lang w:val="es-ES"/>
+        </w:rPr>
+        <w:t xml:space="preserve">Punto de venta: Nos localizamos </w:t>
+      </w:r>
+      <w:r>
+        <w:rPr>
+          <w:rFonts w:ascii="Arial" w:hAnsi="Arial" w:cs="Arial"/>
+          <w:lang w:val="es-ES"/>
+        </w:rPr>
+        <w:t>inicialmente en Bs.As., en barrios marginados y/o centro. Pero buscamos obtener alcance nacional mientras estemos progresando con nuestros objetivos.</w:t>
+      </w:r>
+    </w:p>
+    <w:p>
+      <w:pPr>
+        <w:spacing w:line="276" w:lineRule="auto"/>
+        <w:jc w:val="both"/>
+        <w:rPr>
+          <w:rFonts w:ascii="Arial" w:hAnsi="Arial" w:cs="Arial"/>
+          <w:lang w:val="es-ES"/>
+        </w:rPr>
+      </w:pPr>
+      <w:r>
+        <w:rPr>
+          <w:rFonts w:ascii="Arial" w:hAnsi="Arial" w:cs="Arial"/>
+          <w:lang w:val="es-ES"/>
+        </w:rPr>
+        <w:t xml:space="preserve">Promoción: Se realiza </w:t>
+      </w:r>
+      <w:r>
+        <w:rPr>
+          <w:rFonts w:ascii="Arial" w:hAnsi="Arial" w:cs="Arial"/>
+          <w:lang w:val="es-ES"/>
+        </w:rPr>
+        <w:t>principalmente a través de la puesta de puntos de encuentro, donde será un contacto más personal y amigable. Luego, cuando estemos alcanzando un cierto progreso, buscaremos utilizar redes sociales y/o servicios web.</w:t>
+      </w:r>
+    </w:p>
+    <w:p>
+      <w:pPr>
+        <w:spacing w:line="276" w:lineRule="auto"/>
+        <w:jc w:val="both"/>
+        <w:rPr>
+          <w:rFonts w:ascii="Arial" w:hAnsi="Arial" w:cs="Arial"/>
+          <w:lang w:val="es-ES"/>
+        </w:rPr>
+      </w:pPr>
+      <w:r>
+        <w:rPr>
+          <w:rFonts w:ascii="Arial" w:hAnsi="Arial" w:cs="Arial"/>
           <w:highlight w:val="yellow"/>
           <w:lang w:val="es-ES"/>
         </w:rPr>
@@ -309,30 +384,30 @@
         <w:spacing w:line="276" w:lineRule="auto"/>
         <w:jc w:val="both"/>
         <w:rPr>
-          <w:rFonts w:ascii="Times New Roman" w:hAnsi="Times New Roman" w:cs="Times New Roman"/>
-          <w:lang w:val="es-ES"/>
-        </w:rPr>
-      </w:pPr>
-      <w:r>
-        <w:rPr>
-          <w:rFonts w:ascii="Times New Roman" w:hAnsi="Times New Roman" w:cs="Times New Roman"/>
-          <w:lang w:val="es-ES"/>
-        </w:rPr>
-        <w:t>Esta es basada en protesta a las editoriales con sus diseños sumamente caros, por ende, buscamos la concientización de ellos en disminuir precios y/o buscar que sean algunos quienes ofrezcan libros a entidades públicas – como nosotros buscamos lograr -. Aunque si somos conscientes del mercado y el sector privado, no deberíamos involucrarnos en asuntos de otros, sí somos coherentes en la distribución de conocimiento gratuito y universal, evitando la discriminación de clases y el elitismo por la lectura.</w:t>
-      </w:r>
-    </w:p>
-    <w:p>
-      <w:pPr>
-        <w:spacing w:line="276" w:lineRule="auto"/>
-        <w:jc w:val="both"/>
-        <w:rPr>
-          <w:rFonts w:ascii="Times New Roman" w:hAnsi="Times New Roman" w:cs="Times New Roman"/>
-          <w:lang w:val="es-ES"/>
-        </w:rPr>
-      </w:pPr>
-      <w:r>
-        <w:rPr>
-          <w:rFonts w:ascii="Times New Roman" w:hAnsi="Times New Roman" w:cs="Times New Roman"/>
+          <w:rFonts w:ascii="Arial" w:hAnsi="Arial" w:cs="Arial"/>
+          <w:lang w:val="es-ES"/>
+        </w:rPr>
+      </w:pPr>
+      <w:r>
+        <w:rPr>
+          <w:rFonts w:ascii="Arial" w:hAnsi="Arial" w:cs="Arial"/>
+          <w:lang w:val="es-ES"/>
+        </w:rPr>
+        <w:t>Esta se basará en la concientización de las empresas en favorecer este tipo de actividades hacia quienes no tienen la posibilidad de alcanzar el estudio. Como también el reconocimiento y fomento de uso de material biodegradable en productos cotidianos.</w:t>
+      </w:r>
+    </w:p>
+    <w:p>
+      <w:pPr>
+        <w:spacing w:line="276" w:lineRule="auto"/>
+        <w:jc w:val="both"/>
+        <w:rPr>
+          <w:rFonts w:ascii="Arial" w:hAnsi="Arial" w:cs="Arial"/>
+          <w:lang w:val="es-ES"/>
+        </w:rPr>
+      </w:pPr>
+      <w:r>
+        <w:rPr>
+          <w:rFonts w:ascii="Arial" w:hAnsi="Arial" w:cs="Arial"/>
           <w:highlight w:val="yellow"/>
           <w:lang w:val="es-ES"/>
         </w:rPr>
@@ -344,48 +419,48 @@
         <w:spacing w:line="276" w:lineRule="auto"/>
         <w:jc w:val="both"/>
         <w:rPr>
-          <w:rFonts w:ascii="Times New Roman" w:hAnsi="Times New Roman" w:cs="Times New Roman"/>
-          <w:lang w:val="es-ES"/>
-        </w:rPr>
-      </w:pPr>
-      <w:r>
-        <w:rPr>
-          <w:rFonts w:ascii="Times New Roman" w:hAnsi="Times New Roman" w:cs="Times New Roman"/>
+          <w:rFonts w:ascii="Arial" w:hAnsi="Arial" w:cs="Arial"/>
+          <w:lang w:val="es-ES"/>
+        </w:rPr>
+      </w:pPr>
+      <w:r>
+        <w:rPr>
+          <w:rFonts w:ascii="Arial" w:hAnsi="Arial" w:cs="Arial"/>
           <w:lang w:val="es-ES"/>
         </w:rPr>
         <w:t>Esta se desarrollar</w:t>
       </w:r>
       <w:r>
         <w:rPr>
-          <w:rFonts w:ascii="Times New Roman" w:hAnsi="Times New Roman" w:cs="Times New Roman"/>
+          <w:rFonts w:ascii="Arial" w:hAnsi="Arial" w:cs="Arial"/>
           <w:lang w:val="es-ES"/>
         </w:rPr>
         <w:t>á</w:t>
       </w:r>
       <w:r>
         <w:rPr>
-          <w:rFonts w:ascii="Times New Roman" w:hAnsi="Times New Roman" w:cs="Times New Roman"/>
+          <w:rFonts w:ascii="Arial" w:hAnsi="Arial" w:cs="Arial"/>
           <w:lang w:val="es-ES"/>
         </w:rPr>
         <w:t xml:space="preserve"> principalmente en redes sociales y el en boca en boca de los lectores. Sin embargo, se predispondrá de una p</w:t>
       </w:r>
       <w:r>
         <w:rPr>
-          <w:rFonts w:ascii="Times New Roman" w:hAnsi="Times New Roman" w:cs="Times New Roman"/>
+          <w:rFonts w:ascii="Arial" w:hAnsi="Arial" w:cs="Arial"/>
           <w:lang w:val="es-ES"/>
         </w:rPr>
         <w:t>á</w:t>
       </w:r>
       <w:r>
         <w:rPr>
-          <w:rFonts w:ascii="Times New Roman" w:hAnsi="Times New Roman" w:cs="Times New Roman"/>
+          <w:rFonts w:ascii="Arial" w:hAnsi="Arial" w:cs="Arial"/>
           <w:lang w:val="es-ES"/>
         </w:rPr>
         <w:t xml:space="preserve">gina web donde podrán acceder para </w:t>
       </w:r>
       <w:r>
         <w:rPr>
-          <w:rFonts w:ascii="Times New Roman" w:hAnsi="Times New Roman" w:cs="Times New Roman"/>
+          <w:rFonts w:ascii="Arial" w:hAnsi="Arial" w:cs="Arial"/>
           <w:lang w:val="es-ES"/>
         </w:rPr>
         <w:t>vista previa de nuestro stock y posible incluso de auspiciantes para la publicidad de sus propias marcas.</w:t>
@@ -396,16 +471,39 @@
         <w:spacing w:line="276" w:lineRule="auto"/>
         <w:jc w:val="both"/>
         <w:rPr>
-          <w:rFonts w:ascii="Times New Roman" w:hAnsi="Times New Roman" w:cs="Times New Roman"/>
-          <w:lang w:val="es-ES"/>
-        </w:rPr>
-      </w:pPr>
-      <w:r>
-        <w:rPr>
-          <w:rFonts w:ascii="Times New Roman" w:hAnsi="Times New Roman" w:cs="Times New Roman"/>
+          <w:rFonts w:ascii="Arial" w:hAnsi="Arial" w:cs="Arial"/>
           <w:highlight w:val="yellow"/>
           <w:lang w:val="es-ES"/>
         </w:rPr>
+      </w:pPr>
+    </w:p>
+    <w:p>
+      <w:pPr>
+        <w:spacing w:line="276" w:lineRule="auto"/>
+        <w:jc w:val="both"/>
+        <w:rPr>
+          <w:rFonts w:ascii="Arial" w:hAnsi="Arial" w:cs="Arial"/>
+          <w:highlight w:val="yellow"/>
+          <w:lang w:val="es-ES"/>
+        </w:rPr>
+      </w:pPr>
+    </w:p>
+    <w:p>
+      <w:pPr>
+        <w:spacing w:line="276" w:lineRule="auto"/>
+        <w:jc w:val="both"/>
+        <w:rPr>
+          <w:rFonts w:ascii="Arial" w:hAnsi="Arial" w:cs="Arial"/>
+          <w:lang w:val="es-ES"/>
+        </w:rPr>
+      </w:pPr>
+      <w:r>
+        <w:rPr>
+          <w:rFonts w:ascii="Arial" w:hAnsi="Arial" w:cs="Arial"/>
+          <w:highlight w:val="yellow"/>
+          <w:lang w:val="es-ES"/>
+        </w:rPr>
+        <w:lastRenderedPageBreak/>
         <w:t>Presupuesto</w:t>
       </w:r>
     </w:p>
@@ -419,7 +517,7 @@
         <w:spacing w:line="276" w:lineRule="auto"/>
         <w:jc w:val="both"/>
         <w:rPr>
-          <w:rFonts w:ascii="Times New Roman" w:hAnsi="Times New Roman" w:cs="Times New Roman"/>
+          <w:rFonts w:ascii="Arial" w:hAnsi="Arial" w:cs="Arial"/>
           <w:lang w:val="es-ES"/>
         </w:rPr>
         <w:sectPr>
@@ -440,13 +538,13 @@
         <w:spacing w:line="276" w:lineRule="auto"/>
         <w:jc w:val="both"/>
         <w:rPr>
-          <w:rFonts w:ascii="Times New Roman" w:hAnsi="Times New Roman" w:cs="Times New Roman"/>
-          <w:lang w:val="es-ES"/>
-        </w:rPr>
-      </w:pPr>
-      <w:r>
-        <w:rPr>
-          <w:rFonts w:ascii="Times New Roman" w:hAnsi="Times New Roman" w:cs="Times New Roman"/>
+          <w:rFonts w:ascii="Arial" w:hAnsi="Arial" w:cs="Arial"/>
+          <w:lang w:val="es-ES"/>
+        </w:rPr>
+      </w:pPr>
+      <w:r>
+        <w:rPr>
+          <w:rFonts w:ascii="Arial" w:hAnsi="Arial" w:cs="Arial"/>
           <w:lang w:val="es-ES"/>
         </w:rPr>
         <w:t>Ingresos fijos</w:t>
@@ -462,13 +560,13 @@
         <w:spacing w:line="276" w:lineRule="auto"/>
         <w:jc w:val="both"/>
         <w:rPr>
-          <w:rFonts w:ascii="Times New Roman" w:hAnsi="Times New Roman" w:cs="Times New Roman"/>
-          <w:lang w:val="es-ES"/>
-        </w:rPr>
-      </w:pPr>
-      <w:r>
-        <w:rPr>
-          <w:rFonts w:ascii="Times New Roman" w:hAnsi="Times New Roman" w:cs="Times New Roman"/>
+          <w:rFonts w:ascii="Arial" w:hAnsi="Arial" w:cs="Arial"/>
+          <w:lang w:val="es-ES"/>
+        </w:rPr>
+      </w:pPr>
+      <w:r>
+        <w:rPr>
+          <w:rFonts w:ascii="Arial" w:hAnsi="Arial" w:cs="Arial"/>
           <w:lang w:val="es-ES"/>
         </w:rPr>
         <w:t>Ingresos variables</w:t>
@@ -484,13 +582,13 @@
         <w:spacing w:line="276" w:lineRule="auto"/>
         <w:jc w:val="both"/>
         <w:rPr>
-          <w:rFonts w:ascii="Times New Roman" w:hAnsi="Times New Roman" w:cs="Times New Roman"/>
-          <w:lang w:val="es-ES"/>
-        </w:rPr>
-      </w:pPr>
-      <w:r>
-        <w:rPr>
-          <w:rFonts w:ascii="Times New Roman" w:hAnsi="Times New Roman" w:cs="Times New Roman"/>
+          <w:rFonts w:ascii="Arial" w:hAnsi="Arial" w:cs="Arial"/>
+          <w:lang w:val="es-ES"/>
+        </w:rPr>
+      </w:pPr>
+      <w:r>
+        <w:rPr>
+          <w:rFonts w:ascii="Arial" w:hAnsi="Arial" w:cs="Arial"/>
           <w:lang w:val="es-ES"/>
         </w:rPr>
         <w:t>Gastos obligatorios variables</w:t>
@@ -506,13 +604,13 @@
         <w:spacing w:line="276" w:lineRule="auto"/>
         <w:jc w:val="both"/>
         <w:rPr>
-          <w:rFonts w:ascii="Times New Roman" w:hAnsi="Times New Roman" w:cs="Times New Roman"/>
-          <w:lang w:val="es-ES"/>
-        </w:rPr>
-      </w:pPr>
-      <w:r>
-        <w:rPr>
-          <w:rFonts w:ascii="Times New Roman" w:hAnsi="Times New Roman" w:cs="Times New Roman"/>
+          <w:rFonts w:ascii="Arial" w:hAnsi="Arial" w:cs="Arial"/>
+          <w:lang w:val="es-ES"/>
+        </w:rPr>
+      </w:pPr>
+      <w:r>
+        <w:rPr>
+          <w:rFonts w:ascii="Arial" w:hAnsi="Arial" w:cs="Arial"/>
           <w:lang w:val="es-ES"/>
         </w:rPr>
         <w:t>Gastos obligatorios fijos</w:t>
@@ -528,13 +626,13 @@
         <w:spacing w:line="276" w:lineRule="auto"/>
         <w:jc w:val="both"/>
         <w:rPr>
-          <w:rFonts w:ascii="Times New Roman" w:hAnsi="Times New Roman" w:cs="Times New Roman"/>
-          <w:lang w:val="es-ES"/>
-        </w:rPr>
-      </w:pPr>
-      <w:r>
-        <w:rPr>
-          <w:rFonts w:ascii="Times New Roman" w:hAnsi="Times New Roman" w:cs="Times New Roman"/>
+          <w:rFonts w:ascii="Arial" w:hAnsi="Arial" w:cs="Arial"/>
+          <w:lang w:val="es-ES"/>
+        </w:rPr>
+      </w:pPr>
+      <w:r>
+        <w:rPr>
+          <w:rFonts w:ascii="Arial" w:hAnsi="Arial" w:cs="Arial"/>
           <w:lang w:val="es-ES"/>
         </w:rPr>
         <w:t>Gastos Optativos</w:t>
@@ -545,7 +643,7 @@
         <w:spacing w:line="276" w:lineRule="auto"/>
         <w:jc w:val="both"/>
         <w:rPr>
-          <w:rFonts w:ascii="Times New Roman" w:hAnsi="Times New Roman" w:cs="Times New Roman"/>
+          <w:rFonts w:ascii="Arial" w:hAnsi="Arial" w:cs="Arial"/>
           <w:highlight w:val="yellow"/>
           <w:lang w:val="es-ES"/>
         </w:rPr>
@@ -563,13 +661,13 @@
         <w:spacing w:line="276" w:lineRule="auto"/>
         <w:jc w:val="both"/>
         <w:rPr>
-          <w:rFonts w:ascii="Times New Roman" w:hAnsi="Times New Roman" w:cs="Times New Roman"/>
-          <w:lang w:val="es-ES"/>
-        </w:rPr>
-      </w:pPr>
-      <w:r>
-        <w:rPr>
-          <w:rFonts w:ascii="Times New Roman" w:hAnsi="Times New Roman" w:cs="Times New Roman"/>
+          <w:rFonts w:ascii="Arial" w:hAnsi="Arial" w:cs="Arial"/>
+          <w:lang w:val="es-ES"/>
+        </w:rPr>
+      </w:pPr>
+      <w:r>
+        <w:rPr>
+          <w:rFonts w:ascii="Arial" w:hAnsi="Arial" w:cs="Arial"/>
           <w:highlight w:val="yellow"/>
           <w:lang w:val="es-ES"/>
         </w:rPr>
@@ -581,31 +679,46 @@
         <w:spacing w:line="276" w:lineRule="auto"/>
         <w:jc w:val="both"/>
         <w:rPr>
-          <w:rFonts w:ascii="Times New Roman" w:hAnsi="Times New Roman" w:cs="Times New Roman"/>
-          <w:lang w:val="es-ES"/>
-        </w:rPr>
-      </w:pPr>
-      <w:r>
-        <w:rPr>
-          <w:rFonts w:ascii="Times New Roman" w:hAnsi="Times New Roman" w:cs="Times New Roman"/>
-          <w:lang w:val="es-ES"/>
-        </w:rPr>
-        <w:lastRenderedPageBreak/>
-        <w:t>Se deberá optar por un plan de financiamiento externo, debido a la carencia de recursos propios para realizar un startup. Por ende, buscaremos empresas quienes decidan apoyarnos, y en caso de fracasar de arranque, tendremos que optar por prestamos en entidades bancarias.</w:t>
-      </w:r>
-    </w:p>
-    <w:p>
-      <w:pPr>
-        <w:spacing w:line="276" w:lineRule="auto"/>
-        <w:jc w:val="both"/>
-        <w:rPr>
-          <w:rFonts w:ascii="Times New Roman" w:hAnsi="Times New Roman" w:cs="Times New Roman"/>
-          <w:lang w:val="es-ES"/>
-        </w:rPr>
-      </w:pPr>
-      <w:r>
-        <w:rPr>
-          <w:rFonts w:ascii="Times New Roman" w:hAnsi="Times New Roman" w:cs="Times New Roman"/>
+          <w:rFonts w:ascii="Arial" w:hAnsi="Arial" w:cs="Arial"/>
+          <w:lang w:val="es-ES"/>
+        </w:rPr>
+      </w:pPr>
+      <w:r>
+        <w:rPr>
+          <w:rFonts w:ascii="Arial" w:hAnsi="Arial" w:cs="Arial"/>
+          <w:lang w:val="es-ES"/>
+        </w:rPr>
+        <w:t xml:space="preserve">Se deberá optar por un plan de financiamiento externo, debido a la carencia de recursos propios para realizar un startup. Por ende, buscaremos empresas quienes decidan apoyarnos, y en caso de fracasar de arranque, tendremos que optar por </w:t>
+      </w:r>
+      <w:proofErr w:type="spellStart"/>
+      <w:r>
+        <w:rPr>
+          <w:rFonts w:ascii="Arial" w:hAnsi="Arial" w:cs="Arial"/>
+          <w:lang w:val="es-ES"/>
+        </w:rPr>
+        <w:t>prestamos</w:t>
+      </w:r>
+      <w:proofErr w:type="spellEnd"/>
+      <w:r>
+        <w:rPr>
+          <w:rFonts w:ascii="Arial" w:hAnsi="Arial" w:cs="Arial"/>
+          <w:lang w:val="es-ES"/>
+        </w:rPr>
+        <w:t xml:space="preserve"> en entidades bancarias.</w:t>
+      </w:r>
+    </w:p>
+    <w:p>
+      <w:pPr>
+        <w:spacing w:line="276" w:lineRule="auto"/>
+        <w:jc w:val="both"/>
+        <w:rPr>
+          <w:rFonts w:ascii="Arial" w:hAnsi="Arial" w:cs="Arial"/>
+          <w:lang w:val="es-ES"/>
+        </w:rPr>
+      </w:pPr>
+      <w:r>
+        <w:rPr>
+          <w:rFonts w:ascii="Arial" w:hAnsi="Arial" w:cs="Arial"/>
           <w:highlight w:val="yellow"/>
           <w:lang w:val="es-ES"/>
         </w:rPr>
@@ -617,27 +730,27 @@
         <w:spacing w:line="276" w:lineRule="auto"/>
         <w:jc w:val="both"/>
         <w:rPr>
-          <w:rFonts w:ascii="Times New Roman" w:hAnsi="Times New Roman" w:cs="Times New Roman"/>
-          <w:lang w:val="es-ES"/>
-        </w:rPr>
-      </w:pPr>
-      <w:r>
-        <w:rPr>
-          <w:rFonts w:ascii="Times New Roman" w:hAnsi="Times New Roman" w:cs="Times New Roman"/>
+          <w:rFonts w:ascii="Arial" w:hAnsi="Arial" w:cs="Arial"/>
+          <w:lang w:val="es-ES"/>
+        </w:rPr>
+      </w:pPr>
+      <w:r>
+        <w:rPr>
+          <w:rFonts w:ascii="Arial" w:hAnsi="Arial" w:cs="Arial"/>
           <w:lang w:val="es-ES"/>
         </w:rPr>
         <w:t xml:space="preserve">La distribución se basará de forma directa. Ya que seremos nosotros quienes vendan los libros y/o los donen. No buscaremos intermediarios para evitar plagios o </w:t>
       </w:r>
       <w:r>
         <w:rPr>
-          <w:rFonts w:ascii="Times New Roman" w:hAnsi="Times New Roman" w:cs="Times New Roman"/>
+          <w:rFonts w:ascii="Arial" w:hAnsi="Arial" w:cs="Arial"/>
           <w:lang w:val="es-ES"/>
         </w:rPr>
         <w:t>mal intenciones</w:t>
       </w:r>
       <w:r>
         <w:rPr>
-          <w:rFonts w:ascii="Times New Roman" w:hAnsi="Times New Roman" w:cs="Times New Roman"/>
+          <w:rFonts w:ascii="Arial" w:hAnsi="Arial" w:cs="Arial"/>
           <w:lang w:val="es-ES"/>
         </w:rPr>
         <w:t xml:space="preserve"> corruptas por parte de estos. Además, esto fomentara una cercanía amigable entre los auspiciantes, nosotros y donados.</w:t>
@@ -648,18 +761,14 @@
         <w:spacing w:line="276" w:lineRule="auto"/>
         <w:jc w:val="both"/>
         <w:rPr>
-          <w:rFonts w:ascii="Times New Roman" w:hAnsi="Times New Roman" w:cs="Times New Roman"/>
-          <w:sz w:val="28"/>
-          <w:szCs w:val="28"/>
+          <w:rFonts w:ascii="Arial" w:hAnsi="Arial" w:cs="Arial"/>
           <w:u w:val="single"/>
           <w:lang w:val="es-ES"/>
         </w:rPr>
       </w:pPr>
       <w:r>
         <w:rPr>
-          <w:rFonts w:ascii="Times New Roman" w:hAnsi="Times New Roman" w:cs="Times New Roman"/>
-          <w:sz w:val="28"/>
-          <w:szCs w:val="28"/>
+          <w:rFonts w:ascii="Arial" w:hAnsi="Arial" w:cs="Arial"/>
           <w:u w:val="single"/>
           <w:lang w:val="es-ES"/>
         </w:rPr>
@@ -671,17 +780,13 @@
         <w:spacing w:line="276" w:lineRule="auto"/>
         <w:jc w:val="both"/>
         <w:rPr>
-          <w:rFonts w:ascii="Times New Roman" w:hAnsi="Times New Roman" w:cs="Times New Roman"/>
-          <w:sz w:val="24"/>
-          <w:szCs w:val="24"/>
-          <w:lang w:val="es-ES"/>
-        </w:rPr>
-      </w:pPr>
-      <w:r>
-        <w:rPr>
-          <w:rFonts w:ascii="Times New Roman" w:hAnsi="Times New Roman" w:cs="Times New Roman"/>
-          <w:sz w:val="24"/>
-          <w:szCs w:val="24"/>
+          <w:rFonts w:ascii="Arial" w:hAnsi="Arial" w:cs="Arial"/>
+          <w:lang w:val="es-ES"/>
+        </w:rPr>
+      </w:pPr>
+      <w:r>
+        <w:rPr>
+          <w:rFonts w:ascii="Arial" w:hAnsi="Arial" w:cs="Arial"/>
           <w:lang w:val="es-ES"/>
         </w:rPr>
         <w:t>El capital requerido para llevar a cabo el desarrollo de esta empresa se categoriza como:</w:t>
@@ -697,17 +802,13 @@
         <w:spacing w:line="276" w:lineRule="auto"/>
         <w:jc w:val="both"/>
         <w:rPr>
-          <w:rFonts w:ascii="Times New Roman" w:hAnsi="Times New Roman" w:cs="Times New Roman"/>
-          <w:sz w:val="24"/>
-          <w:szCs w:val="24"/>
-          <w:lang w:val="es-ES"/>
-        </w:rPr>
-      </w:pPr>
-      <w:r>
-        <w:rPr>
-          <w:rFonts w:ascii="Times New Roman" w:hAnsi="Times New Roman" w:cs="Times New Roman"/>
-          <w:sz w:val="24"/>
-          <w:szCs w:val="24"/>
+          <w:rFonts w:ascii="Arial" w:hAnsi="Arial" w:cs="Arial"/>
+          <w:lang w:val="es-ES"/>
+        </w:rPr>
+      </w:pPr>
+      <w:r>
+        <w:rPr>
+          <w:rFonts w:ascii="Arial" w:hAnsi="Arial" w:cs="Arial"/>
           <w:lang w:val="es-ES"/>
         </w:rPr>
         <w:t>Fijo: Sede de impresión y encuadernación – Impresora – Maquina de encuadernación – Computadora para la creación de diseños y estampados Muebles de oficina – Herramientas extras</w:t>
@@ -723,29 +824,16 @@
         <w:spacing w:line="276" w:lineRule="auto"/>
         <w:jc w:val="both"/>
         <w:rPr>
-          <w:rFonts w:ascii="Times New Roman" w:hAnsi="Times New Roman" w:cs="Times New Roman"/>
-          <w:sz w:val="24"/>
-          <w:szCs w:val="24"/>
-          <w:lang w:val="es-ES"/>
-        </w:rPr>
-      </w:pPr>
-      <w:r>
-        <w:rPr>
-          <w:rFonts w:ascii="Times New Roman" w:hAnsi="Times New Roman" w:cs="Times New Roman"/>
-          <w:sz w:val="24"/>
-          <w:szCs w:val="24"/>
-          <w:lang w:val="es-ES"/>
-        </w:rPr>
-        <w:t xml:space="preserve">Circulantes: Papel ecológico – Cajas biodegradables – Tinta de agua – Tapas y Contratapas - </w:t>
-      </w:r>
-      <w:r>
-        <w:rPr>
-          <w:rFonts w:ascii="Times New Roman" w:hAnsi="Times New Roman" w:cs="Times New Roman"/>
-          <w:sz w:val="24"/>
-          <w:szCs w:val="24"/>
-          <w:lang w:val="es-ES"/>
-        </w:rPr>
-        <w:t xml:space="preserve">Almacenes de depósito </w:t>
+          <w:rFonts w:ascii="Arial" w:hAnsi="Arial" w:cs="Arial"/>
+          <w:lang w:val="es-ES"/>
+        </w:rPr>
+      </w:pPr>
+      <w:r>
+        <w:rPr>
+          <w:rFonts w:ascii="Arial" w:hAnsi="Arial" w:cs="Arial"/>
+          <w:lang w:val="es-ES"/>
+        </w:rPr>
+        <w:t xml:space="preserve">Circulantes: Papel ecológico – Cajas biodegradables – Tinta de agua – Tapas y Contratapas - Almacenes de depósito </w:t>
       </w:r>
     </w:p>
     <w:p>
@@ -758,17 +846,13 @@
         <w:spacing w:line="276" w:lineRule="auto"/>
         <w:jc w:val="both"/>
         <w:rPr>
-          <w:rFonts w:ascii="Times New Roman" w:hAnsi="Times New Roman" w:cs="Times New Roman"/>
-          <w:sz w:val="24"/>
-          <w:szCs w:val="24"/>
-          <w:lang w:val="es-ES"/>
-        </w:rPr>
-      </w:pPr>
-      <w:r>
-        <w:rPr>
-          <w:rFonts w:ascii="Times New Roman" w:hAnsi="Times New Roman" w:cs="Times New Roman"/>
-          <w:sz w:val="24"/>
-          <w:szCs w:val="24"/>
+          <w:rFonts w:ascii="Arial" w:hAnsi="Arial" w:cs="Arial"/>
+          <w:lang w:val="es-ES"/>
+        </w:rPr>
+      </w:pPr>
+      <w:r>
+        <w:rPr>
+          <w:rFonts w:ascii="Arial" w:hAnsi="Arial" w:cs="Arial"/>
           <w:lang w:val="es-ES"/>
         </w:rPr>
         <w:t>Capital humano: conocimientos de diseño gráfico – analista en sistemas para el desarrollo de software de asignación de libros – Encargado de maquinarias – Transportista – Limpieza</w:t>
@@ -784,17 +868,13 @@
         <w:spacing w:line="276" w:lineRule="auto"/>
         <w:jc w:val="both"/>
         <w:rPr>
-          <w:rFonts w:ascii="Times New Roman" w:hAnsi="Times New Roman" w:cs="Times New Roman"/>
-          <w:sz w:val="24"/>
-          <w:szCs w:val="24"/>
-          <w:lang w:val="es-ES"/>
-        </w:rPr>
-      </w:pPr>
-      <w:r>
-        <w:rPr>
-          <w:rFonts w:ascii="Times New Roman" w:hAnsi="Times New Roman" w:cs="Times New Roman"/>
-          <w:sz w:val="24"/>
-          <w:szCs w:val="24"/>
+          <w:rFonts w:ascii="Arial" w:hAnsi="Arial" w:cs="Arial"/>
+          <w:lang w:val="es-ES"/>
+        </w:rPr>
+      </w:pPr>
+      <w:r>
+        <w:rPr>
+          <w:rFonts w:ascii="Arial" w:hAnsi="Arial" w:cs="Arial"/>
           <w:lang w:val="es-ES"/>
         </w:rPr>
         <w:t>Capital Financiero: Carecemos de propios, pero si se solicita ayuda a empresas.</w:t>
@@ -805,18 +885,14 @@
         <w:spacing w:line="276" w:lineRule="auto"/>
         <w:jc w:val="both"/>
         <w:rPr>
-          <w:rFonts w:ascii="Times New Roman" w:hAnsi="Times New Roman" w:cs="Times New Roman"/>
-          <w:sz w:val="24"/>
-          <w:szCs w:val="24"/>
+          <w:rFonts w:ascii="Arial" w:hAnsi="Arial" w:cs="Arial"/>
           <w:u w:val="single"/>
           <w:lang w:val="es-ES"/>
         </w:rPr>
       </w:pPr>
       <w:r>
         <w:rPr>
-          <w:rFonts w:ascii="Times New Roman" w:hAnsi="Times New Roman" w:cs="Times New Roman"/>
-          <w:sz w:val="28"/>
-          <w:szCs w:val="28"/>
+          <w:rFonts w:ascii="Arial" w:hAnsi="Arial" w:cs="Arial"/>
           <w:u w:val="single"/>
           <w:lang w:val="es-ES"/>
         </w:rPr>
@@ -828,27 +904,44 @@
         <w:spacing w:line="276" w:lineRule="auto"/>
         <w:jc w:val="both"/>
         <w:rPr>
-          <w:rFonts w:ascii="Times New Roman" w:hAnsi="Times New Roman" w:cs="Times New Roman"/>
-          <w:sz w:val="24"/>
-          <w:szCs w:val="24"/>
+          <w:rFonts w:ascii="Arial" w:hAnsi="Arial" w:cs="Arial"/>
           <w:u w:val="single"/>
           <w:lang w:val="es-ES"/>
         </w:rPr>
       </w:pPr>
       <w:r>
         <w:rPr>
-          <w:rFonts w:ascii="Times New Roman" w:hAnsi="Times New Roman" w:cs="Times New Roman"/>
-          <w:sz w:val="24"/>
-          <w:szCs w:val="24"/>
-          <w:lang w:val="es-ES"/>
-        </w:rPr>
-        <w:t>Seran utilizadas fuentes externas, como lo es la colaboración de empresas. Debido a que la compra de maquinaria será llevandose a cabo durante el tiempo, al inicio surge el uso de computadoras personales e impresoras convencionales para la imprenta de libros. Pero avanzando en el tiempo, podremos costear prestamos financieros para la compra de nueva maquinaria</w:t>
-      </w:r>
-      <w:r>
-        <w:rPr>
-          <w:rFonts w:ascii="Times New Roman" w:hAnsi="Times New Roman" w:cs="Times New Roman"/>
-          <w:sz w:val="24"/>
-          <w:szCs w:val="24"/>
+          <w:rFonts w:ascii="Arial" w:hAnsi="Arial" w:cs="Arial"/>
+          <w:lang w:val="es-ES"/>
+        </w:rPr>
+        <w:t>Serán</w:t>
+      </w:r>
+      <w:r>
+        <w:rPr>
+          <w:rFonts w:ascii="Arial" w:hAnsi="Arial" w:cs="Arial"/>
+          <w:lang w:val="es-ES"/>
+        </w:rPr>
+        <w:t xml:space="preserve"> utilizadas fuentes externas, como lo es la colaboración de empresas. Debido a que la compra de maquinaria será </w:t>
+      </w:r>
+      <w:proofErr w:type="spellStart"/>
+      <w:r>
+        <w:rPr>
+          <w:rFonts w:ascii="Arial" w:hAnsi="Arial" w:cs="Arial"/>
+          <w:lang w:val="es-ES"/>
+        </w:rPr>
+        <w:t>llevandose</w:t>
+      </w:r>
+      <w:proofErr w:type="spellEnd"/>
+      <w:r>
+        <w:rPr>
+          <w:rFonts w:ascii="Arial" w:hAnsi="Arial" w:cs="Arial"/>
+          <w:lang w:val="es-ES"/>
+        </w:rPr>
+        <w:t xml:space="preserve"> a cabo durante el tiempo, al inicio surge el uso de computadoras personales e impresoras convencionales para la imprenta de libros. Pero avanzando en el tiempo, podremos costear prestamos financieros para la compra de nueva maquinaria</w:t>
+      </w:r>
+      <w:r>
+        <w:rPr>
+          <w:rFonts w:ascii="Arial" w:hAnsi="Arial" w:cs="Arial"/>
           <w:u w:val="single"/>
           <w:lang w:val="es-ES"/>
         </w:rPr>
@@ -860,18 +953,14 @@
         <w:spacing w:line="276" w:lineRule="auto"/>
         <w:jc w:val="both"/>
         <w:rPr>
-          <w:rFonts w:ascii="Times New Roman" w:hAnsi="Times New Roman" w:cs="Times New Roman"/>
-          <w:sz w:val="28"/>
-          <w:szCs w:val="28"/>
+          <w:rFonts w:ascii="Arial" w:hAnsi="Arial" w:cs="Arial"/>
           <w:u w:val="single"/>
           <w:lang w:val="es-ES"/>
         </w:rPr>
       </w:pPr>
       <w:r>
         <w:rPr>
-          <w:rFonts w:ascii="Times New Roman" w:hAnsi="Times New Roman" w:cs="Times New Roman"/>
-          <w:sz w:val="28"/>
-          <w:szCs w:val="28"/>
+          <w:rFonts w:ascii="Arial" w:hAnsi="Arial" w:cs="Arial"/>
           <w:u w:val="single"/>
           <w:lang w:val="es-ES"/>
         </w:rPr>
@@ -883,17 +972,7 @@
         <w:spacing w:line="276" w:lineRule="auto"/>
         <w:jc w:val="both"/>
         <w:rPr>
-          <w:rFonts w:ascii="Times New Roman" w:hAnsi="Times New Roman" w:cs="Times New Roman"/>
-          <w:lang w:val="es-ES"/>
-        </w:rPr>
-      </w:pPr>
-    </w:p>
-    <w:p>
-      <w:pPr>
-        <w:spacing w:line="276" w:lineRule="auto"/>
-        <w:jc w:val="both"/>
-        <w:rPr>
-          <w:rFonts w:ascii="Times New Roman" w:hAnsi="Times New Roman" w:cs="Times New Roman"/>
+          <w:rFonts w:ascii="Arial" w:hAnsi="Arial" w:cs="Arial"/>
           <w:lang w:val="es-ES"/>
         </w:rPr>
         <w:sectPr>
@@ -910,7 +989,7 @@
         <w:spacing w:line="276" w:lineRule="auto"/>
         <w:jc w:val="both"/>
         <w:rPr>
-          <w:rFonts w:ascii="Times New Roman" w:hAnsi="Times New Roman" w:cs="Times New Roman"/>
+          <w:rFonts w:ascii="Arial" w:hAnsi="Arial" w:cs="Arial"/>
           <w:b/>
           <w:bCs/>
           <w:highlight w:val="cyan"/>
@@ -920,7 +999,7 @@
       </w:pPr>
       <w:r>
         <w:rPr>
-          <w:rFonts w:ascii="Times New Roman" w:hAnsi="Times New Roman" w:cs="Times New Roman"/>
+          <w:rFonts w:ascii="Arial" w:hAnsi="Arial" w:cs="Arial"/>
           <w:b/>
           <w:bCs/>
           <w:highlight w:val="cyan"/>
@@ -935,14 +1014,14 @@
         <w:spacing w:line="276" w:lineRule="auto"/>
         <w:jc w:val="both"/>
         <w:rPr>
-          <w:rFonts w:ascii="Times New Roman" w:hAnsi="Times New Roman" w:cs="Times New Roman"/>
-          <w:highlight w:val="cyan"/>
-          <w:lang w:val="es-ES"/>
-        </w:rPr>
-      </w:pPr>
-      <w:r>
-        <w:rPr>
-          <w:rFonts w:ascii="Times New Roman" w:hAnsi="Times New Roman" w:cs="Times New Roman"/>
+          <w:rFonts w:ascii="Arial" w:hAnsi="Arial" w:cs="Arial"/>
+          <w:highlight w:val="cyan"/>
+          <w:lang w:val="es-ES"/>
+        </w:rPr>
+      </w:pPr>
+      <w:r>
+        <w:rPr>
+          <w:rFonts w:ascii="Arial" w:hAnsi="Arial" w:cs="Arial"/>
           <w:highlight w:val="cyan"/>
           <w:lang w:val="es-ES"/>
         </w:rPr>
@@ -950,7 +1029,7 @@
       </w:r>
       <w:r>
         <w:rPr>
-          <w:rFonts w:ascii="Times New Roman" w:hAnsi="Times New Roman" w:cs="Times New Roman"/>
+          <w:rFonts w:ascii="Arial" w:hAnsi="Arial" w:cs="Arial"/>
           <w:highlight w:val="cyan"/>
           <w:lang w:val="es-ES"/>
         </w:rPr>
@@ -958,7 +1037,7 @@
       </w:r>
       <w:r>
         <w:rPr>
-          <w:rFonts w:ascii="Times New Roman" w:hAnsi="Times New Roman" w:cs="Times New Roman"/>
+          <w:rFonts w:ascii="Arial" w:hAnsi="Arial" w:cs="Arial"/>
           <w:highlight w:val="cyan"/>
           <w:lang w:val="es-ES"/>
         </w:rPr>
@@ -970,14 +1049,14 @@
         <w:spacing w:line="276" w:lineRule="auto"/>
         <w:jc w:val="both"/>
         <w:rPr>
-          <w:rFonts w:ascii="Times New Roman" w:hAnsi="Times New Roman" w:cs="Times New Roman"/>
-          <w:highlight w:val="cyan"/>
-          <w:lang w:val="es-ES"/>
-        </w:rPr>
-      </w:pPr>
-      <w:r>
-        <w:rPr>
-          <w:rFonts w:ascii="Times New Roman" w:hAnsi="Times New Roman" w:cs="Times New Roman"/>
+          <w:rFonts w:ascii="Arial" w:hAnsi="Arial" w:cs="Arial"/>
+          <w:highlight w:val="cyan"/>
+          <w:lang w:val="es-ES"/>
+        </w:rPr>
+      </w:pPr>
+      <w:r>
+        <w:rPr>
+          <w:rFonts w:ascii="Arial" w:hAnsi="Arial" w:cs="Arial"/>
           <w:highlight w:val="cyan"/>
           <w:lang w:val="es-ES"/>
         </w:rPr>
@@ -985,7 +1064,7 @@
       </w:r>
       <w:r>
         <w:rPr>
-          <w:rFonts w:ascii="Times New Roman" w:hAnsi="Times New Roman" w:cs="Times New Roman"/>
+          <w:rFonts w:ascii="Arial" w:hAnsi="Arial" w:cs="Arial"/>
           <w:highlight w:val="cyan"/>
           <w:lang w:val="es-ES"/>
         </w:rPr>
@@ -993,7 +1072,7 @@
       </w:r>
       <w:r>
         <w:rPr>
-          <w:rFonts w:ascii="Times New Roman" w:hAnsi="Times New Roman" w:cs="Times New Roman"/>
+          <w:rFonts w:ascii="Arial" w:hAnsi="Arial" w:cs="Arial"/>
           <w:highlight w:val="cyan"/>
           <w:lang w:val="es-ES"/>
         </w:rPr>
@@ -1001,7 +1080,7 @@
       </w:r>
       <w:r>
         <w:rPr>
-          <w:rFonts w:ascii="Times New Roman" w:hAnsi="Times New Roman" w:cs="Times New Roman"/>
+          <w:rFonts w:ascii="Arial" w:hAnsi="Arial" w:cs="Arial"/>
           <w:highlight w:val="cyan"/>
           <w:lang w:val="es-ES"/>
         </w:rPr>
@@ -1009,7 +1088,7 @@
       </w:r>
       <w:r>
         <w:rPr>
-          <w:rFonts w:ascii="Times New Roman" w:hAnsi="Times New Roman" w:cs="Times New Roman"/>
+          <w:rFonts w:ascii="Arial" w:hAnsi="Arial" w:cs="Arial"/>
           <w:highlight w:val="cyan"/>
           <w:lang w:val="es-ES"/>
         </w:rPr>
@@ -1017,7 +1096,7 @@
       </w:r>
       <w:r>
         <w:rPr>
-          <w:rFonts w:ascii="Times New Roman" w:hAnsi="Times New Roman" w:cs="Times New Roman"/>
+          <w:rFonts w:ascii="Arial" w:hAnsi="Arial" w:cs="Arial"/>
           <w:highlight w:val="cyan"/>
           <w:lang w:val="es-ES"/>
         </w:rPr>
@@ -1029,14 +1108,14 @@
         <w:spacing w:line="276" w:lineRule="auto"/>
         <w:jc w:val="both"/>
         <w:rPr>
-          <w:rFonts w:ascii="Times New Roman" w:hAnsi="Times New Roman" w:cs="Times New Roman"/>
-          <w:highlight w:val="cyan"/>
-          <w:lang w:val="es-ES"/>
-        </w:rPr>
-      </w:pPr>
-      <w:r>
-        <w:rPr>
-          <w:rFonts w:ascii="Times New Roman" w:hAnsi="Times New Roman" w:cs="Times New Roman"/>
+          <w:rFonts w:ascii="Arial" w:hAnsi="Arial" w:cs="Arial"/>
+          <w:highlight w:val="cyan"/>
+          <w:lang w:val="es-ES"/>
+        </w:rPr>
+      </w:pPr>
+      <w:r>
+        <w:rPr>
+          <w:rFonts w:ascii="Arial" w:hAnsi="Arial" w:cs="Arial"/>
           <w:highlight w:val="cyan"/>
           <w:lang w:val="es-ES"/>
         </w:rPr>
@@ -1044,7 +1123,7 @@
       </w:r>
       <w:r>
         <w:rPr>
-          <w:rFonts w:ascii="Times New Roman" w:hAnsi="Times New Roman" w:cs="Times New Roman"/>
+          <w:rFonts w:ascii="Arial" w:hAnsi="Arial" w:cs="Arial"/>
           <w:highlight w:val="cyan"/>
           <w:lang w:val="es-ES"/>
         </w:rPr>
@@ -1056,14 +1135,14 @@
         <w:spacing w:line="276" w:lineRule="auto"/>
         <w:jc w:val="both"/>
         <w:rPr>
-          <w:rFonts w:ascii="Times New Roman" w:hAnsi="Times New Roman" w:cs="Times New Roman"/>
-          <w:highlight w:val="cyan"/>
-          <w:lang w:val="es-ES"/>
-        </w:rPr>
-      </w:pPr>
-      <w:r>
-        <w:rPr>
-          <w:rFonts w:ascii="Times New Roman" w:hAnsi="Times New Roman" w:cs="Times New Roman"/>
+          <w:rFonts w:ascii="Arial" w:hAnsi="Arial" w:cs="Arial"/>
+          <w:highlight w:val="cyan"/>
+          <w:lang w:val="es-ES"/>
+        </w:rPr>
+      </w:pPr>
+      <w:r>
+        <w:rPr>
+          <w:rFonts w:ascii="Arial" w:hAnsi="Arial" w:cs="Arial"/>
           <w:highlight w:val="cyan"/>
           <w:lang w:val="es-ES"/>
         </w:rPr>
@@ -1071,7 +1150,7 @@
       </w:r>
       <w:r>
         <w:rPr>
-          <w:rFonts w:ascii="Times New Roman" w:hAnsi="Times New Roman" w:cs="Times New Roman"/>
+          <w:rFonts w:ascii="Arial" w:hAnsi="Arial" w:cs="Arial"/>
           <w:highlight w:val="cyan"/>
           <w:lang w:val="es-ES"/>
         </w:rPr>
@@ -1079,7 +1158,7 @@
       </w:r>
       <w:r>
         <w:rPr>
-          <w:rFonts w:ascii="Times New Roman" w:hAnsi="Times New Roman" w:cs="Times New Roman"/>
+          <w:rFonts w:ascii="Arial" w:hAnsi="Arial" w:cs="Arial"/>
           <w:highlight w:val="cyan"/>
           <w:lang w:val="es-ES"/>
         </w:rPr>
@@ -1091,14 +1170,14 @@
         <w:spacing w:line="276" w:lineRule="auto"/>
         <w:jc w:val="both"/>
         <w:rPr>
-          <w:rFonts w:ascii="Times New Roman" w:hAnsi="Times New Roman" w:cs="Times New Roman"/>
-          <w:highlight w:val="cyan"/>
-          <w:lang w:val="es-ES"/>
-        </w:rPr>
-      </w:pPr>
-      <w:r>
-        <w:rPr>
-          <w:rFonts w:ascii="Times New Roman" w:hAnsi="Times New Roman" w:cs="Times New Roman"/>
+          <w:rFonts w:ascii="Arial" w:hAnsi="Arial" w:cs="Arial"/>
+          <w:highlight w:val="cyan"/>
+          <w:lang w:val="es-ES"/>
+        </w:rPr>
+      </w:pPr>
+      <w:r>
+        <w:rPr>
+          <w:rFonts w:ascii="Arial" w:hAnsi="Arial" w:cs="Arial"/>
           <w:highlight w:val="cyan"/>
           <w:lang w:val="es-ES"/>
         </w:rPr>
@@ -1106,7 +1185,7 @@
       </w:r>
       <w:r>
         <w:rPr>
-          <w:rFonts w:ascii="Times New Roman" w:hAnsi="Times New Roman" w:cs="Times New Roman"/>
+          <w:rFonts w:ascii="Arial" w:hAnsi="Arial" w:cs="Arial"/>
           <w:highlight w:val="cyan"/>
           <w:lang w:val="es-ES"/>
         </w:rPr>
@@ -1118,14 +1197,14 @@
         <w:spacing w:line="276" w:lineRule="auto"/>
         <w:jc w:val="both"/>
         <w:rPr>
-          <w:rFonts w:ascii="Times New Roman" w:hAnsi="Times New Roman" w:cs="Times New Roman"/>
-          <w:highlight w:val="cyan"/>
-          <w:lang w:val="es-ES"/>
-        </w:rPr>
-      </w:pPr>
-      <w:r>
-        <w:rPr>
-          <w:rFonts w:ascii="Times New Roman" w:hAnsi="Times New Roman" w:cs="Times New Roman"/>
+          <w:rFonts w:ascii="Arial" w:hAnsi="Arial" w:cs="Arial"/>
+          <w:highlight w:val="cyan"/>
+          <w:lang w:val="es-ES"/>
+        </w:rPr>
+      </w:pPr>
+      <w:r>
+        <w:rPr>
+          <w:rFonts w:ascii="Arial" w:hAnsi="Arial" w:cs="Arial"/>
           <w:highlight w:val="cyan"/>
           <w:lang w:val="es-ES"/>
         </w:rPr>
@@ -1137,14 +1216,14 @@
         <w:spacing w:line="276" w:lineRule="auto"/>
         <w:jc w:val="both"/>
         <w:rPr>
-          <w:rFonts w:ascii="Times New Roman" w:hAnsi="Times New Roman" w:cs="Times New Roman"/>
-          <w:highlight w:val="cyan"/>
-          <w:lang w:val="es-ES"/>
-        </w:rPr>
-      </w:pPr>
-      <w:r>
-        <w:rPr>
-          <w:rFonts w:ascii="Times New Roman" w:hAnsi="Times New Roman" w:cs="Times New Roman"/>
+          <w:rFonts w:ascii="Arial" w:hAnsi="Arial" w:cs="Arial"/>
+          <w:highlight w:val="cyan"/>
+          <w:lang w:val="es-ES"/>
+        </w:rPr>
+      </w:pPr>
+      <w:r>
+        <w:rPr>
+          <w:rFonts w:ascii="Arial" w:hAnsi="Arial" w:cs="Arial"/>
           <w:highlight w:val="cyan"/>
           <w:lang w:val="es-ES"/>
         </w:rPr>
@@ -1156,14 +1235,14 @@
         <w:spacing w:line="276" w:lineRule="auto"/>
         <w:jc w:val="both"/>
         <w:rPr>
-          <w:rFonts w:ascii="Times New Roman" w:hAnsi="Times New Roman" w:cs="Times New Roman"/>
-          <w:highlight w:val="cyan"/>
-          <w:lang w:val="es-ES"/>
-        </w:rPr>
-      </w:pPr>
-      <w:r>
-        <w:rPr>
-          <w:rFonts w:ascii="Times New Roman" w:hAnsi="Times New Roman" w:cs="Times New Roman"/>
+          <w:rFonts w:ascii="Arial" w:hAnsi="Arial" w:cs="Arial"/>
+          <w:highlight w:val="cyan"/>
+          <w:lang w:val="es-ES"/>
+        </w:rPr>
+      </w:pPr>
+      <w:r>
+        <w:rPr>
+          <w:rFonts w:ascii="Arial" w:hAnsi="Arial" w:cs="Arial"/>
           <w:highlight w:val="cyan"/>
           <w:lang w:val="es-ES"/>
         </w:rPr>
@@ -1175,14 +1254,14 @@
         <w:spacing w:line="276" w:lineRule="auto"/>
         <w:jc w:val="both"/>
         <w:rPr>
-          <w:rFonts w:ascii="Times New Roman" w:hAnsi="Times New Roman" w:cs="Times New Roman"/>
-          <w:highlight w:val="cyan"/>
-          <w:lang w:val="es-ES"/>
-        </w:rPr>
-      </w:pPr>
-      <w:r>
-        <w:rPr>
-          <w:rFonts w:ascii="Times New Roman" w:hAnsi="Times New Roman" w:cs="Times New Roman"/>
+          <w:rFonts w:ascii="Arial" w:hAnsi="Arial" w:cs="Arial"/>
+          <w:highlight w:val="cyan"/>
+          <w:lang w:val="es-ES"/>
+        </w:rPr>
+      </w:pPr>
+      <w:r>
+        <w:rPr>
+          <w:rFonts w:ascii="Arial" w:hAnsi="Arial" w:cs="Arial"/>
           <w:highlight w:val="cyan"/>
           <w:lang w:val="es-ES"/>
         </w:rPr>
@@ -1190,7 +1269,7 @@
       </w:r>
       <w:r>
         <w:rPr>
-          <w:rFonts w:ascii="Times New Roman" w:hAnsi="Times New Roman" w:cs="Times New Roman"/>
+          <w:rFonts w:ascii="Arial" w:hAnsi="Arial" w:cs="Arial"/>
           <w:highlight w:val="cyan"/>
           <w:lang w:val="es-ES"/>
         </w:rPr>
@@ -1198,7 +1277,7 @@
       </w:r>
       <w:r>
         <w:rPr>
-          <w:rFonts w:ascii="Times New Roman" w:hAnsi="Times New Roman" w:cs="Times New Roman"/>
+          <w:rFonts w:ascii="Arial" w:hAnsi="Arial" w:cs="Arial"/>
           <w:highlight w:val="cyan"/>
           <w:lang w:val="es-ES"/>
         </w:rPr>
@@ -1206,7 +1285,7 @@
       </w:r>
       <w:r>
         <w:rPr>
-          <w:rFonts w:ascii="Times New Roman" w:hAnsi="Times New Roman" w:cs="Times New Roman"/>
+          <w:rFonts w:ascii="Arial" w:hAnsi="Arial" w:cs="Arial"/>
           <w:highlight w:val="cyan"/>
           <w:lang w:val="es-ES"/>
         </w:rPr>
@@ -1214,7 +1293,7 @@
       </w:r>
       <w:r>
         <w:rPr>
-          <w:rFonts w:ascii="Times New Roman" w:hAnsi="Times New Roman" w:cs="Times New Roman"/>
+          <w:rFonts w:ascii="Arial" w:hAnsi="Arial" w:cs="Arial"/>
           <w:highlight w:val="cyan"/>
           <w:lang w:val="es-ES"/>
         </w:rPr>
@@ -1222,7 +1301,7 @@
       </w:r>
       <w:r>
         <w:rPr>
-          <w:rFonts w:ascii="Times New Roman" w:hAnsi="Times New Roman" w:cs="Times New Roman"/>
+          <w:rFonts w:ascii="Arial" w:hAnsi="Arial" w:cs="Arial"/>
           <w:highlight w:val="cyan"/>
           <w:lang w:val="es-ES"/>
         </w:rPr>
@@ -1234,22 +1313,23 @@
         <w:spacing w:line="276" w:lineRule="auto"/>
         <w:jc w:val="both"/>
         <w:rPr>
-          <w:rFonts w:ascii="Times New Roman" w:hAnsi="Times New Roman" w:cs="Times New Roman"/>
-          <w:highlight w:val="cyan"/>
-          <w:lang w:val="es-ES"/>
-        </w:rPr>
-      </w:pPr>
-      <w:r>
-        <w:rPr>
-          <w:rFonts w:ascii="Times New Roman" w:hAnsi="Times New Roman" w:cs="Times New Roman"/>
-          <w:highlight w:val="cyan"/>
-          <w:lang w:val="es-ES"/>
-        </w:rPr>
+          <w:rFonts w:ascii="Arial" w:hAnsi="Arial" w:cs="Arial"/>
+          <w:highlight w:val="cyan"/>
+          <w:lang w:val="es-ES"/>
+        </w:rPr>
+      </w:pPr>
+      <w:r>
+        <w:rPr>
+          <w:rFonts w:ascii="Arial" w:hAnsi="Arial" w:cs="Arial"/>
+          <w:highlight w:val="cyan"/>
+          <w:lang w:val="es-ES"/>
+        </w:rPr>
+        <w:lastRenderedPageBreak/>
         <w:t>10</w:t>
       </w:r>
       <w:r>
         <w:rPr>
-          <w:rFonts w:ascii="Times New Roman" w:hAnsi="Times New Roman" w:cs="Times New Roman"/>
+          <w:rFonts w:ascii="Arial" w:hAnsi="Arial" w:cs="Arial"/>
           <w:highlight w:val="cyan"/>
           <w:lang w:val="es-ES"/>
         </w:rPr>
@@ -1257,7 +1337,7 @@
       </w:r>
       <w:r>
         <w:rPr>
-          <w:rFonts w:ascii="Times New Roman" w:hAnsi="Times New Roman" w:cs="Times New Roman"/>
+          <w:rFonts w:ascii="Arial" w:hAnsi="Arial" w:cs="Arial"/>
           <w:highlight w:val="cyan"/>
           <w:lang w:val="es-ES"/>
         </w:rPr>
@@ -1265,7 +1345,7 @@
       </w:r>
       <w:r>
         <w:rPr>
-          <w:rFonts w:ascii="Times New Roman" w:hAnsi="Times New Roman" w:cs="Times New Roman"/>
+          <w:rFonts w:ascii="Arial" w:hAnsi="Arial" w:cs="Arial"/>
           <w:highlight w:val="cyan"/>
           <w:lang w:val="es-ES"/>
         </w:rPr>
@@ -1273,7 +1353,7 @@
       </w:r>
       <w:r>
         <w:rPr>
-          <w:rFonts w:ascii="Times New Roman" w:hAnsi="Times New Roman" w:cs="Times New Roman"/>
+          <w:rFonts w:ascii="Arial" w:hAnsi="Arial" w:cs="Arial"/>
           <w:highlight w:val="cyan"/>
           <w:lang w:val="es-ES"/>
         </w:rPr>
@@ -1281,7 +1361,7 @@
       </w:r>
       <w:r>
         <w:rPr>
-          <w:rFonts w:ascii="Times New Roman" w:hAnsi="Times New Roman" w:cs="Times New Roman"/>
+          <w:rFonts w:ascii="Arial" w:hAnsi="Arial" w:cs="Arial"/>
           <w:highlight w:val="cyan"/>
           <w:lang w:val="es-ES"/>
         </w:rPr>
@@ -1289,7 +1369,7 @@
       </w:r>
       <w:r>
         <w:rPr>
-          <w:rFonts w:ascii="Times New Roman" w:hAnsi="Times New Roman" w:cs="Times New Roman"/>
+          <w:rFonts w:ascii="Arial" w:hAnsi="Arial" w:cs="Arial"/>
           <w:highlight w:val="cyan"/>
           <w:lang w:val="es-ES"/>
         </w:rPr>
@@ -1301,14 +1381,14 @@
         <w:spacing w:line="276" w:lineRule="auto"/>
         <w:jc w:val="both"/>
         <w:rPr>
-          <w:rFonts w:ascii="Times New Roman" w:hAnsi="Times New Roman" w:cs="Times New Roman"/>
-          <w:highlight w:val="cyan"/>
-          <w:lang w:val="es-ES"/>
-        </w:rPr>
-      </w:pPr>
-      <w:r>
-        <w:rPr>
-          <w:rFonts w:ascii="Times New Roman" w:hAnsi="Times New Roman" w:cs="Times New Roman"/>
+          <w:rFonts w:ascii="Arial" w:hAnsi="Arial" w:cs="Arial"/>
+          <w:highlight w:val="cyan"/>
+          <w:lang w:val="es-ES"/>
+        </w:rPr>
+      </w:pPr>
+      <w:r>
+        <w:rPr>
+          <w:rFonts w:ascii="Arial" w:hAnsi="Arial" w:cs="Arial"/>
           <w:highlight w:val="cyan"/>
           <w:lang w:val="es-ES"/>
         </w:rPr>
@@ -1316,7 +1396,7 @@
       </w:r>
       <w:r>
         <w:rPr>
-          <w:rFonts w:ascii="Times New Roman" w:hAnsi="Times New Roman" w:cs="Times New Roman"/>
+          <w:rFonts w:ascii="Arial" w:hAnsi="Arial" w:cs="Arial"/>
           <w:highlight w:val="cyan"/>
           <w:lang w:val="es-ES"/>
         </w:rPr>
@@ -1324,7 +1404,7 @@
       </w:r>
       <w:r>
         <w:rPr>
-          <w:rFonts w:ascii="Times New Roman" w:hAnsi="Times New Roman" w:cs="Times New Roman"/>
+          <w:rFonts w:ascii="Arial" w:hAnsi="Arial" w:cs="Arial"/>
           <w:highlight w:val="cyan"/>
           <w:lang w:val="es-ES"/>
         </w:rPr>
@@ -1332,7 +1412,7 @@
       </w:r>
       <w:r>
         <w:rPr>
-          <w:rFonts w:ascii="Times New Roman" w:hAnsi="Times New Roman" w:cs="Times New Roman"/>
+          <w:rFonts w:ascii="Arial" w:hAnsi="Arial" w:cs="Arial"/>
           <w:highlight w:val="cyan"/>
           <w:lang w:val="es-ES"/>
         </w:rPr>
@@ -1340,7 +1420,7 @@
       </w:r>
       <w:r>
         <w:rPr>
-          <w:rFonts w:ascii="Times New Roman" w:hAnsi="Times New Roman" w:cs="Times New Roman"/>
+          <w:rFonts w:ascii="Arial" w:hAnsi="Arial" w:cs="Arial"/>
           <w:highlight w:val="cyan"/>
           <w:lang w:val="es-ES"/>
         </w:rPr>
@@ -1348,7 +1428,7 @@
       </w:r>
       <w:r>
         <w:rPr>
-          <w:rFonts w:ascii="Times New Roman" w:hAnsi="Times New Roman" w:cs="Times New Roman"/>
+          <w:rFonts w:ascii="Arial" w:hAnsi="Arial" w:cs="Arial"/>
           <w:highlight w:val="cyan"/>
           <w:lang w:val="es-ES"/>
         </w:rPr>
@@ -1360,14 +1440,14 @@
         <w:spacing w:line="276" w:lineRule="auto"/>
         <w:jc w:val="both"/>
         <w:rPr>
-          <w:rFonts w:ascii="Times New Roman" w:hAnsi="Times New Roman" w:cs="Times New Roman"/>
-          <w:highlight w:val="cyan"/>
-          <w:lang w:val="es-ES"/>
-        </w:rPr>
-      </w:pPr>
-      <w:r>
-        <w:rPr>
-          <w:rFonts w:ascii="Times New Roman" w:hAnsi="Times New Roman" w:cs="Times New Roman"/>
+          <w:rFonts w:ascii="Arial" w:hAnsi="Arial" w:cs="Arial"/>
+          <w:highlight w:val="cyan"/>
+          <w:lang w:val="es-ES"/>
+        </w:rPr>
+      </w:pPr>
+      <w:r>
+        <w:rPr>
+          <w:rFonts w:ascii="Arial" w:hAnsi="Arial" w:cs="Arial"/>
           <w:highlight w:val="cyan"/>
           <w:lang w:val="es-ES"/>
         </w:rPr>
@@ -1375,7 +1455,7 @@
       </w:r>
       <w:r>
         <w:rPr>
-          <w:rFonts w:ascii="Times New Roman" w:hAnsi="Times New Roman" w:cs="Times New Roman"/>
+          <w:rFonts w:ascii="Arial" w:hAnsi="Arial" w:cs="Arial"/>
           <w:highlight w:val="cyan"/>
           <w:lang w:val="es-ES"/>
         </w:rPr>
@@ -1383,7 +1463,7 @@
       </w:r>
       <w:r>
         <w:rPr>
-          <w:rFonts w:ascii="Times New Roman" w:hAnsi="Times New Roman" w:cs="Times New Roman"/>
+          <w:rFonts w:ascii="Arial" w:hAnsi="Arial" w:cs="Arial"/>
           <w:highlight w:val="cyan"/>
           <w:lang w:val="es-ES"/>
         </w:rPr>
@@ -1391,7 +1471,7 @@
       </w:r>
       <w:r>
         <w:rPr>
-          <w:rFonts w:ascii="Times New Roman" w:hAnsi="Times New Roman" w:cs="Times New Roman"/>
+          <w:rFonts w:ascii="Arial" w:hAnsi="Arial" w:cs="Arial"/>
           <w:highlight w:val="cyan"/>
           <w:lang w:val="es-ES"/>
         </w:rPr>
@@ -1399,7 +1479,7 @@
       </w:r>
       <w:r>
         <w:rPr>
-          <w:rFonts w:ascii="Times New Roman" w:hAnsi="Times New Roman" w:cs="Times New Roman"/>
+          <w:rFonts w:ascii="Arial" w:hAnsi="Arial" w:cs="Arial"/>
           <w:highlight w:val="cyan"/>
           <w:lang w:val="es-ES"/>
         </w:rPr>
@@ -1407,7 +1487,7 @@
       </w:r>
       <w:r>
         <w:rPr>
-          <w:rFonts w:ascii="Times New Roman" w:hAnsi="Times New Roman" w:cs="Times New Roman"/>
+          <w:rFonts w:ascii="Arial" w:hAnsi="Arial" w:cs="Arial"/>
           <w:highlight w:val="cyan"/>
           <w:lang w:val="es-ES"/>
         </w:rPr>
@@ -1415,7 +1495,7 @@
       </w:r>
       <w:r>
         <w:rPr>
-          <w:rFonts w:ascii="Times New Roman" w:hAnsi="Times New Roman" w:cs="Times New Roman"/>
+          <w:rFonts w:ascii="Arial" w:hAnsi="Arial" w:cs="Arial"/>
           <w:highlight w:val="cyan"/>
           <w:lang w:val="es-ES"/>
         </w:rPr>
@@ -1423,7 +1503,7 @@
       </w:r>
       <w:r>
         <w:rPr>
-          <w:rFonts w:ascii="Times New Roman" w:hAnsi="Times New Roman" w:cs="Times New Roman"/>
+          <w:rFonts w:ascii="Arial" w:hAnsi="Arial" w:cs="Arial"/>
           <w:highlight w:val="cyan"/>
           <w:lang w:val="es-ES"/>
         </w:rPr>
@@ -1431,7 +1511,7 @@
       </w:r>
       <w:r>
         <w:rPr>
-          <w:rFonts w:ascii="Times New Roman" w:hAnsi="Times New Roman" w:cs="Times New Roman"/>
+          <w:rFonts w:ascii="Arial" w:hAnsi="Arial" w:cs="Arial"/>
           <w:lang w:val="es-ES"/>
         </w:rPr>
         <w:t xml:space="preserve"> (un Lote)</w:t>
@@ -1442,13 +1522,13 @@
         <w:spacing w:line="276" w:lineRule="auto"/>
         <w:jc w:val="both"/>
         <w:rPr>
-          <w:rFonts w:ascii="Times New Roman" w:hAnsi="Times New Roman" w:cs="Times New Roman"/>
-          <w:lang w:val="es-ES"/>
-        </w:rPr>
-      </w:pPr>
-      <w:r>
-        <w:rPr>
-          <w:rFonts w:ascii="Times New Roman" w:hAnsi="Times New Roman" w:cs="Times New Roman"/>
+          <w:rFonts w:ascii="Arial" w:hAnsi="Arial" w:cs="Arial"/>
+          <w:lang w:val="es-ES"/>
+        </w:rPr>
+      </w:pPr>
+      <w:r>
+        <w:rPr>
+          <w:rFonts w:ascii="Arial" w:hAnsi="Arial" w:cs="Arial"/>
           <w:highlight w:val="cyan"/>
           <w:lang w:val="es-ES"/>
         </w:rPr>
@@ -1456,7 +1536,7 @@
       </w:r>
       <w:r>
         <w:rPr>
-          <w:rFonts w:ascii="Times New Roman" w:hAnsi="Times New Roman" w:cs="Times New Roman"/>
+          <w:rFonts w:ascii="Arial" w:hAnsi="Arial" w:cs="Arial"/>
           <w:highlight w:val="cyan"/>
           <w:lang w:val="es-ES"/>
         </w:rPr>
@@ -1464,7 +1544,7 @@
       </w:r>
       <w:r>
         <w:rPr>
-          <w:rFonts w:ascii="Times New Roman" w:hAnsi="Times New Roman" w:cs="Times New Roman"/>
+          <w:rFonts w:ascii="Arial" w:hAnsi="Arial" w:cs="Arial"/>
           <w:highlight w:val="cyan"/>
           <w:lang w:val="es-ES"/>
         </w:rPr>
@@ -1472,7 +1552,7 @@
       </w:r>
       <w:r>
         <w:rPr>
-          <w:rFonts w:ascii="Times New Roman" w:hAnsi="Times New Roman" w:cs="Times New Roman"/>
+          <w:rFonts w:ascii="Arial" w:hAnsi="Arial" w:cs="Arial"/>
           <w:highlight w:val="cyan"/>
           <w:lang w:val="es-ES"/>
         </w:rPr>
@@ -1480,7 +1560,7 @@
       </w:r>
       <w:r>
         <w:rPr>
-          <w:rFonts w:ascii="Times New Roman" w:hAnsi="Times New Roman" w:cs="Times New Roman"/>
+          <w:rFonts w:ascii="Arial" w:hAnsi="Arial" w:cs="Arial"/>
           <w:highlight w:val="cyan"/>
           <w:lang w:val="es-ES"/>
         </w:rPr>
@@ -1488,7 +1568,7 @@
       </w:r>
       <w:r>
         <w:rPr>
-          <w:rFonts w:ascii="Times New Roman" w:hAnsi="Times New Roman" w:cs="Times New Roman"/>
+          <w:rFonts w:ascii="Arial" w:hAnsi="Arial" w:cs="Arial"/>
           <w:highlight w:val="cyan"/>
           <w:lang w:val="es-ES"/>
         </w:rPr>
@@ -1496,7 +1576,7 @@
       </w:r>
       <w:r>
         <w:rPr>
-          <w:rFonts w:ascii="Times New Roman" w:hAnsi="Times New Roman" w:cs="Times New Roman"/>
+          <w:rFonts w:ascii="Arial" w:hAnsi="Arial" w:cs="Arial"/>
           <w:highlight w:val="cyan"/>
           <w:lang w:val="es-ES"/>
         </w:rPr>
@@ -1504,7 +1584,7 @@
       </w:r>
       <w:r>
         <w:rPr>
-          <w:rFonts w:ascii="Times New Roman" w:hAnsi="Times New Roman" w:cs="Times New Roman"/>
+          <w:rFonts w:ascii="Arial" w:hAnsi="Arial" w:cs="Arial"/>
           <w:highlight w:val="cyan"/>
           <w:lang w:val="es-ES"/>
         </w:rPr>
@@ -1512,7 +1592,7 @@
       </w:r>
       <w:r>
         <w:rPr>
-          <w:rFonts w:ascii="Times New Roman" w:hAnsi="Times New Roman" w:cs="Times New Roman"/>
+          <w:rFonts w:ascii="Arial" w:hAnsi="Arial" w:cs="Arial"/>
           <w:lang w:val="es-ES"/>
         </w:rPr>
         <w:t xml:space="preserve"> </w:t>
@@ -1523,7 +1603,7 @@
         <w:spacing w:line="276" w:lineRule="auto"/>
         <w:jc w:val="both"/>
         <w:rPr>
-          <w:rFonts w:ascii="Times New Roman" w:hAnsi="Times New Roman" w:cs="Times New Roman"/>
+          <w:rFonts w:ascii="Arial" w:hAnsi="Arial" w:cs="Arial"/>
           <w:b/>
           <w:bCs/>
           <w:u w:val="single"/>
@@ -1532,7 +1612,7 @@
       </w:pPr>
       <w:r>
         <w:rPr>
-          <w:rFonts w:ascii="Times New Roman" w:hAnsi="Times New Roman" w:cs="Times New Roman"/>
+          <w:rFonts w:ascii="Arial" w:hAnsi="Arial" w:cs="Arial"/>
           <w:b/>
           <w:bCs/>
           <w:highlight w:val="cyan"/>
@@ -1543,7 +1623,7 @@
       </w:r>
       <w:r>
         <w:rPr>
-          <w:rFonts w:ascii="Times New Roman" w:hAnsi="Times New Roman" w:cs="Times New Roman"/>
+          <w:rFonts w:ascii="Arial" w:hAnsi="Arial" w:cs="Arial"/>
           <w:b/>
           <w:bCs/>
           <w:u w:val="single"/>
@@ -1553,7 +1633,7 @@
       </w:r>
       <w:r>
         <w:rPr>
-          <w:rFonts w:ascii="Times New Roman" w:hAnsi="Times New Roman" w:cs="Times New Roman"/>
+          <w:rFonts w:ascii="Arial" w:hAnsi="Arial" w:cs="Arial"/>
           <w:b/>
           <w:bCs/>
           <w:highlight w:val="magenta"/>
@@ -1568,14 +1648,14 @@
         <w:spacing w:line="276" w:lineRule="auto"/>
         <w:jc w:val="both"/>
         <w:rPr>
-          <w:rFonts w:ascii="Times New Roman" w:hAnsi="Times New Roman" w:cs="Times New Roman"/>
+          <w:rFonts w:ascii="Arial" w:hAnsi="Arial" w:cs="Arial"/>
           <w:highlight w:val="magenta"/>
           <w:lang w:val="es-ES"/>
         </w:rPr>
       </w:pPr>
       <w:r>
         <w:rPr>
-          <w:rFonts w:ascii="Times New Roman" w:hAnsi="Times New Roman" w:cs="Times New Roman"/>
+          <w:rFonts w:ascii="Arial" w:hAnsi="Arial" w:cs="Arial"/>
           <w:highlight w:val="magenta"/>
           <w:lang w:val="es-ES"/>
         </w:rPr>
@@ -1583,7 +1663,7 @@
       </w:r>
       <w:r>
         <w:rPr>
-          <w:rFonts w:ascii="Times New Roman" w:hAnsi="Times New Roman" w:cs="Times New Roman"/>
+          <w:rFonts w:ascii="Arial" w:hAnsi="Arial" w:cs="Arial"/>
           <w:highlight w:val="magenta"/>
           <w:lang w:val="es-ES"/>
         </w:rPr>
@@ -1595,23 +1675,22 @@
         <w:spacing w:line="276" w:lineRule="auto"/>
         <w:jc w:val="both"/>
         <w:rPr>
-          <w:rFonts w:ascii="Times New Roman" w:hAnsi="Times New Roman" w:cs="Times New Roman"/>
+          <w:rFonts w:ascii="Arial" w:hAnsi="Arial" w:cs="Arial"/>
           <w:highlight w:val="magenta"/>
           <w:lang w:val="es-ES"/>
         </w:rPr>
       </w:pPr>
       <w:r>
         <w:rPr>
-          <w:rFonts w:ascii="Times New Roman" w:hAnsi="Times New Roman" w:cs="Times New Roman"/>
+          <w:rFonts w:ascii="Arial" w:hAnsi="Arial" w:cs="Arial"/>
           <w:highlight w:val="magenta"/>
           <w:lang w:val="es-ES"/>
         </w:rPr>
-        <w:lastRenderedPageBreak/>
         <w:t>$</w:t>
       </w:r>
       <w:r>
         <w:rPr>
-          <w:rFonts w:ascii="Times New Roman" w:hAnsi="Times New Roman" w:cs="Times New Roman"/>
+          <w:rFonts w:ascii="Arial" w:hAnsi="Arial" w:cs="Arial"/>
           <w:highlight w:val="magenta"/>
           <w:lang w:val="es-ES"/>
         </w:rPr>
@@ -1623,14 +1702,14 @@
         <w:spacing w:line="276" w:lineRule="auto"/>
         <w:jc w:val="both"/>
         <w:rPr>
-          <w:rFonts w:ascii="Times New Roman" w:hAnsi="Times New Roman" w:cs="Times New Roman"/>
+          <w:rFonts w:ascii="Arial" w:hAnsi="Arial" w:cs="Arial"/>
           <w:highlight w:val="magenta"/>
           <w:lang w:val="es-ES"/>
         </w:rPr>
       </w:pPr>
       <w:r>
         <w:rPr>
-          <w:rFonts w:ascii="Times New Roman" w:hAnsi="Times New Roman" w:cs="Times New Roman"/>
+          <w:rFonts w:ascii="Arial" w:hAnsi="Arial" w:cs="Arial"/>
           <w:highlight w:val="magenta"/>
           <w:lang w:val="es-ES"/>
         </w:rPr>
@@ -1638,7 +1717,7 @@
       </w:r>
       <w:r>
         <w:rPr>
-          <w:rFonts w:ascii="Times New Roman" w:hAnsi="Times New Roman" w:cs="Times New Roman"/>
+          <w:rFonts w:ascii="Arial" w:hAnsi="Arial" w:cs="Arial"/>
           <w:highlight w:val="magenta"/>
           <w:lang w:val="es-ES"/>
         </w:rPr>
@@ -1650,14 +1729,14 @@
         <w:spacing w:line="276" w:lineRule="auto"/>
         <w:jc w:val="both"/>
         <w:rPr>
-          <w:rFonts w:ascii="Times New Roman" w:hAnsi="Times New Roman" w:cs="Times New Roman"/>
+          <w:rFonts w:ascii="Arial" w:hAnsi="Arial" w:cs="Arial"/>
           <w:highlight w:val="magenta"/>
           <w:lang w:val="es-ES"/>
         </w:rPr>
       </w:pPr>
       <w:r>
         <w:rPr>
-          <w:rFonts w:ascii="Times New Roman" w:hAnsi="Times New Roman" w:cs="Times New Roman"/>
+          <w:rFonts w:ascii="Arial" w:hAnsi="Arial" w:cs="Arial"/>
           <w:highlight w:val="magenta"/>
           <w:lang w:val="es-ES"/>
         </w:rPr>
@@ -1665,7 +1744,7 @@
       </w:r>
       <w:r>
         <w:rPr>
-          <w:rFonts w:ascii="Times New Roman" w:hAnsi="Times New Roman" w:cs="Times New Roman"/>
+          <w:rFonts w:ascii="Arial" w:hAnsi="Arial" w:cs="Arial"/>
           <w:highlight w:val="magenta"/>
           <w:lang w:val="es-ES"/>
         </w:rPr>
@@ -1677,7 +1756,7 @@
         <w:spacing w:line="276" w:lineRule="auto"/>
         <w:jc w:val="both"/>
         <w:rPr>
-          <w:rFonts w:ascii="Times New Roman" w:hAnsi="Times New Roman" w:cs="Times New Roman"/>
+          <w:rFonts w:ascii="Arial" w:hAnsi="Arial" w:cs="Arial"/>
           <w:highlight w:val="magenta"/>
           <w:lang w:val="es-ES"/>
         </w:rPr>
@@ -1691,7 +1770,7 @@
       </w:pPr>
       <w:r>
         <w:rPr>
-          <w:rFonts w:ascii="Times New Roman" w:hAnsi="Times New Roman" w:cs="Times New Roman"/>
+          <w:rFonts w:ascii="Arial" w:hAnsi="Arial" w:cs="Arial"/>
           <w:highlight w:val="magenta"/>
           <w:lang w:val="es-ES"/>
         </w:rPr>
@@ -1699,7 +1778,7 @@
       </w:r>
       <w:r>
         <w:rPr>
-          <w:rFonts w:ascii="Times New Roman" w:hAnsi="Times New Roman" w:cs="Times New Roman"/>
+          <w:rFonts w:ascii="Arial" w:hAnsi="Arial" w:cs="Arial"/>
           <w:highlight w:val="magenta"/>
           <w:lang w:val="es-ES"/>
         </w:rPr>
@@ -1707,7 +1786,7 @@
       </w:r>
       <w:r>
         <w:rPr>
-          <w:rFonts w:ascii="Times New Roman" w:hAnsi="Times New Roman" w:cs="Times New Roman"/>
+          <w:rFonts w:ascii="Arial" w:hAnsi="Arial" w:cs="Arial"/>
           <w:highlight w:val="magenta"/>
           <w:lang w:val="es-ES"/>
         </w:rPr>
@@ -1715,7 +1794,7 @@
       </w:r>
       <w:r>
         <w:rPr>
-          <w:rFonts w:ascii="Times New Roman" w:hAnsi="Times New Roman" w:cs="Times New Roman"/>
+          <w:rFonts w:ascii="Arial" w:hAnsi="Arial" w:cs="Arial"/>
           <w:highlight w:val="magenta"/>
           <w:lang w:val="es-ES"/>
         </w:rPr>
@@ -1727,14 +1806,14 @@
         <w:spacing w:line="276" w:lineRule="auto"/>
         <w:jc w:val="both"/>
         <w:rPr>
-          <w:rFonts w:ascii="Times New Roman" w:hAnsi="Times New Roman" w:cs="Times New Roman"/>
+          <w:rFonts w:ascii="Arial" w:hAnsi="Arial" w:cs="Arial"/>
           <w:highlight w:val="yellow"/>
           <w:lang w:val="es-ES"/>
         </w:rPr>
       </w:pPr>
       <w:r>
         <w:rPr>
-          <w:rFonts w:ascii="Times New Roman" w:hAnsi="Times New Roman" w:cs="Times New Roman"/>
+          <w:rFonts w:ascii="Arial" w:hAnsi="Arial" w:cs="Arial"/>
           <w:highlight w:val="yellow"/>
           <w:lang w:val="es-ES"/>
         </w:rPr>
@@ -1746,30 +1825,30 @@
         <w:spacing w:line="276" w:lineRule="auto"/>
         <w:jc w:val="both"/>
         <w:rPr>
-          <w:rFonts w:ascii="Times New Roman" w:hAnsi="Times New Roman" w:cs="Times New Roman"/>
+          <w:rFonts w:ascii="Arial" w:hAnsi="Arial" w:cs="Arial"/>
           <w:highlight w:val="yellow"/>
           <w:lang w:val="es-ES"/>
         </w:rPr>
       </w:pPr>
       <w:r>
         <w:rPr>
-          <w:rFonts w:ascii="Times New Roman" w:hAnsi="Times New Roman" w:cs="Times New Roman"/>
+          <w:rFonts w:ascii="Arial" w:hAnsi="Arial" w:cs="Arial"/>
           <w:highlight w:val="yellow"/>
           <w:lang w:val="es-ES"/>
         </w:rPr>
-        <w:t>$9,</w:t>
-      </w:r>
-      <w:r>
-        <w:rPr>
-          <w:rFonts w:ascii="Times New Roman" w:hAnsi="Times New Roman" w:cs="Times New Roman"/>
+        <w:t>$</w:t>
+      </w:r>
+      <w:r>
+        <w:rPr>
+          <w:rFonts w:ascii="Arial" w:hAnsi="Arial" w:cs="Arial"/>
           <w:highlight w:val="yellow"/>
           <w:lang w:val="es-ES"/>
         </w:rPr>
-        <w:t>7667</w:t>
-      </w:r>
-      <w:r>
-        <w:rPr>
-          <w:rFonts w:ascii="Times New Roman" w:hAnsi="Times New Roman" w:cs="Times New Roman"/>
+        <w:t>10,63</w:t>
+      </w:r>
+      <w:r>
+        <w:rPr>
+          <w:rFonts w:ascii="Arial" w:hAnsi="Arial" w:cs="Arial"/>
           <w:highlight w:val="yellow"/>
           <w:lang w:val="es-ES"/>
         </w:rPr>
@@ -1781,61 +1860,69 @@
         <w:spacing w:line="276" w:lineRule="auto"/>
         <w:jc w:val="both"/>
         <w:rPr>
-          <w:rFonts w:ascii="Times New Roman" w:hAnsi="Times New Roman" w:cs="Times New Roman"/>
+          <w:rFonts w:ascii="Arial" w:hAnsi="Arial" w:cs="Arial"/>
           <w:highlight w:val="yellow"/>
           <w:lang w:val="es-ES"/>
         </w:rPr>
       </w:pPr>
       <w:r>
         <w:rPr>
-          <w:rFonts w:ascii="Times New Roman" w:hAnsi="Times New Roman" w:cs="Times New Roman"/>
+          <w:rFonts w:ascii="Arial" w:hAnsi="Arial" w:cs="Arial"/>
           <w:highlight w:val="yellow"/>
           <w:lang w:val="es-ES"/>
         </w:rPr>
-        <w:t>10u $9</w:t>
-      </w:r>
-      <w:r>
-        <w:rPr>
-          <w:rFonts w:ascii="Times New Roman" w:hAnsi="Times New Roman" w:cs="Times New Roman"/>
+        <w:t>10u $</w:t>
+      </w:r>
+      <w:r>
+        <w:rPr>
+          <w:rFonts w:ascii="Arial" w:hAnsi="Arial" w:cs="Arial"/>
           <w:highlight w:val="yellow"/>
           <w:lang w:val="es-ES"/>
         </w:rPr>
-        <w:t>7,667</w:t>
-      </w:r>
-    </w:p>
-    <w:p>
-      <w:pPr>
-        <w:spacing w:line="276" w:lineRule="auto"/>
-        <w:jc w:val="both"/>
-        <w:rPr>
-          <w:rFonts w:ascii="Times New Roman" w:hAnsi="Times New Roman" w:cs="Times New Roman"/>
+        <w:t>106,37</w:t>
+      </w:r>
+    </w:p>
+    <w:p>
+      <w:pPr>
+        <w:spacing w:line="276" w:lineRule="auto"/>
+        <w:jc w:val="both"/>
+        <w:rPr>
+          <w:rFonts w:ascii="Arial" w:hAnsi="Arial" w:cs="Arial"/>
           <w:highlight w:val="yellow"/>
           <w:lang w:val="es-ES"/>
         </w:rPr>
       </w:pPr>
       <w:r>
         <w:rPr>
-          <w:rFonts w:ascii="Times New Roman" w:hAnsi="Times New Roman" w:cs="Times New Roman"/>
+          <w:rFonts w:ascii="Arial" w:hAnsi="Arial" w:cs="Arial"/>
           <w:highlight w:val="yellow"/>
           <w:lang w:val="es-ES"/>
         </w:rPr>
-        <w:t>100u $9</w:t>
-      </w:r>
-      <w:r>
-        <w:rPr>
-          <w:rFonts w:ascii="Times New Roman" w:hAnsi="Times New Roman" w:cs="Times New Roman"/>
+        <w:t>100u $</w:t>
+      </w:r>
+      <w:r>
+        <w:rPr>
+          <w:rFonts w:ascii="Arial" w:hAnsi="Arial" w:cs="Arial"/>
           <w:highlight w:val="yellow"/>
           <w:lang w:val="es-ES"/>
         </w:rPr>
-        <w:t>76,67</w:t>
-      </w:r>
-    </w:p>
-    <w:p>
-      <w:pPr>
-        <w:spacing w:line="276" w:lineRule="auto"/>
-        <w:jc w:val="both"/>
-        <w:rPr>
-          <w:rFonts w:ascii="Times New Roman" w:hAnsi="Times New Roman" w:cs="Times New Roman"/>
+        <w:t>1</w:t>
+      </w:r>
+      <w:r>
+        <w:rPr>
+          <w:rFonts w:ascii="Arial" w:hAnsi="Arial" w:cs="Arial"/>
+          <w:highlight w:val="yellow"/>
+          <w:lang w:val="es-ES"/>
+        </w:rPr>
+        <w:t>.063,7</w:t>
+      </w:r>
+    </w:p>
+    <w:p>
+      <w:pPr>
+        <w:spacing w:line="276" w:lineRule="auto"/>
+        <w:jc w:val="both"/>
+        <w:rPr>
+          <w:rFonts w:ascii="Arial" w:hAnsi="Arial" w:cs="Arial"/>
           <w:lang w:val="es-ES"/>
         </w:rPr>
         <w:sectPr>
@@ -1848,32 +1935,39 @@
       </w:pPr>
       <w:r>
         <w:rPr>
-          <w:rFonts w:ascii="Times New Roman" w:hAnsi="Times New Roman" w:cs="Times New Roman"/>
+          <w:rFonts w:ascii="Arial" w:hAnsi="Arial" w:cs="Arial"/>
           <w:highlight w:val="yellow"/>
           <w:lang w:val="es-ES"/>
         </w:rPr>
-        <w:t>1000u $9</w:t>
-      </w:r>
-      <w:r>
-        <w:rPr>
-          <w:rFonts w:ascii="Times New Roman" w:hAnsi="Times New Roman" w:cs="Times New Roman"/>
+        <w:t>1000u $</w:t>
+      </w:r>
+      <w:r>
+        <w:rPr>
+          <w:rFonts w:ascii="Arial" w:hAnsi="Arial" w:cs="Arial"/>
           <w:highlight w:val="yellow"/>
           <w:lang w:val="es-ES"/>
         </w:rPr>
-        <w:t>766,7</w:t>
-      </w:r>
-      <w:r>
-        <w:rPr>
-          <w:rFonts w:ascii="Times New Roman" w:hAnsi="Times New Roman" w:cs="Times New Roman"/>
-          <w:lang w:val="es-ES"/>
-        </w:rPr>
-        <w:t xml:space="preserve"> (un Lote)</w:t>
+        <w:t>10.637</w:t>
+      </w:r>
+      <w:r>
+        <w:rPr>
+          <w:rFonts w:ascii="Arial" w:hAnsi="Arial" w:cs="Arial"/>
+          <w:lang w:val="es-ES"/>
+        </w:rPr>
+        <w:t xml:space="preserve"> (un Lote</w:t>
+      </w:r>
+      <w:r>
+        <w:rPr>
+          <w:rFonts w:ascii="Arial" w:hAnsi="Arial" w:cs="Arial"/>
+          <w:lang w:val="es-ES"/>
+        </w:rPr>
+        <w:t>)</w:t>
       </w:r>
     </w:p>
     <w:tbl>
       <w:tblPr>
         <w:tblStyle w:val="Tablaconcuadrcula"/>
-        <w:tblpPr w:leftFromText="141" w:rightFromText="141" w:vertAnchor="page" w:horzAnchor="page" w:tblpX="2701" w:tblpY="12481"/>
+        <w:tblpPr w:leftFromText="141" w:rightFromText="141" w:vertAnchor="page" w:horzAnchor="margin" w:tblpXSpec="center" w:tblpY="5491"/>
         <w:tblW w:w="5240" w:type="dxa"/>
         <w:tblLook w:val="04A0" w:firstRow="1" w:lastRow="0" w:firstColumn="1" w:lastColumn="0" w:noHBand="0" w:noVBand="1"/>
       </w:tblPr>
@@ -1895,13 +1989,13 @@
               <w:spacing w:line="276" w:lineRule="auto"/>
               <w:jc w:val="both"/>
               <w:rPr>
-                <w:rFonts w:ascii="Times New Roman" w:hAnsi="Times New Roman" w:cs="Times New Roman"/>
+                <w:rFonts w:ascii="Arial" w:hAnsi="Arial" w:cs="Arial"/>
                 <w:lang w:val="es-ES"/>
               </w:rPr>
             </w:pPr>
             <w:r>
               <w:rPr>
-                <w:rFonts w:ascii="Times New Roman" w:hAnsi="Times New Roman" w:cs="Times New Roman"/>
+                <w:rFonts w:ascii="Arial" w:hAnsi="Arial" w:cs="Arial"/>
                 <w:lang w:val="es-ES"/>
               </w:rPr>
               <w:t>Costo Producción Total</w:t>
@@ -1918,13 +2012,13 @@
               <w:spacing w:line="276" w:lineRule="auto"/>
               <w:jc w:val="both"/>
               <w:rPr>
-                <w:rFonts w:ascii="Times New Roman" w:hAnsi="Times New Roman" w:cs="Times New Roman"/>
+                <w:rFonts w:ascii="Arial" w:hAnsi="Arial" w:cs="Arial"/>
                 <w:lang w:val="es-ES"/>
               </w:rPr>
             </w:pPr>
             <w:r>
               <w:rPr>
-                <w:rFonts w:ascii="Times New Roman" w:hAnsi="Times New Roman" w:cs="Times New Roman"/>
+                <w:rFonts w:ascii="Arial" w:hAnsi="Arial" w:cs="Arial"/>
                 <w:lang w:val="es-ES"/>
               </w:rPr>
               <w:t>9550</w:t>
@@ -1946,13 +2040,13 @@
               <w:spacing w:line="276" w:lineRule="auto"/>
               <w:jc w:val="both"/>
               <w:rPr>
-                <w:rFonts w:ascii="Times New Roman" w:hAnsi="Times New Roman" w:cs="Times New Roman"/>
+                <w:rFonts w:ascii="Arial" w:hAnsi="Arial" w:cs="Arial"/>
                 <w:lang w:val="es-ES"/>
               </w:rPr>
             </w:pPr>
             <w:r>
               <w:rPr>
-                <w:rFonts w:ascii="Times New Roman" w:hAnsi="Times New Roman" w:cs="Times New Roman"/>
+                <w:rFonts w:ascii="Arial" w:hAnsi="Arial" w:cs="Arial"/>
                 <w:lang w:val="es-ES"/>
               </w:rPr>
               <w:t>PTV (CPT + 10%)</w:t>
@@ -1969,13 +2063,13 @@
               <w:spacing w:line="276" w:lineRule="auto"/>
               <w:jc w:val="both"/>
               <w:rPr>
-                <w:rFonts w:ascii="Times New Roman" w:hAnsi="Times New Roman" w:cs="Times New Roman"/>
+                <w:rFonts w:ascii="Arial" w:hAnsi="Arial" w:cs="Arial"/>
                 <w:lang w:val="es-ES"/>
               </w:rPr>
             </w:pPr>
             <w:r>
               <w:rPr>
-                <w:rFonts w:ascii="Times New Roman" w:hAnsi="Times New Roman" w:cs="Times New Roman"/>
+                <w:rFonts w:ascii="Arial" w:hAnsi="Arial" w:cs="Arial"/>
                 <w:lang w:val="es-ES"/>
               </w:rPr>
               <w:t>9766,7</w:t>
@@ -1997,13 +2091,13 @@
               <w:spacing w:line="276" w:lineRule="auto"/>
               <w:jc w:val="both"/>
               <w:rPr>
-                <w:rFonts w:ascii="Times New Roman" w:hAnsi="Times New Roman" w:cs="Times New Roman"/>
+                <w:rFonts w:ascii="Arial" w:hAnsi="Arial" w:cs="Arial"/>
                 <w:lang w:val="es-ES"/>
               </w:rPr>
             </w:pPr>
             <w:r>
               <w:rPr>
-                <w:rFonts w:ascii="Times New Roman" w:hAnsi="Times New Roman" w:cs="Times New Roman"/>
+                <w:rFonts w:ascii="Arial" w:hAnsi="Arial" w:cs="Arial"/>
                 <w:lang w:val="es-ES"/>
               </w:rPr>
               <w:t>Ganancia Neta</w:t>
@@ -2020,13 +2114,13 @@
               <w:spacing w:line="276" w:lineRule="auto"/>
               <w:jc w:val="both"/>
               <w:rPr>
-                <w:rFonts w:ascii="Times New Roman" w:hAnsi="Times New Roman" w:cs="Times New Roman"/>
+                <w:rFonts w:ascii="Arial" w:hAnsi="Arial" w:cs="Arial"/>
                 <w:lang w:val="es-ES"/>
               </w:rPr>
             </w:pPr>
             <w:r>
               <w:rPr>
-                <w:rFonts w:ascii="Times New Roman" w:hAnsi="Times New Roman" w:cs="Times New Roman"/>
+                <w:rFonts w:ascii="Arial" w:hAnsi="Arial" w:cs="Arial"/>
                 <w:lang w:val="es-ES"/>
               </w:rPr>
               <w:t>96,7</w:t>
@@ -2040,7 +2134,7 @@
         <w:spacing w:line="276" w:lineRule="auto"/>
         <w:jc w:val="both"/>
         <w:rPr>
-          <w:rFonts w:ascii="Times New Roman" w:hAnsi="Times New Roman" w:cs="Times New Roman"/>
+          <w:rFonts w:ascii="Arial" w:hAnsi="Arial" w:cs="Arial"/>
           <w:lang w:val="es-ES"/>
         </w:rPr>
         <w:sectPr>
@@ -2057,88 +2151,54 @@
         <w:spacing w:line="276" w:lineRule="auto"/>
         <w:jc w:val="both"/>
         <w:rPr>
-          <w:rFonts w:ascii="Times New Roman" w:hAnsi="Times New Roman" w:cs="Times New Roman"/>
-          <w:lang w:val="es-ES"/>
-        </w:rPr>
-      </w:pPr>
-    </w:p>
-    <w:p>
-      <w:pPr>
-        <w:spacing w:line="276" w:lineRule="auto"/>
-        <w:jc w:val="both"/>
-        <w:rPr>
-          <w:rFonts w:ascii="Times New Roman" w:hAnsi="Times New Roman" w:cs="Times New Roman"/>
-          <w:lang w:val="es-ES"/>
-        </w:rPr>
-      </w:pPr>
-    </w:p>
-    <w:p>
-      <w:pPr>
-        <w:spacing w:line="276" w:lineRule="auto"/>
-        <w:jc w:val="both"/>
-        <w:rPr>
-          <w:rFonts w:ascii="Times New Roman" w:hAnsi="Times New Roman" w:cs="Times New Roman"/>
-          <w:lang w:val="es-ES"/>
-        </w:rPr>
-      </w:pPr>
-    </w:p>
-    <w:p>
-      <w:pPr>
-        <w:spacing w:line="276" w:lineRule="auto"/>
-        <w:jc w:val="both"/>
-        <w:rPr>
-          <w:rFonts w:ascii="Times New Roman" w:hAnsi="Times New Roman" w:cs="Times New Roman"/>
-          <w:lang w:val="es-ES"/>
-        </w:rPr>
-      </w:pPr>
-    </w:p>
-    <w:p>
-      <w:pPr>
-        <w:spacing w:line="276" w:lineRule="auto"/>
-        <w:jc w:val="both"/>
-        <w:rPr>
-          <w:rFonts w:ascii="Times New Roman" w:hAnsi="Times New Roman" w:cs="Times New Roman"/>
-          <w:lang w:val="es-ES"/>
-        </w:rPr>
-      </w:pPr>
-    </w:p>
-    <w:p>
-      <w:pPr>
-        <w:spacing w:line="276" w:lineRule="auto"/>
-        <w:jc w:val="both"/>
-        <w:rPr>
-          <w:rFonts w:ascii="Times New Roman" w:hAnsi="Times New Roman" w:cs="Times New Roman"/>
-          <w:lang w:val="es-ES"/>
-        </w:rPr>
-      </w:pPr>
-    </w:p>
-    <w:p>
-      <w:pPr>
-        <w:spacing w:line="276" w:lineRule="auto"/>
-        <w:jc w:val="both"/>
-        <w:rPr>
-          <w:rFonts w:ascii="Times New Roman" w:hAnsi="Times New Roman" w:cs="Times New Roman"/>
-          <w:lang w:val="es-ES"/>
-        </w:rPr>
-      </w:pPr>
-    </w:p>
-    <w:p>
-      <w:pPr>
-        <w:spacing w:line="276" w:lineRule="auto"/>
-        <w:jc w:val="both"/>
-        <w:rPr>
-          <w:rFonts w:ascii="Times New Roman" w:hAnsi="Times New Roman" w:cs="Times New Roman"/>
-          <w:sz w:val="28"/>
-          <w:szCs w:val="28"/>
+          <w:rFonts w:ascii="Arial" w:hAnsi="Arial" w:cs="Arial"/>
+          <w:lang w:val="es-ES"/>
+        </w:rPr>
+      </w:pPr>
+    </w:p>
+    <w:p>
+      <w:pPr>
+        <w:spacing w:line="276" w:lineRule="auto"/>
+        <w:jc w:val="both"/>
+        <w:rPr>
+          <w:rFonts w:ascii="Arial" w:hAnsi="Arial" w:cs="Arial"/>
+          <w:lang w:val="es-ES"/>
+        </w:rPr>
+      </w:pPr>
+    </w:p>
+    <w:p>
+      <w:pPr>
+        <w:spacing w:line="276" w:lineRule="auto"/>
+        <w:jc w:val="both"/>
+        <w:rPr>
+          <w:rFonts w:ascii="Arial" w:hAnsi="Arial" w:cs="Arial"/>
+          <w:lang w:val="es-ES"/>
+        </w:rPr>
+      </w:pPr>
+    </w:p>
+    <w:p>
+      <w:pPr>
+        <w:spacing w:line="276" w:lineRule="auto"/>
+        <w:jc w:val="both"/>
+        <w:rPr>
+          <w:rFonts w:ascii="Arial" w:hAnsi="Arial" w:cs="Arial"/>
+          <w:lang w:val="es-ES"/>
+        </w:rPr>
+      </w:pPr>
+    </w:p>
+    <w:p>
+      <w:pPr>
+        <w:spacing w:line="276" w:lineRule="auto"/>
+        <w:jc w:val="both"/>
+        <w:rPr>
+          <w:rFonts w:ascii="Arial" w:hAnsi="Arial" w:cs="Arial"/>
           <w:u w:val="single"/>
           <w:lang w:val="es-ES"/>
         </w:rPr>
       </w:pPr>
       <w:r>
         <w:rPr>
-          <w:rFonts w:ascii="Times New Roman" w:hAnsi="Times New Roman" w:cs="Times New Roman"/>
-          <w:sz w:val="28"/>
-          <w:szCs w:val="28"/>
+          <w:rFonts w:ascii="Arial" w:hAnsi="Arial" w:cs="Arial"/>
           <w:u w:val="single"/>
           <w:lang w:val="es-ES"/>
         </w:rPr>
@@ -2155,17 +2215,13 @@
         <w:spacing w:line="276" w:lineRule="auto"/>
         <w:jc w:val="both"/>
         <w:rPr>
-          <w:rFonts w:ascii="Times New Roman" w:hAnsi="Times New Roman" w:cs="Times New Roman"/>
-          <w:sz w:val="24"/>
-          <w:szCs w:val="24"/>
-          <w:lang w:val="es-ES"/>
-        </w:rPr>
-      </w:pPr>
-      <w:r>
-        <w:rPr>
-          <w:rFonts w:ascii="Times New Roman" w:hAnsi="Times New Roman" w:cs="Times New Roman"/>
-          <w:sz w:val="24"/>
-          <w:szCs w:val="24"/>
+          <w:rFonts w:ascii="Arial" w:hAnsi="Arial" w:cs="Arial"/>
+          <w:lang w:val="es-ES"/>
+        </w:rPr>
+      </w:pPr>
+      <w:r>
+        <w:rPr>
+          <w:rFonts w:ascii="Arial" w:hAnsi="Arial" w:cs="Arial"/>
           <w:lang w:val="es-ES"/>
         </w:rPr>
         <w:t>Activo</w:t>
@@ -2181,13 +2237,13 @@
         <w:spacing w:line="276" w:lineRule="auto"/>
         <w:jc w:val="both"/>
         <w:rPr>
-          <w:rFonts w:ascii="Times New Roman" w:hAnsi="Times New Roman" w:cs="Times New Roman"/>
-          <w:lang w:val="es-ES"/>
-        </w:rPr>
-      </w:pPr>
-      <w:r>
-        <w:rPr>
-          <w:rFonts w:ascii="Times New Roman" w:hAnsi="Times New Roman" w:cs="Times New Roman"/>
+          <w:rFonts w:ascii="Arial" w:hAnsi="Arial" w:cs="Arial"/>
+          <w:lang w:val="es-ES"/>
+        </w:rPr>
+      </w:pPr>
+      <w:r>
+        <w:rPr>
+          <w:rFonts w:ascii="Arial" w:hAnsi="Arial" w:cs="Arial"/>
           <w:lang w:val="es-ES"/>
         </w:rPr>
         <w:t>Maquina impresora $50.000 (patrimonio)</w:t>
@@ -2203,37 +2259,30 @@
         <w:spacing w:line="276" w:lineRule="auto"/>
         <w:jc w:val="both"/>
         <w:rPr>
-          <w:rFonts w:ascii="Times New Roman" w:hAnsi="Times New Roman" w:cs="Times New Roman"/>
-          <w:lang w:val="es-ES"/>
-        </w:rPr>
-      </w:pPr>
-      <w:r>
-        <w:rPr>
-          <w:rFonts w:ascii="Times New Roman" w:hAnsi="Times New Roman" w:cs="Times New Roman"/>
+          <w:rFonts w:ascii="Arial" w:hAnsi="Arial" w:cs="Arial"/>
+          <w:lang w:val="es-ES"/>
+        </w:rPr>
+      </w:pPr>
+      <w:r>
+        <w:rPr>
+          <w:rFonts w:ascii="Arial" w:hAnsi="Arial" w:cs="Arial"/>
           <w:lang w:val="es-ES"/>
         </w:rPr>
         <w:t>C</w:t>
       </w:r>
       <w:r>
         <w:rPr>
-          <w:rFonts w:ascii="Times New Roman" w:hAnsi="Times New Roman" w:cs="Times New Roman"/>
+          <w:rFonts w:ascii="Arial" w:hAnsi="Arial" w:cs="Arial"/>
           <w:lang w:val="es-ES"/>
         </w:rPr>
         <w:t>omputadora</w:t>
       </w:r>
       <w:r>
         <w:rPr>
-          <w:rFonts w:ascii="Times New Roman" w:hAnsi="Times New Roman" w:cs="Times New Roman"/>
-          <w:lang w:val="es-ES"/>
-        </w:rPr>
-        <w:t xml:space="preserve"> </w:t>
-      </w:r>
-      <w:r>
-        <w:rPr>
-          <w:rFonts w:ascii="Times New Roman" w:hAnsi="Times New Roman" w:cs="Times New Roman"/>
-          <w:lang w:val="es-ES"/>
-        </w:rPr>
-        <w:t>$1000</w:t>
+          <w:rFonts w:ascii="Arial" w:hAnsi="Arial" w:cs="Arial"/>
+          <w:lang w:val="es-ES"/>
+        </w:rPr>
+        <w:t xml:space="preserve"> $1000</w:t>
       </w:r>
     </w:p>
     <w:p>
@@ -2246,30 +2295,140 @@
         <w:spacing w:line="276" w:lineRule="auto"/>
         <w:jc w:val="both"/>
         <w:rPr>
-          <w:rFonts w:ascii="Times New Roman" w:hAnsi="Times New Roman" w:cs="Times New Roman"/>
-          <w:lang w:val="es-ES"/>
-        </w:rPr>
-      </w:pPr>
-      <w:r>
-        <w:rPr>
-          <w:rFonts w:ascii="Times New Roman" w:hAnsi="Times New Roman" w:cs="Times New Roman"/>
+          <w:rFonts w:ascii="Arial" w:hAnsi="Arial" w:cs="Arial"/>
+          <w:lang w:val="es-ES"/>
+        </w:rPr>
+      </w:pPr>
+      <w:r>
+        <w:rPr>
+          <w:rFonts w:ascii="Arial" w:hAnsi="Arial" w:cs="Arial"/>
           <w:lang w:val="es-ES"/>
         </w:rPr>
         <w:t xml:space="preserve">Maquina encuadernación </w:t>
       </w:r>
       <w:r>
         <w:rPr>
-          <w:rFonts w:ascii="Times New Roman" w:hAnsi="Times New Roman" w:cs="Times New Roman"/>
+          <w:rFonts w:ascii="Arial" w:hAnsi="Arial" w:cs="Arial"/>
           <w:lang w:val="es-ES"/>
         </w:rPr>
         <w:t>$</w:t>
       </w:r>
       <w:r>
         <w:rPr>
-          <w:rFonts w:ascii="Times New Roman" w:hAnsi="Times New Roman" w:cs="Times New Roman"/>
+          <w:rFonts w:ascii="Arial" w:hAnsi="Arial" w:cs="Arial"/>
           <w:lang w:val="es-ES"/>
         </w:rPr>
         <w:t>30000</w:t>
+      </w:r>
+    </w:p>
+    <w:p>
+      <w:pPr>
+        <w:pStyle w:val="Prrafodelista"/>
+        <w:numPr>
+          <w:ilvl w:val="1"/>
+          <w:numId w:val="3"/>
+        </w:numPr>
+        <w:spacing w:line="276" w:lineRule="auto"/>
+        <w:jc w:val="both"/>
+        <w:rPr>
+          <w:rFonts w:ascii="Arial" w:hAnsi="Arial" w:cs="Arial"/>
+          <w:lang w:val="es-ES"/>
+        </w:rPr>
+      </w:pPr>
+      <w:r>
+        <w:rPr>
+          <w:rFonts w:ascii="Arial" w:hAnsi="Arial" w:cs="Arial"/>
+          <w:lang w:val="es-ES"/>
+        </w:rPr>
+        <w:t>Hojas de material reciclado $5250</w:t>
+      </w:r>
+    </w:p>
+    <w:p>
+      <w:pPr>
+        <w:pStyle w:val="Prrafodelista"/>
+        <w:numPr>
+          <w:ilvl w:val="1"/>
+          <w:numId w:val="3"/>
+        </w:numPr>
+        <w:spacing w:line="276" w:lineRule="auto"/>
+        <w:jc w:val="both"/>
+        <w:rPr>
+          <w:rFonts w:ascii="Arial" w:hAnsi="Arial" w:cs="Arial"/>
+          <w:lang w:val="es-ES"/>
+        </w:rPr>
+      </w:pPr>
+      <w:r>
+        <w:rPr>
+          <w:rFonts w:ascii="Arial" w:hAnsi="Arial" w:cs="Arial"/>
+          <w:lang w:val="es-ES"/>
+        </w:rPr>
+        <w:t>Tapa y contratapa $80</w:t>
+      </w:r>
+    </w:p>
+    <w:p>
+      <w:pPr>
+        <w:pStyle w:val="Prrafodelista"/>
+        <w:numPr>
+          <w:ilvl w:val="1"/>
+          <w:numId w:val="3"/>
+        </w:numPr>
+        <w:spacing w:line="276" w:lineRule="auto"/>
+        <w:jc w:val="both"/>
+        <w:rPr>
+          <w:rFonts w:ascii="Arial" w:hAnsi="Arial" w:cs="Arial"/>
+          <w:lang w:val="es-ES"/>
+        </w:rPr>
+      </w:pPr>
+      <w:r>
+        <w:rPr>
+          <w:rFonts w:ascii="Arial" w:hAnsi="Arial" w:cs="Arial"/>
+          <w:lang w:val="es-ES"/>
+        </w:rPr>
+        <w:t>Tinta de agua $100</w:t>
+      </w:r>
+    </w:p>
+    <w:p>
+      <w:pPr>
+        <w:pStyle w:val="Prrafodelista"/>
+        <w:numPr>
+          <w:ilvl w:val="1"/>
+          <w:numId w:val="3"/>
+        </w:numPr>
+        <w:spacing w:line="276" w:lineRule="auto"/>
+        <w:jc w:val="both"/>
+        <w:rPr>
+          <w:rFonts w:ascii="Arial" w:hAnsi="Arial" w:cs="Arial"/>
+          <w:lang w:val="es-ES"/>
+        </w:rPr>
+      </w:pPr>
+      <w:r>
+        <w:rPr>
+          <w:rFonts w:ascii="Arial" w:hAnsi="Arial" w:cs="Arial"/>
+          <w:lang w:val="es-ES"/>
+        </w:rPr>
+        <w:t>Herramientas extras $100</w:t>
+      </w:r>
+    </w:p>
+    <w:p>
+      <w:pPr>
+        <w:pStyle w:val="Prrafodelista"/>
+        <w:numPr>
+          <w:ilvl w:val="1"/>
+          <w:numId w:val="3"/>
+        </w:numPr>
+        <w:spacing w:line="276" w:lineRule="auto"/>
+        <w:jc w:val="both"/>
+        <w:rPr>
+          <w:rFonts w:ascii="Arial" w:hAnsi="Arial" w:cs="Arial"/>
+          <w:lang w:val="es-ES"/>
+        </w:rPr>
+      </w:pPr>
+      <w:r>
+        <w:rPr>
+          <w:rFonts w:ascii="Arial" w:hAnsi="Arial" w:cs="Arial"/>
+          <w:lang w:val="es-ES"/>
+        </w:rPr>
+        <w:t>Muebles ofimáticos $50</w:t>
       </w:r>
     </w:p>
     <w:p>
@@ -2282,15 +2441,13 @@
         <w:spacing w:line="276" w:lineRule="auto"/>
         <w:jc w:val="both"/>
         <w:rPr>
-          <w:rFonts w:ascii="Times New Roman" w:hAnsi="Times New Roman" w:cs="Times New Roman"/>
-          <w:lang w:val="es-ES"/>
-        </w:rPr>
-      </w:pPr>
-      <w:r>
-        <w:rPr>
-          <w:rFonts w:ascii="Times New Roman" w:hAnsi="Times New Roman" w:cs="Times New Roman"/>
-          <w:sz w:val="24"/>
-          <w:szCs w:val="24"/>
+          <w:rFonts w:ascii="Arial" w:hAnsi="Arial" w:cs="Arial"/>
+          <w:lang w:val="es-ES"/>
+        </w:rPr>
+      </w:pPr>
+      <w:r>
+        <w:rPr>
+          <w:rFonts w:ascii="Arial" w:hAnsi="Arial" w:cs="Arial"/>
           <w:lang w:val="es-ES"/>
         </w:rPr>
         <w:t>Pasivo</w:t>
@@ -2306,15 +2463,13 @@
         <w:spacing w:line="276" w:lineRule="auto"/>
         <w:jc w:val="both"/>
         <w:rPr>
-          <w:rFonts w:ascii="Times New Roman" w:hAnsi="Times New Roman" w:cs="Times New Roman"/>
-          <w:lang w:val="es-ES"/>
-        </w:rPr>
-      </w:pPr>
-      <w:r>
-        <w:rPr>
-          <w:rFonts w:ascii="Times New Roman" w:hAnsi="Times New Roman" w:cs="Times New Roman"/>
-          <w:sz w:val="24"/>
-          <w:szCs w:val="24"/>
+          <w:rFonts w:ascii="Arial" w:hAnsi="Arial" w:cs="Arial"/>
+          <w:lang w:val="es-ES"/>
+        </w:rPr>
+      </w:pPr>
+      <w:r>
+        <w:rPr>
+          <w:rFonts w:ascii="Arial" w:hAnsi="Arial" w:cs="Arial"/>
           <w:lang w:val="es-ES"/>
         </w:rPr>
         <w:t>Carece de deudas</w:t>
@@ -2322,7 +2477,7 @@
     </w:p>
     <w:tbl>
       <w:tblPr>
-        <w:tblpPr w:leftFromText="141" w:rightFromText="141" w:vertAnchor="page" w:horzAnchor="margin" w:tblpXSpec="center" w:tblpY="4531"/>
+        <w:tblpPr w:leftFromText="141" w:rightFromText="141" w:vertAnchor="page" w:horzAnchor="margin" w:tblpXSpec="center" w:tblpY="11551"/>
         <w:tblW w:w="0" w:type="auto"/>
         <w:tblBorders>
           <w:top w:val="single" w:sz="4" w:space="0" w:color="auto"/>
@@ -2357,17 +2512,15 @@
           <w:p>
             <w:pPr>
               <w:spacing w:after="0" w:line="276" w:lineRule="auto"/>
-              <w:jc w:val="center"/>
+              <w:jc w:val="both"/>
               <w:rPr>
-                <w:rFonts w:ascii="Times New Roman" w:hAnsi="Times New Roman" w:cs="Times New Roman"/>
+                <w:rFonts w:ascii="Arial" w:hAnsi="Arial" w:cs="Arial"/>
                 <w:lang w:val="es-ES"/>
               </w:rPr>
             </w:pPr>
             <w:r>
               <w:rPr>
-                <w:rFonts w:ascii="Times New Roman" w:hAnsi="Times New Roman" w:cs="Times New Roman"/>
-                <w:sz w:val="28"/>
-                <w:szCs w:val="28"/>
+                <w:rFonts w:ascii="Arial" w:hAnsi="Arial" w:cs="Arial"/>
                 <w:lang w:val="es-ES"/>
               </w:rPr>
               <w:t>Patrimonio</w:t>
@@ -2389,29 +2542,18 @@
           <w:p>
             <w:pPr>
               <w:spacing w:line="276" w:lineRule="auto"/>
-              <w:jc w:val="center"/>
+              <w:jc w:val="both"/>
               <w:rPr>
-                <w:rFonts w:ascii="Times New Roman" w:hAnsi="Times New Roman" w:cs="Times New Roman"/>
-                <w:sz w:val="24"/>
-                <w:szCs w:val="24"/>
+                <w:rFonts w:ascii="Arial" w:hAnsi="Arial" w:cs="Arial"/>
                 <w:lang w:val="es-ES"/>
               </w:rPr>
             </w:pPr>
             <w:r>
               <w:rPr>
-                <w:rFonts w:ascii="Times New Roman" w:hAnsi="Times New Roman" w:cs="Times New Roman"/>
-                <w:sz w:val="24"/>
-                <w:szCs w:val="24"/>
+                <w:rFonts w:ascii="Arial" w:hAnsi="Arial" w:cs="Arial"/>
                 <w:lang w:val="es-ES"/>
               </w:rPr>
-              <w:t>Activo</w:t>
-            </w:r>
-            <w:r>
-              <w:rPr>
-                <w:rFonts w:ascii="Times New Roman" w:hAnsi="Times New Roman" w:cs="Times New Roman"/>
-                <w:lang w:val="es-ES"/>
-              </w:rPr>
-              <w:t>: 50000 + 30000 + 1000 + 5250 + 80+ 100 + 100</w:t>
+              <w:t>Activo: 50000 + 30000 + 1000 + 5250 + 80+ 100 + 100 + 50</w:t>
             </w:r>
           </w:p>
         </w:tc>
@@ -2431,29 +2573,18 @@
           <w:p>
             <w:pPr>
               <w:spacing w:line="276" w:lineRule="auto"/>
-              <w:jc w:val="center"/>
+              <w:jc w:val="both"/>
               <w:rPr>
-                <w:rFonts w:ascii="Times New Roman" w:hAnsi="Times New Roman" w:cs="Times New Roman"/>
-                <w:sz w:val="24"/>
-                <w:szCs w:val="24"/>
+                <w:rFonts w:ascii="Arial" w:hAnsi="Arial" w:cs="Arial"/>
                 <w:lang w:val="es-ES"/>
               </w:rPr>
             </w:pPr>
             <w:r>
               <w:rPr>
-                <w:rFonts w:ascii="Times New Roman" w:hAnsi="Times New Roman" w:cs="Times New Roman"/>
-                <w:sz w:val="24"/>
-                <w:szCs w:val="24"/>
+                <w:rFonts w:ascii="Arial" w:hAnsi="Arial" w:cs="Arial"/>
                 <w:lang w:val="es-ES"/>
               </w:rPr>
-              <w:t>Pasivo</w:t>
-            </w:r>
-            <w:r>
-              <w:rPr>
-                <w:rFonts w:ascii="Times New Roman" w:hAnsi="Times New Roman" w:cs="Times New Roman"/>
-                <w:lang w:val="es-ES"/>
-              </w:rPr>
-              <w:t>: 0</w:t>
+              <w:t>Pasivo: 0</w:t>
             </w:r>
           </w:p>
         </w:tc>
@@ -2472,22 +2603,18 @@
           <w:p>
             <w:pPr>
               <w:spacing w:line="276" w:lineRule="auto"/>
-              <w:jc w:val="center"/>
+              <w:jc w:val="both"/>
               <w:rPr>
-                <w:rFonts w:ascii="Times New Roman" w:hAnsi="Times New Roman" w:cs="Times New Roman"/>
-                <w:sz w:val="24"/>
-                <w:szCs w:val="24"/>
+                <w:rFonts w:ascii="Arial" w:hAnsi="Arial" w:cs="Arial"/>
                 <w:lang w:val="es-ES"/>
               </w:rPr>
             </w:pPr>
             <w:r>
               <w:rPr>
-                <w:rFonts w:ascii="Times New Roman" w:hAnsi="Times New Roman" w:cs="Times New Roman"/>
-                <w:sz w:val="24"/>
-                <w:szCs w:val="24"/>
+                <w:rFonts w:ascii="Arial" w:hAnsi="Arial" w:cs="Arial"/>
                 <w:lang w:val="es-ES"/>
               </w:rPr>
-              <w:t>Neto: 86530</w:t>
+              <w:t>Neto: 86580</w:t>
             </w:r>
           </w:p>
         </w:tc>
@@ -2499,118 +2626,495 @@
         <w:ind w:left="360"/>
         <w:jc w:val="both"/>
         <w:rPr>
-          <w:rFonts w:ascii="Times New Roman" w:hAnsi="Times New Roman" w:cs="Times New Roman"/>
-          <w:lang w:val="es-ES"/>
-        </w:rPr>
-      </w:pPr>
-    </w:p>
-    <w:p>
-      <w:pPr>
-        <w:spacing w:line="276" w:lineRule="auto"/>
-        <w:jc w:val="both"/>
-        <w:rPr>
-          <w:rFonts w:ascii="Times New Roman" w:hAnsi="Times New Roman" w:cs="Times New Roman"/>
-          <w:lang w:val="es-ES"/>
-        </w:rPr>
-      </w:pPr>
-    </w:p>
-    <w:p>
-      <w:pPr>
-        <w:spacing w:line="276" w:lineRule="auto"/>
-        <w:jc w:val="both"/>
-        <w:rPr>
-          <w:rFonts w:ascii="Times New Roman" w:hAnsi="Times New Roman" w:cs="Times New Roman"/>
-          <w:lang w:val="es-ES"/>
-        </w:rPr>
-      </w:pPr>
-    </w:p>
-    <w:p>
-      <w:pPr>
-        <w:spacing w:line="276" w:lineRule="auto"/>
-        <w:jc w:val="both"/>
-        <w:rPr>
-          <w:rFonts w:ascii="Times New Roman" w:hAnsi="Times New Roman" w:cs="Times New Roman"/>
-          <w:lang w:val="es-ES"/>
-        </w:rPr>
-      </w:pPr>
-    </w:p>
-    <w:p>
-      <w:pPr>
-        <w:spacing w:line="276" w:lineRule="auto"/>
-        <w:jc w:val="both"/>
-        <w:rPr>
-          <w:rFonts w:ascii="Times New Roman" w:hAnsi="Times New Roman" w:cs="Times New Roman"/>
-          <w:lang w:val="es-ES"/>
-        </w:rPr>
-      </w:pPr>
-    </w:p>
-    <w:p>
-      <w:pPr>
-        <w:spacing w:line="276" w:lineRule="auto"/>
-        <w:jc w:val="both"/>
-        <w:rPr>
-          <w:rFonts w:ascii="Times New Roman" w:hAnsi="Times New Roman" w:cs="Times New Roman"/>
-          <w:lang w:val="es-ES"/>
-        </w:rPr>
-      </w:pPr>
-    </w:p>
-    <w:p>
-      <w:pPr>
-        <w:spacing w:line="276" w:lineRule="auto"/>
-        <w:jc w:val="both"/>
-        <w:rPr>
-          <w:rFonts w:ascii="Times New Roman" w:hAnsi="Times New Roman" w:cs="Times New Roman"/>
-          <w:lang w:val="es-ES"/>
-        </w:rPr>
-      </w:pPr>
-    </w:p>
-    <w:p>
-      <w:pPr>
-        <w:spacing w:line="276" w:lineRule="auto"/>
-        <w:jc w:val="both"/>
-        <w:rPr>
-          <w:rFonts w:ascii="Times New Roman" w:hAnsi="Times New Roman" w:cs="Times New Roman"/>
-          <w:lang w:val="es-ES"/>
-        </w:rPr>
-      </w:pPr>
-    </w:p>
-    <w:p>
-      <w:pPr>
-        <w:spacing w:line="276" w:lineRule="auto"/>
-        <w:jc w:val="both"/>
-        <w:rPr>
-          <w:rFonts w:ascii="Times New Roman" w:hAnsi="Times New Roman" w:cs="Times New Roman"/>
-          <w:lang w:val="es-ES"/>
-        </w:rPr>
-      </w:pPr>
-      <w:r>
-        <w:rPr>
-          <w:rFonts w:ascii="Times New Roman" w:hAnsi="Times New Roman" w:cs="Times New Roman"/>
-          <w:lang w:val="es-ES"/>
-        </w:rPr>
-        <w:t xml:space="preserve">Sistema con orden </w:t>
-      </w:r>
-      <w:r>
-        <w:rPr>
-          <w:rFonts w:ascii="Times New Roman" w:hAnsi="Times New Roman" w:cs="Times New Roman"/>
-          <w:lang w:val="es-ES"/>
-        </w:rPr>
-        <w:t>de</w:t>
-      </w:r>
-      <w:r>
-        <w:rPr>
-          <w:rFonts w:ascii="Times New Roman" w:hAnsi="Times New Roman" w:cs="Times New Roman"/>
-          <w:lang w:val="es-ES"/>
-        </w:rPr>
-        <w:t xml:space="preserve"> prioridad al a hora de reserva, evitar conflictos para asignación y confirmación de libros adquiridos a auspiciantes.</w:t>
-      </w:r>
-    </w:p>
-    <w:p>
-      <w:pPr>
-        <w:spacing w:line="276" w:lineRule="auto"/>
-        <w:jc w:val="both"/>
-        <w:rPr>
-          <w:rFonts w:ascii="Times New Roman" w:hAnsi="Times New Roman" w:cs="Times New Roman"/>
+          <w:rFonts w:ascii="Arial" w:hAnsi="Arial" w:cs="Arial"/>
+          <w:lang w:val="es-ES"/>
+        </w:rPr>
+      </w:pPr>
+    </w:p>
+    <w:p>
+      <w:pPr>
+        <w:spacing w:line="276" w:lineRule="auto"/>
+        <w:jc w:val="both"/>
+        <w:rPr>
+          <w:rFonts w:ascii="Arial" w:hAnsi="Arial" w:cs="Arial"/>
+          <w:lang w:val="es-ES"/>
+        </w:rPr>
+      </w:pPr>
+    </w:p>
+    <w:p>
+      <w:pPr>
+        <w:spacing w:line="276" w:lineRule="auto"/>
+        <w:jc w:val="both"/>
+        <w:rPr>
+          <w:rFonts w:ascii="Arial" w:hAnsi="Arial" w:cs="Arial"/>
+          <w:lang w:val="es-ES"/>
+        </w:rPr>
+      </w:pPr>
+    </w:p>
+    <w:p>
+      <w:pPr>
+        <w:spacing w:line="276" w:lineRule="auto"/>
+        <w:jc w:val="both"/>
+        <w:rPr>
+          <w:rFonts w:ascii="Arial" w:hAnsi="Arial" w:cs="Arial"/>
+          <w:lang w:val="es-ES"/>
+        </w:rPr>
+      </w:pPr>
+    </w:p>
+    <w:p>
+      <w:pPr>
+        <w:spacing w:line="276" w:lineRule="auto"/>
+        <w:jc w:val="both"/>
+        <w:rPr>
+          <w:rFonts w:ascii="Arial" w:hAnsi="Arial" w:cs="Arial"/>
+          <w:lang w:val="es-ES"/>
+        </w:rPr>
+      </w:pPr>
+    </w:p>
+    <w:p>
+      <w:pPr>
+        <w:spacing w:line="276" w:lineRule="auto"/>
+        <w:jc w:val="both"/>
+        <w:rPr>
+          <w:rFonts w:ascii="Arial" w:hAnsi="Arial" w:cs="Arial"/>
+          <w:lang w:val="es-ES"/>
+        </w:rPr>
+      </w:pPr>
+    </w:p>
+    <w:p>
+      <w:pPr>
+        <w:spacing w:line="276" w:lineRule="auto"/>
+        <w:jc w:val="both"/>
+        <w:rPr>
+          <w:rFonts w:ascii="Arial" w:hAnsi="Arial" w:cs="Arial"/>
+          <w:lang w:val="es-ES"/>
+        </w:rPr>
+      </w:pPr>
+    </w:p>
+    <w:p>
+      <w:pPr>
+        <w:spacing w:line="276" w:lineRule="auto"/>
+        <w:jc w:val="both"/>
+        <w:rPr>
+          <w:rFonts w:ascii="Arial" w:hAnsi="Arial" w:cs="Arial"/>
+          <w:lang w:val="es-ES"/>
+        </w:rPr>
+      </w:pPr>
+    </w:p>
+    <w:p>
+      <w:pPr>
+        <w:spacing w:line="276" w:lineRule="auto"/>
+        <w:jc w:val="both"/>
+        <w:rPr>
+          <w:rFonts w:ascii="Arial" w:hAnsi="Arial" w:cs="Arial"/>
+          <w:lang w:val="es-ES"/>
+        </w:rPr>
+      </w:pPr>
+    </w:p>
+    <w:p>
+      <w:pPr>
+        <w:rPr>
+          <w:rFonts w:ascii="Arial" w:hAnsi="Arial" w:cs="Arial"/>
+          <w:sz w:val="28"/>
+          <w:szCs w:val="28"/>
+          <w:lang w:val="es-ES"/>
+        </w:rPr>
+      </w:pPr>
+      <w:r>
+        <w:rPr>
+          <w:rFonts w:ascii="Arial" w:hAnsi="Arial" w:cs="Arial"/>
+          <w:sz w:val="28"/>
+          <w:szCs w:val="28"/>
+          <w:lang w:val="es-ES"/>
+        </w:rPr>
+        <w:lastRenderedPageBreak/>
+        <w:t>Documentación y Legalidad</w:t>
+      </w:r>
+    </w:p>
+    <w:p>
+      <w:pPr>
+        <w:rPr>
+          <w:rFonts w:ascii="Arial" w:hAnsi="Arial" w:cs="Arial"/>
+          <w:lang w:val="es-419" w:eastAsia="es-419"/>
+        </w:rPr>
+      </w:pPr>
+      <w:r>
+        <w:rPr>
+          <w:rFonts w:ascii="Arial" w:hAnsi="Arial" w:cs="Arial"/>
+          <w:lang w:val="es-419" w:eastAsia="es-419"/>
+        </w:rPr>
+        <w:t>Trámites y documentación para la puesta en marcha</w:t>
+      </w:r>
+    </w:p>
+    <w:p>
+      <w:pPr>
+        <w:spacing w:before="100" w:beforeAutospacing="1" w:after="100" w:afterAutospacing="1" w:line="240" w:lineRule="auto"/>
+        <w:jc w:val="both"/>
+        <w:rPr>
+          <w:rFonts w:ascii="Arial" w:eastAsia="Times New Roman" w:hAnsi="Arial" w:cs="Arial"/>
+          <w:lang w:val="es-419" w:eastAsia="es-419"/>
+        </w:rPr>
+      </w:pPr>
+      <w:r>
+        <w:rPr>
+          <w:rFonts w:ascii="Arial" w:eastAsia="Times New Roman" w:hAnsi="Arial" w:cs="Arial"/>
+          <w:lang w:val="es-419" w:eastAsia="es-419"/>
+        </w:rPr>
+        <w:t xml:space="preserve">Para poner en funcionamiento nuestra organización será necesario cumplir con distintos requisitos legales, impositivos, administrativos y de seguridad. En primer lugar, se deberá establecer la </w:t>
+      </w:r>
+      <w:r>
+        <w:rPr>
+          <w:rFonts w:ascii="Arial" w:eastAsia="Times New Roman" w:hAnsi="Arial" w:cs="Arial"/>
+          <w:b/>
+          <w:bCs/>
+          <w:lang w:val="es-419" w:eastAsia="es-419"/>
+        </w:rPr>
+        <w:t>forma jurídica de la organización</w:t>
+      </w:r>
+      <w:r>
+        <w:rPr>
+          <w:rFonts w:ascii="Arial" w:eastAsia="Times New Roman" w:hAnsi="Arial" w:cs="Arial"/>
+          <w:lang w:val="es-419" w:eastAsia="es-419"/>
+        </w:rPr>
+        <w:t xml:space="preserve"> y realizar su constitución formal. Para ello serán necesarios documentos como el </w:t>
+      </w:r>
+      <w:r>
+        <w:rPr>
+          <w:rFonts w:ascii="Arial" w:eastAsia="Times New Roman" w:hAnsi="Arial" w:cs="Arial"/>
+          <w:b/>
+          <w:bCs/>
+          <w:lang w:val="es-419" w:eastAsia="es-419"/>
+        </w:rPr>
+        <w:t>acta constitutiva</w:t>
+      </w:r>
+      <w:r>
+        <w:rPr>
+          <w:rFonts w:ascii="Arial" w:eastAsia="Times New Roman" w:hAnsi="Arial" w:cs="Arial"/>
+          <w:lang w:val="es-419" w:eastAsia="es-419"/>
+        </w:rPr>
+        <w:t xml:space="preserve">, donde se establece la creación de la organización, y el </w:t>
+      </w:r>
+      <w:r>
+        <w:rPr>
+          <w:rFonts w:ascii="Arial" w:eastAsia="Times New Roman" w:hAnsi="Arial" w:cs="Arial"/>
+          <w:b/>
+          <w:bCs/>
+          <w:lang w:val="es-419" w:eastAsia="es-419"/>
+        </w:rPr>
+        <w:t>estatu</w:t>
+      </w:r>
+      <w:r>
+        <w:rPr>
+          <w:rFonts w:ascii="Arial" w:eastAsia="Times New Roman" w:hAnsi="Arial" w:cs="Arial"/>
+          <w:b/>
+          <w:bCs/>
+          <w:lang w:val="es-419" w:eastAsia="es-419"/>
+        </w:rPr>
+        <w:t>t</w:t>
+      </w:r>
+      <w:r>
+        <w:rPr>
+          <w:rFonts w:ascii="Arial" w:eastAsia="Times New Roman" w:hAnsi="Arial" w:cs="Arial"/>
+          <w:b/>
+          <w:bCs/>
+          <w:lang w:val="es-419" w:eastAsia="es-419"/>
+        </w:rPr>
+        <w:t>o</w:t>
+      </w:r>
+      <w:r>
+        <w:rPr>
+          <w:rFonts w:ascii="Arial" w:eastAsia="Times New Roman" w:hAnsi="Arial" w:cs="Arial"/>
+          <w:lang w:val="es-419" w:eastAsia="es-419"/>
+        </w:rPr>
+        <w:t>, donde se determinan sus objetivos, autoridades, funcionamiento y destino de los recursos. También deberá registrarse la designación de las autoridades correspondientes.</w:t>
+      </w:r>
+    </w:p>
+    <w:p>
+      <w:pPr>
+        <w:spacing w:before="100" w:beforeAutospacing="1" w:after="100" w:afterAutospacing="1" w:line="240" w:lineRule="auto"/>
+        <w:jc w:val="both"/>
+        <w:rPr>
+          <w:rFonts w:ascii="Arial" w:eastAsia="Times New Roman" w:hAnsi="Arial" w:cs="Arial"/>
+          <w:lang w:val="es-419" w:eastAsia="es-419"/>
+        </w:rPr>
+      </w:pPr>
+      <w:r>
+        <w:rPr>
+          <w:rFonts w:ascii="Arial" w:eastAsia="Times New Roman" w:hAnsi="Arial" w:cs="Arial"/>
+          <w:lang w:val="es-419" w:eastAsia="es-419"/>
+        </w:rPr>
+        <w:t xml:space="preserve">En el aspecto </w:t>
+      </w:r>
+      <w:r>
+        <w:rPr>
+          <w:rFonts w:ascii="Arial" w:eastAsia="Times New Roman" w:hAnsi="Arial" w:cs="Arial"/>
+          <w:b/>
+          <w:bCs/>
+          <w:lang w:val="es-419" w:eastAsia="es-419"/>
+        </w:rPr>
+        <w:t>impositivo</w:t>
+      </w:r>
+      <w:r>
+        <w:rPr>
+          <w:rFonts w:ascii="Arial" w:eastAsia="Times New Roman" w:hAnsi="Arial" w:cs="Arial"/>
+          <w:lang w:val="es-419" w:eastAsia="es-419"/>
+        </w:rPr>
+        <w:t xml:space="preserve">, será necesario obtener la </w:t>
+      </w:r>
+      <w:r>
+        <w:rPr>
+          <w:rFonts w:ascii="Arial" w:eastAsia="Times New Roman" w:hAnsi="Arial" w:cs="Arial"/>
+          <w:b/>
+          <w:bCs/>
+          <w:lang w:val="es-419" w:eastAsia="es-419"/>
+        </w:rPr>
+        <w:t>CUIT</w:t>
+      </w:r>
+      <w:r>
+        <w:rPr>
+          <w:rFonts w:ascii="Arial" w:eastAsia="Times New Roman" w:hAnsi="Arial" w:cs="Arial"/>
+          <w:lang w:val="es-419" w:eastAsia="es-419"/>
+        </w:rPr>
+        <w:t xml:space="preserve"> y realizar la inscripción correspondiente ante </w:t>
+      </w:r>
+      <w:r>
+        <w:rPr>
+          <w:rFonts w:ascii="Arial" w:eastAsia="Times New Roman" w:hAnsi="Arial" w:cs="Arial"/>
+          <w:b/>
+          <w:bCs/>
+          <w:lang w:val="es-419" w:eastAsia="es-419"/>
+        </w:rPr>
+        <w:t>ARCA</w:t>
+      </w:r>
+      <w:r>
+        <w:rPr>
+          <w:rFonts w:ascii="Arial" w:eastAsia="Times New Roman" w:hAnsi="Arial" w:cs="Arial"/>
+          <w:lang w:val="es-419" w:eastAsia="es-419"/>
+        </w:rPr>
+        <w:t>, además de establecer el domicilio fiscal y declarar la actividad económica que desarrollará la organización. También deberán determinarse los impuestos y obligaciones tributarias que correspondan según la actividad y la forma jurídica elegida.</w:t>
+      </w:r>
+    </w:p>
+    <w:p>
+      <w:pPr>
+        <w:spacing w:before="100" w:beforeAutospacing="1" w:after="100" w:afterAutospacing="1" w:line="240" w:lineRule="auto"/>
+        <w:jc w:val="both"/>
+        <w:rPr>
+          <w:rFonts w:ascii="Arial" w:eastAsia="Times New Roman" w:hAnsi="Arial" w:cs="Arial"/>
+          <w:lang w:val="es-419" w:eastAsia="es-419"/>
+        </w:rPr>
+      </w:pPr>
+      <w:r>
+        <w:rPr>
+          <w:rFonts w:ascii="Arial" w:eastAsia="Times New Roman" w:hAnsi="Arial" w:cs="Arial"/>
+          <w:lang w:val="es-419" w:eastAsia="es-419"/>
+        </w:rPr>
+        <w:t xml:space="preserve">Para el establecimiento donde se almacenen materiales y se realicen actividades de impresión y encuadernación, se deberá gestionar la </w:t>
+      </w:r>
+      <w:r>
+        <w:rPr>
+          <w:rFonts w:ascii="Arial" w:eastAsia="Times New Roman" w:hAnsi="Arial" w:cs="Arial"/>
+          <w:b/>
+          <w:bCs/>
+          <w:lang w:val="es-419" w:eastAsia="es-419"/>
+        </w:rPr>
+        <w:t>habilitación municipal correspondiente</w:t>
+      </w:r>
+      <w:r>
+        <w:rPr>
+          <w:rFonts w:ascii="Arial" w:eastAsia="Times New Roman" w:hAnsi="Arial" w:cs="Arial"/>
+          <w:lang w:val="es-419" w:eastAsia="es-419"/>
+        </w:rPr>
+        <w:t xml:space="preserve"> y verificar que el lugar cumpla con las condiciones necesarias para desarrollar la actividad.</w:t>
+      </w:r>
+    </w:p>
+    <w:p>
+      <w:pPr>
+        <w:spacing w:before="100" w:beforeAutospacing="1" w:after="100" w:afterAutospacing="1" w:line="240" w:lineRule="auto"/>
+        <w:jc w:val="both"/>
+        <w:rPr>
+          <w:rFonts w:ascii="Arial" w:eastAsia="Times New Roman" w:hAnsi="Arial" w:cs="Arial"/>
+          <w:lang w:val="es-419" w:eastAsia="es-419"/>
+        </w:rPr>
+      </w:pPr>
+      <w:r>
+        <w:rPr>
+          <w:rFonts w:ascii="Arial" w:eastAsia="Times New Roman" w:hAnsi="Arial" w:cs="Arial"/>
+          <w:lang w:val="es-419" w:eastAsia="es-419"/>
+        </w:rPr>
+        <w:t xml:space="preserve">En materia de </w:t>
+      </w:r>
+      <w:r>
+        <w:rPr>
+          <w:rFonts w:ascii="Arial" w:eastAsia="Times New Roman" w:hAnsi="Arial" w:cs="Arial"/>
+          <w:b/>
+          <w:bCs/>
+          <w:lang w:val="es-419" w:eastAsia="es-419"/>
+        </w:rPr>
+        <w:t>seguridad e higiene</w:t>
+      </w:r>
+      <w:r>
+        <w:rPr>
+          <w:rFonts w:ascii="Arial" w:eastAsia="Times New Roman" w:hAnsi="Arial" w:cs="Arial"/>
+          <w:lang w:val="es-419" w:eastAsia="es-419"/>
+        </w:rPr>
+        <w:t>, será necesario garantizar que las instalaciones, máquinas y herramientas puedan utilizarse de manera segura. Se deberán contemplar aspectos como la seguridad eléctrica, prevención de incendios, señalización, mantenimiento de las máquinas y capacitación de las personas que las utilicen.</w:t>
+      </w:r>
+    </w:p>
+    <w:p>
+      <w:pPr>
+        <w:spacing w:before="100" w:beforeAutospacing="1" w:after="100" w:afterAutospacing="1" w:line="240" w:lineRule="auto"/>
+        <w:jc w:val="both"/>
+        <w:rPr>
+          <w:rFonts w:ascii="Arial" w:eastAsia="Times New Roman" w:hAnsi="Arial" w:cs="Arial"/>
+          <w:lang w:val="es-419" w:eastAsia="es-419"/>
+        </w:rPr>
+      </w:pPr>
+      <w:r>
+        <w:rPr>
+          <w:rFonts w:ascii="Arial" w:eastAsia="Times New Roman" w:hAnsi="Arial" w:cs="Arial"/>
+          <w:lang w:val="es-419" w:eastAsia="es-419"/>
+        </w:rPr>
+        <w:t xml:space="preserve">Otro aspecto fundamental será la </w:t>
+      </w:r>
+      <w:r>
+        <w:rPr>
+          <w:rFonts w:ascii="Arial" w:eastAsia="Times New Roman" w:hAnsi="Arial" w:cs="Arial"/>
+          <w:b/>
+          <w:bCs/>
+          <w:lang w:val="es-419" w:eastAsia="es-419"/>
+        </w:rPr>
+        <w:t>propiedad intelectual</w:t>
+      </w:r>
+      <w:r>
+        <w:rPr>
+          <w:rFonts w:ascii="Arial" w:eastAsia="Times New Roman" w:hAnsi="Arial" w:cs="Arial"/>
+          <w:lang w:val="es-419" w:eastAsia="es-419"/>
+        </w:rPr>
+        <w:t xml:space="preserve">. Antes de reproducir y distribuir los libros se deberá comprobar que la organización tenga autorización para hacerlo, ya sea porque la obra se encuentra en dominio público o porque se obtuvo una licencia o autorización del autor, editor o titular de los derechos. Cuando corresponda, también se deberá gestionar el </w:t>
+      </w:r>
+      <w:r>
+        <w:rPr>
+          <w:rFonts w:ascii="Arial" w:eastAsia="Times New Roman" w:hAnsi="Arial" w:cs="Arial"/>
+          <w:b/>
+          <w:bCs/>
+          <w:lang w:val="es-419" w:eastAsia="es-419"/>
+        </w:rPr>
+        <w:t>ISBN</w:t>
+      </w:r>
+      <w:r>
+        <w:rPr>
+          <w:rFonts w:ascii="Arial" w:eastAsia="Times New Roman" w:hAnsi="Arial" w:cs="Arial"/>
+          <w:lang w:val="es-419" w:eastAsia="es-419"/>
+        </w:rPr>
+        <w:t xml:space="preserve"> y la catalogación de las publicaciones.</w:t>
+      </w:r>
+    </w:p>
+    <w:p>
+      <w:pPr>
+        <w:spacing w:before="100" w:beforeAutospacing="1" w:after="100" w:afterAutospacing="1" w:line="240" w:lineRule="auto"/>
+        <w:jc w:val="both"/>
+        <w:rPr>
+          <w:rFonts w:ascii="Arial" w:eastAsia="Times New Roman" w:hAnsi="Arial" w:cs="Arial"/>
+          <w:lang w:val="es-419" w:eastAsia="es-419"/>
+        </w:rPr>
+      </w:pPr>
+      <w:r>
+        <w:rPr>
+          <w:rFonts w:ascii="Arial" w:eastAsia="Times New Roman" w:hAnsi="Arial" w:cs="Arial"/>
+          <w:lang w:val="es-419" w:eastAsia="es-419"/>
+        </w:rPr>
+        <w:t xml:space="preserve">Debido al modelo de financiamiento mediante empresas auspiciantes, será necesario establecer </w:t>
+      </w:r>
+      <w:r>
+        <w:rPr>
+          <w:rFonts w:ascii="Arial" w:eastAsia="Times New Roman" w:hAnsi="Arial" w:cs="Arial"/>
+          <w:b/>
+          <w:bCs/>
+          <w:lang w:val="es-419" w:eastAsia="es-419"/>
+        </w:rPr>
+        <w:t>contratos de auspicio</w:t>
+      </w:r>
+      <w:r>
+        <w:rPr>
+          <w:rFonts w:ascii="Arial" w:eastAsia="Times New Roman" w:hAnsi="Arial" w:cs="Arial"/>
+          <w:lang w:val="es-419" w:eastAsia="es-419"/>
+        </w:rPr>
+        <w:t xml:space="preserve"> donde se especifique el aporte de cada empresa y las condiciones de la publicidad que recibirá. También se podrá establecer un contrato con la fábrica encargada de producir los libros, especificando cantidades, características, costos y condiciones de entrega.</w:t>
+      </w:r>
+    </w:p>
+    <w:p>
+      <w:pPr>
+        <w:spacing w:before="100" w:beforeAutospacing="1" w:after="100" w:afterAutospacing="1" w:line="240" w:lineRule="auto"/>
+        <w:jc w:val="both"/>
+        <w:rPr>
+          <w:rFonts w:ascii="Arial" w:eastAsia="Times New Roman" w:hAnsi="Arial" w:cs="Arial"/>
+          <w:lang w:val="es-419" w:eastAsia="es-419"/>
+        </w:rPr>
+      </w:pPr>
+      <w:r>
+        <w:rPr>
+          <w:rFonts w:ascii="Arial" w:eastAsia="Times New Roman" w:hAnsi="Arial" w:cs="Arial"/>
+          <w:lang w:val="es-419" w:eastAsia="es-419"/>
+        </w:rPr>
+        <w:t xml:space="preserve">Como la organización contará con una página web y podrá almacenar información de empresas, instituciones y usuarios, también deberá contemplar la </w:t>
+      </w:r>
+      <w:r>
+        <w:rPr>
+          <w:rFonts w:ascii="Arial" w:eastAsia="Times New Roman" w:hAnsi="Arial" w:cs="Arial"/>
+          <w:b/>
+          <w:bCs/>
+          <w:lang w:val="es-419" w:eastAsia="es-419"/>
+        </w:rPr>
+        <w:t>protección de datos personales</w:t>
+      </w:r>
+      <w:r>
+        <w:rPr>
+          <w:rFonts w:ascii="Arial" w:eastAsia="Times New Roman" w:hAnsi="Arial" w:cs="Arial"/>
+          <w:lang w:val="es-419" w:eastAsia="es-419"/>
+        </w:rPr>
+        <w:t>, estableciendo una política de privacidad y las condiciones de uso del sitio.</w:t>
+      </w:r>
+    </w:p>
+    <w:p>
+      <w:pPr>
+        <w:spacing w:before="100" w:beforeAutospacing="1" w:after="100" w:afterAutospacing="1" w:line="240" w:lineRule="auto"/>
+        <w:jc w:val="both"/>
+        <w:rPr>
+          <w:rFonts w:ascii="Arial" w:eastAsia="Times New Roman" w:hAnsi="Arial" w:cs="Arial"/>
+          <w:lang w:val="es-419" w:eastAsia="es-419"/>
+        </w:rPr>
+      </w:pPr>
+      <w:r>
+        <w:rPr>
+          <w:rFonts w:ascii="Arial" w:eastAsia="Times New Roman" w:hAnsi="Arial" w:cs="Arial"/>
+          <w:lang w:val="es-419" w:eastAsia="es-419"/>
+        </w:rPr>
+        <w:t>Finalmente, se llevará documentación interna para organizar el funcionamiento de la organización, como registros de voluntarios, mantenimiento de las máquinas, inventario de materiales y libros, contratos y comprobantes de las operaciones realizadas.</w:t>
+      </w:r>
+    </w:p>
+    <w:p>
+      <w:pPr>
+        <w:spacing w:line="276" w:lineRule="auto"/>
+        <w:jc w:val="both"/>
+        <w:rPr>
+          <w:rFonts w:ascii="Arial" w:hAnsi="Arial" w:cs="Arial"/>
+          <w:lang w:val="es-ES"/>
+        </w:rPr>
+      </w:pPr>
+      <w:r>
+        <w:rPr>
+          <w:rFonts w:ascii="Arial" w:hAnsi="Arial" w:cs="Arial"/>
+          <w:lang w:val="es-ES"/>
+        </w:rPr>
+        <w:t>Sistema con orden de prioridad al a hora de reserva, evitar conflictos para asignación y confirmación de libros adquiridos a auspiciantes.</w:t>
+      </w:r>
+    </w:p>
+    <w:p>
+      <w:pPr>
+        <w:spacing w:line="276" w:lineRule="auto"/>
+        <w:jc w:val="both"/>
+        <w:rPr>
+          <w:rFonts w:ascii="Arial" w:hAnsi="Arial" w:cs="Arial"/>
           <w:lang w:val="es-ES"/>
         </w:rPr>
         <w:sectPr>
@@ -2627,470 +3131,18 @@
         <w:spacing w:line="276" w:lineRule="auto"/>
         <w:jc w:val="both"/>
         <w:rPr>
-          <w:rFonts w:ascii="Times New Roman" w:hAnsi="Times New Roman" w:cs="Times New Roman"/>
-          <w:lang w:val="es-ES"/>
-        </w:rPr>
-      </w:pPr>
-      <w:r>
-        <w:rPr>
-          <w:rFonts w:ascii="Times New Roman" w:hAnsi="Times New Roman" w:cs="Times New Roman"/>
-          <w:lang w:val="es-ES"/>
-        </w:rPr>
-        <w:lastRenderedPageBreak/>
+          <w:rFonts w:ascii="Arial" w:hAnsi="Arial" w:cs="Arial"/>
+          <w:lang w:val="es-ES"/>
+        </w:rPr>
+      </w:pPr>
+      <w:r>
+        <w:rPr>
+          <w:rFonts w:ascii="Arial" w:hAnsi="Arial" w:cs="Arial"/>
+          <w:lang w:val="es-ES"/>
+        </w:rPr>
         <w:t>Prioridad alta según la especificación, plan de reserva por tiempo y en caso de que no se valide, se vuelve al estado de disponible.</w:t>
       </w:r>
-    </w:p>
-    <w:p>
-      <w:pPr>
-        <w:spacing w:line="276" w:lineRule="auto"/>
-        <w:jc w:val="both"/>
-        <w:rPr>
-          <w:rFonts w:ascii="Times New Roman" w:hAnsi="Times New Roman" w:cs="Times New Roman"/>
-          <w:lang w:val="es-ES"/>
-        </w:rPr>
-      </w:pPr>
-      <w:r>
-        <w:rPr>
-          <w:rFonts w:ascii="Times New Roman" w:hAnsi="Times New Roman" w:cs="Times New Roman"/>
-          <w:lang w:val="es-ES"/>
-        </w:rPr>
-        <w:t>Documentación y Legalidad</w:t>
-      </w:r>
-    </w:p>
-    <w:p>
-      <w:pPr>
-        <w:spacing w:before="100" w:beforeAutospacing="1" w:after="100" w:afterAutospacing="1" w:line="240" w:lineRule="auto"/>
-        <w:outlineLvl w:val="2"/>
-        <w:rPr>
-          <w:rFonts w:ascii="Times New Roman" w:eastAsia="Times New Roman" w:hAnsi="Times New Roman" w:cs="Times New Roman"/>
-          <w:b/>
-          <w:bCs/>
-          <w:sz w:val="27"/>
-          <w:szCs w:val="27"/>
-          <w:lang w:val="es-419" w:eastAsia="es-419"/>
-        </w:rPr>
-      </w:pPr>
-      <w:r>
-        <w:rPr>
-          <w:rFonts w:ascii="Times New Roman" w:eastAsia="Times New Roman" w:hAnsi="Times New Roman" w:cs="Times New Roman"/>
-          <w:b/>
-          <w:bCs/>
-          <w:sz w:val="27"/>
-          <w:szCs w:val="27"/>
-          <w:lang w:val="es-419" w:eastAsia="es-419"/>
-        </w:rPr>
-        <w:t>Trámites y documentación para la puesta en marcha</w:t>
-      </w:r>
-    </w:p>
-    <w:p>
-      <w:pPr>
-        <w:spacing w:before="100" w:beforeAutospacing="1" w:after="100" w:afterAutospacing="1" w:line="240" w:lineRule="auto"/>
-        <w:rPr>
-          <w:rFonts w:ascii="Times New Roman" w:eastAsia="Times New Roman" w:hAnsi="Times New Roman" w:cs="Times New Roman"/>
-          <w:sz w:val="24"/>
-          <w:szCs w:val="24"/>
-          <w:lang w:val="es-419" w:eastAsia="es-419"/>
-        </w:rPr>
-      </w:pPr>
-      <w:r>
-        <w:rPr>
-          <w:rFonts w:ascii="Times New Roman" w:eastAsia="Times New Roman" w:hAnsi="Times New Roman" w:cs="Times New Roman"/>
-          <w:sz w:val="24"/>
-          <w:szCs w:val="24"/>
-          <w:lang w:val="es-419" w:eastAsia="es-419"/>
-        </w:rPr>
-        <w:t xml:space="preserve">Para poner en funcionamiento nuestra organización será necesario cumplir con distintos requisitos legales, impositivos, administrativos y de seguridad. En primer lugar, se deberá establecer la </w:t>
-      </w:r>
-      <w:r>
-        <w:rPr>
-          <w:rFonts w:ascii="Times New Roman" w:eastAsia="Times New Roman" w:hAnsi="Times New Roman" w:cs="Times New Roman"/>
-          <w:b/>
-          <w:bCs/>
-          <w:sz w:val="24"/>
-          <w:szCs w:val="24"/>
-          <w:lang w:val="es-419" w:eastAsia="es-419"/>
-        </w:rPr>
-        <w:t>forma jurídica de la organización</w:t>
-      </w:r>
-      <w:r>
-        <w:rPr>
-          <w:rFonts w:ascii="Times New Roman" w:eastAsia="Times New Roman" w:hAnsi="Times New Roman" w:cs="Times New Roman"/>
-          <w:sz w:val="24"/>
-          <w:szCs w:val="24"/>
-          <w:lang w:val="es-419" w:eastAsia="es-419"/>
-        </w:rPr>
-        <w:t xml:space="preserve"> y realizar su constitución formal. Para ello serán necesarios documentos como el </w:t>
-      </w:r>
-      <w:r>
-        <w:rPr>
-          <w:rFonts w:ascii="Times New Roman" w:eastAsia="Times New Roman" w:hAnsi="Times New Roman" w:cs="Times New Roman"/>
-          <w:b/>
-          <w:bCs/>
-          <w:sz w:val="24"/>
-          <w:szCs w:val="24"/>
-          <w:lang w:val="es-419" w:eastAsia="es-419"/>
-        </w:rPr>
-        <w:t>acta constitutiva</w:t>
-      </w:r>
-      <w:r>
-        <w:rPr>
-          <w:rFonts w:ascii="Times New Roman" w:eastAsia="Times New Roman" w:hAnsi="Times New Roman" w:cs="Times New Roman"/>
-          <w:sz w:val="24"/>
-          <w:szCs w:val="24"/>
-          <w:lang w:val="es-419" w:eastAsia="es-419"/>
-        </w:rPr>
-        <w:t xml:space="preserve">, donde se establece la creación de la organización, y el </w:t>
-      </w:r>
-      <w:r>
-        <w:rPr>
-          <w:rFonts w:ascii="Times New Roman" w:eastAsia="Times New Roman" w:hAnsi="Times New Roman" w:cs="Times New Roman"/>
-          <w:b/>
-          <w:bCs/>
-          <w:sz w:val="24"/>
-          <w:szCs w:val="24"/>
-          <w:lang w:val="es-419" w:eastAsia="es-419"/>
-        </w:rPr>
-        <w:t>estatuto</w:t>
-      </w:r>
-      <w:r>
-        <w:rPr>
-          <w:rFonts w:ascii="Times New Roman" w:eastAsia="Times New Roman" w:hAnsi="Times New Roman" w:cs="Times New Roman"/>
-          <w:sz w:val="24"/>
-          <w:szCs w:val="24"/>
-          <w:lang w:val="es-419" w:eastAsia="es-419"/>
-        </w:rPr>
-        <w:t>, donde se determinan sus objetivos, autoridades, funcionamiento y destino de los recursos. También deberá registrarse la designación de las autoridades correspondientes.</w:t>
-      </w:r>
-    </w:p>
-    <w:p>
-      <w:pPr>
-        <w:spacing w:before="100" w:beforeAutospacing="1" w:after="100" w:afterAutospacing="1" w:line="240" w:lineRule="auto"/>
-        <w:rPr>
-          <w:rFonts w:ascii="Times New Roman" w:eastAsia="Times New Roman" w:hAnsi="Times New Roman" w:cs="Times New Roman"/>
-          <w:sz w:val="24"/>
-          <w:szCs w:val="24"/>
-          <w:lang w:val="es-419" w:eastAsia="es-419"/>
-        </w:rPr>
-      </w:pPr>
-      <w:r>
-        <w:rPr>
-          <w:rFonts w:ascii="Times New Roman" w:eastAsia="Times New Roman" w:hAnsi="Times New Roman" w:cs="Times New Roman"/>
-          <w:sz w:val="24"/>
-          <w:szCs w:val="24"/>
-          <w:lang w:val="es-419" w:eastAsia="es-419"/>
-        </w:rPr>
-        <w:t xml:space="preserve">En el aspecto </w:t>
-      </w:r>
-      <w:r>
-        <w:rPr>
-          <w:rFonts w:ascii="Times New Roman" w:eastAsia="Times New Roman" w:hAnsi="Times New Roman" w:cs="Times New Roman"/>
-          <w:b/>
-          <w:bCs/>
-          <w:sz w:val="24"/>
-          <w:szCs w:val="24"/>
-          <w:lang w:val="es-419" w:eastAsia="es-419"/>
-        </w:rPr>
-        <w:t>impositivo</w:t>
-      </w:r>
-      <w:r>
-        <w:rPr>
-          <w:rFonts w:ascii="Times New Roman" w:eastAsia="Times New Roman" w:hAnsi="Times New Roman" w:cs="Times New Roman"/>
-          <w:sz w:val="24"/>
-          <w:szCs w:val="24"/>
-          <w:lang w:val="es-419" w:eastAsia="es-419"/>
-        </w:rPr>
-        <w:t xml:space="preserve">, será necesario obtener la </w:t>
-      </w:r>
-      <w:r>
-        <w:rPr>
-          <w:rFonts w:ascii="Times New Roman" w:eastAsia="Times New Roman" w:hAnsi="Times New Roman" w:cs="Times New Roman"/>
-          <w:b/>
-          <w:bCs/>
-          <w:sz w:val="24"/>
-          <w:szCs w:val="24"/>
-          <w:lang w:val="es-419" w:eastAsia="es-419"/>
-        </w:rPr>
-        <w:t>CUIT</w:t>
-      </w:r>
-      <w:r>
-        <w:rPr>
-          <w:rFonts w:ascii="Times New Roman" w:eastAsia="Times New Roman" w:hAnsi="Times New Roman" w:cs="Times New Roman"/>
-          <w:sz w:val="24"/>
-          <w:szCs w:val="24"/>
-          <w:lang w:val="es-419" w:eastAsia="es-419"/>
-        </w:rPr>
-        <w:t xml:space="preserve"> y realizar la inscripción correspondiente ante </w:t>
-      </w:r>
-      <w:r>
-        <w:rPr>
-          <w:rFonts w:ascii="Times New Roman" w:eastAsia="Times New Roman" w:hAnsi="Times New Roman" w:cs="Times New Roman"/>
-          <w:b/>
-          <w:bCs/>
-          <w:sz w:val="24"/>
-          <w:szCs w:val="24"/>
-          <w:lang w:val="es-419" w:eastAsia="es-419"/>
-        </w:rPr>
-        <w:t>ARCA</w:t>
-      </w:r>
-      <w:r>
-        <w:rPr>
-          <w:rFonts w:ascii="Times New Roman" w:eastAsia="Times New Roman" w:hAnsi="Times New Roman" w:cs="Times New Roman"/>
-          <w:sz w:val="24"/>
-          <w:szCs w:val="24"/>
-          <w:lang w:val="es-419" w:eastAsia="es-419"/>
-        </w:rPr>
-        <w:t>, además de establecer el domicilio fiscal y declarar la actividad económica que desarrollará la organización. También deberán determinarse los impuestos y obligaciones tributarias que correspondan según la actividad y la forma jurídica elegida.</w:t>
-      </w:r>
-    </w:p>
-    <w:p>
-      <w:pPr>
-        <w:spacing w:before="100" w:beforeAutospacing="1" w:after="100" w:afterAutospacing="1" w:line="240" w:lineRule="auto"/>
-        <w:rPr>
-          <w:rFonts w:ascii="Times New Roman" w:eastAsia="Times New Roman" w:hAnsi="Times New Roman" w:cs="Times New Roman"/>
-          <w:sz w:val="24"/>
-          <w:szCs w:val="24"/>
-          <w:lang w:val="es-419" w:eastAsia="es-419"/>
-        </w:rPr>
-      </w:pPr>
-      <w:r>
-        <w:rPr>
-          <w:rFonts w:ascii="Times New Roman" w:eastAsia="Times New Roman" w:hAnsi="Times New Roman" w:cs="Times New Roman"/>
-          <w:sz w:val="24"/>
-          <w:szCs w:val="24"/>
-          <w:lang w:val="es-419" w:eastAsia="es-419"/>
-        </w:rPr>
-        <w:t xml:space="preserve">Para el establecimiento donde se almacenen materiales y se realicen actividades de impresión y encuadernación, se deberá gestionar la </w:t>
-      </w:r>
-      <w:r>
-        <w:rPr>
-          <w:rFonts w:ascii="Times New Roman" w:eastAsia="Times New Roman" w:hAnsi="Times New Roman" w:cs="Times New Roman"/>
-          <w:b/>
-          <w:bCs/>
-          <w:sz w:val="24"/>
-          <w:szCs w:val="24"/>
-          <w:lang w:val="es-419" w:eastAsia="es-419"/>
-        </w:rPr>
-        <w:t>habilitación municipal correspondiente</w:t>
-      </w:r>
-      <w:r>
-        <w:rPr>
-          <w:rFonts w:ascii="Times New Roman" w:eastAsia="Times New Roman" w:hAnsi="Times New Roman" w:cs="Times New Roman"/>
-          <w:sz w:val="24"/>
-          <w:szCs w:val="24"/>
-          <w:lang w:val="es-419" w:eastAsia="es-419"/>
-        </w:rPr>
-        <w:t xml:space="preserve"> y verificar que el lugar cumpla con las condiciones necesarias para desarrollar la actividad.</w:t>
-      </w:r>
-    </w:p>
-    <w:p>
-      <w:pPr>
-        <w:spacing w:before="100" w:beforeAutospacing="1" w:after="100" w:afterAutospacing="1" w:line="240" w:lineRule="auto"/>
-        <w:rPr>
-          <w:rFonts w:ascii="Times New Roman" w:eastAsia="Times New Roman" w:hAnsi="Times New Roman" w:cs="Times New Roman"/>
-          <w:sz w:val="24"/>
-          <w:szCs w:val="24"/>
-          <w:lang w:val="es-419" w:eastAsia="es-419"/>
-        </w:rPr>
-      </w:pPr>
-      <w:r>
-        <w:rPr>
-          <w:rFonts w:ascii="Times New Roman" w:eastAsia="Times New Roman" w:hAnsi="Times New Roman" w:cs="Times New Roman"/>
-          <w:sz w:val="24"/>
-          <w:szCs w:val="24"/>
-          <w:lang w:val="es-419" w:eastAsia="es-419"/>
-        </w:rPr>
-        <w:t xml:space="preserve">En materia de </w:t>
-      </w:r>
-      <w:r>
-        <w:rPr>
-          <w:rFonts w:ascii="Times New Roman" w:eastAsia="Times New Roman" w:hAnsi="Times New Roman" w:cs="Times New Roman"/>
-          <w:b/>
-          <w:bCs/>
-          <w:sz w:val="24"/>
-          <w:szCs w:val="24"/>
-          <w:lang w:val="es-419" w:eastAsia="es-419"/>
-        </w:rPr>
-        <w:t>seguridad e higiene</w:t>
-      </w:r>
-      <w:r>
-        <w:rPr>
-          <w:rFonts w:ascii="Times New Roman" w:eastAsia="Times New Roman" w:hAnsi="Times New Roman" w:cs="Times New Roman"/>
-          <w:sz w:val="24"/>
-          <w:szCs w:val="24"/>
-          <w:lang w:val="es-419" w:eastAsia="es-419"/>
-        </w:rPr>
-        <w:t>, será necesario garantizar que las instalaciones, máquinas y herramientas puedan utilizarse de manera segura. Se deberán contemplar aspectos como la seguridad eléctrica, prevención de incendios, señalización, mantenimiento de las máquinas y capacitación de las personas que las utilicen.</w:t>
-      </w:r>
-    </w:p>
-    <w:p>
-      <w:pPr>
-        <w:spacing w:before="100" w:beforeAutospacing="1" w:after="100" w:afterAutospacing="1" w:line="240" w:lineRule="auto"/>
-        <w:rPr>
-          <w:rFonts w:ascii="Times New Roman" w:eastAsia="Times New Roman" w:hAnsi="Times New Roman" w:cs="Times New Roman"/>
-          <w:sz w:val="24"/>
-          <w:szCs w:val="24"/>
-          <w:lang w:val="es-419" w:eastAsia="es-419"/>
-        </w:rPr>
-      </w:pPr>
-      <w:r>
-        <w:rPr>
-          <w:rFonts w:ascii="Times New Roman" w:eastAsia="Times New Roman" w:hAnsi="Times New Roman" w:cs="Times New Roman"/>
-          <w:sz w:val="24"/>
-          <w:szCs w:val="24"/>
-          <w:lang w:val="es-419" w:eastAsia="es-419"/>
-        </w:rPr>
-        <w:t xml:space="preserve">Otro aspecto fundamental será la </w:t>
-      </w:r>
-      <w:r>
-        <w:rPr>
-          <w:rFonts w:ascii="Times New Roman" w:eastAsia="Times New Roman" w:hAnsi="Times New Roman" w:cs="Times New Roman"/>
-          <w:b/>
-          <w:bCs/>
-          <w:sz w:val="24"/>
-          <w:szCs w:val="24"/>
-          <w:lang w:val="es-419" w:eastAsia="es-419"/>
-        </w:rPr>
-        <w:t>propiedad intelectual</w:t>
-      </w:r>
-      <w:r>
-        <w:rPr>
-          <w:rFonts w:ascii="Times New Roman" w:eastAsia="Times New Roman" w:hAnsi="Times New Roman" w:cs="Times New Roman"/>
-          <w:sz w:val="24"/>
-          <w:szCs w:val="24"/>
-          <w:lang w:val="es-419" w:eastAsia="es-419"/>
-        </w:rPr>
-        <w:t xml:space="preserve">. Antes de reproducir y distribuir los libros se deberá comprobar que la organización tenga autorización para hacerlo, ya sea porque la obra se encuentra en dominio público o porque se obtuvo una licencia o autorización del autor, editor o titular de los derechos. Cuando corresponda, también se deberá gestionar el </w:t>
-      </w:r>
-      <w:r>
-        <w:rPr>
-          <w:rFonts w:ascii="Times New Roman" w:eastAsia="Times New Roman" w:hAnsi="Times New Roman" w:cs="Times New Roman"/>
-          <w:b/>
-          <w:bCs/>
-          <w:sz w:val="24"/>
-          <w:szCs w:val="24"/>
-          <w:lang w:val="es-419" w:eastAsia="es-419"/>
-        </w:rPr>
-        <w:t>ISBN</w:t>
-      </w:r>
-      <w:r>
-        <w:rPr>
-          <w:rFonts w:ascii="Times New Roman" w:eastAsia="Times New Roman" w:hAnsi="Times New Roman" w:cs="Times New Roman"/>
-          <w:sz w:val="24"/>
-          <w:szCs w:val="24"/>
-          <w:lang w:val="es-419" w:eastAsia="es-419"/>
-        </w:rPr>
-        <w:t xml:space="preserve"> y la catalogación de las publicaciones.</w:t>
-      </w:r>
-    </w:p>
-    <w:p>
-      <w:pPr>
-        <w:spacing w:before="100" w:beforeAutospacing="1" w:after="100" w:afterAutospacing="1" w:line="240" w:lineRule="auto"/>
-        <w:rPr>
-          <w:rFonts w:ascii="Times New Roman" w:eastAsia="Times New Roman" w:hAnsi="Times New Roman" w:cs="Times New Roman"/>
-          <w:sz w:val="24"/>
-          <w:szCs w:val="24"/>
-          <w:lang w:val="es-419" w:eastAsia="es-419"/>
-        </w:rPr>
-      </w:pPr>
-      <w:r>
-        <w:rPr>
-          <w:rFonts w:ascii="Times New Roman" w:eastAsia="Times New Roman" w:hAnsi="Times New Roman" w:cs="Times New Roman"/>
-          <w:sz w:val="24"/>
-          <w:szCs w:val="24"/>
-          <w:lang w:val="es-419" w:eastAsia="es-419"/>
-        </w:rPr>
-        <w:t xml:space="preserve">Debido al modelo de financiamiento mediante empresas auspiciantes, será necesario establecer </w:t>
-      </w:r>
-      <w:r>
-        <w:rPr>
-          <w:rFonts w:ascii="Times New Roman" w:eastAsia="Times New Roman" w:hAnsi="Times New Roman" w:cs="Times New Roman"/>
-          <w:b/>
-          <w:bCs/>
-          <w:sz w:val="24"/>
-          <w:szCs w:val="24"/>
-          <w:lang w:val="es-419" w:eastAsia="es-419"/>
-        </w:rPr>
-        <w:t>contratos de auspicio</w:t>
-      </w:r>
-      <w:r>
-        <w:rPr>
-          <w:rFonts w:ascii="Times New Roman" w:eastAsia="Times New Roman" w:hAnsi="Times New Roman" w:cs="Times New Roman"/>
-          <w:sz w:val="24"/>
-          <w:szCs w:val="24"/>
-          <w:lang w:val="es-419" w:eastAsia="es-419"/>
-        </w:rPr>
-        <w:t xml:space="preserve"> donde se especifique el aporte de cada empresa y las condiciones de la publicidad que recibirá. También se podrá establecer un contrato con la fábrica encargada de producir los libros, especificando cantidades, características, costos y condiciones de entrega.</w:t>
-      </w:r>
-    </w:p>
-    <w:p>
-      <w:pPr>
-        <w:spacing w:before="100" w:beforeAutospacing="1" w:after="100" w:afterAutospacing="1" w:line="240" w:lineRule="auto"/>
-        <w:rPr>
-          <w:rFonts w:ascii="Times New Roman" w:eastAsia="Times New Roman" w:hAnsi="Times New Roman" w:cs="Times New Roman"/>
-          <w:sz w:val="24"/>
-          <w:szCs w:val="24"/>
-          <w:lang w:val="es-419" w:eastAsia="es-419"/>
-        </w:rPr>
-      </w:pPr>
-      <w:r>
-        <w:rPr>
-          <w:rFonts w:ascii="Times New Roman" w:eastAsia="Times New Roman" w:hAnsi="Times New Roman" w:cs="Times New Roman"/>
-          <w:sz w:val="24"/>
-          <w:szCs w:val="24"/>
-          <w:lang w:val="es-419" w:eastAsia="es-419"/>
-        </w:rPr>
-        <w:t xml:space="preserve">Como la organización contará con una página web y podrá almacenar información de empresas, instituciones y usuarios, también deberá contemplar la </w:t>
-      </w:r>
-      <w:r>
-        <w:rPr>
-          <w:rFonts w:ascii="Times New Roman" w:eastAsia="Times New Roman" w:hAnsi="Times New Roman" w:cs="Times New Roman"/>
-          <w:b/>
-          <w:bCs/>
-          <w:sz w:val="24"/>
-          <w:szCs w:val="24"/>
-          <w:lang w:val="es-419" w:eastAsia="es-419"/>
-        </w:rPr>
-        <w:t>protección de datos personales</w:t>
-      </w:r>
-      <w:r>
-        <w:rPr>
-          <w:rFonts w:ascii="Times New Roman" w:eastAsia="Times New Roman" w:hAnsi="Times New Roman" w:cs="Times New Roman"/>
-          <w:sz w:val="24"/>
-          <w:szCs w:val="24"/>
-          <w:lang w:val="es-419" w:eastAsia="es-419"/>
-        </w:rPr>
-        <w:t>, estableciendo una política de privacidad y las condiciones de uso del sitio.</w:t>
-      </w:r>
-    </w:p>
-    <w:p>
-      <w:pPr>
-        <w:spacing w:before="100" w:beforeAutospacing="1" w:after="100" w:afterAutospacing="1" w:line="240" w:lineRule="auto"/>
-        <w:rPr>
-          <w:rFonts w:ascii="Times New Roman" w:eastAsia="Times New Roman" w:hAnsi="Times New Roman" w:cs="Times New Roman"/>
-          <w:sz w:val="24"/>
-          <w:szCs w:val="24"/>
-          <w:lang w:val="es-419" w:eastAsia="es-419"/>
-        </w:rPr>
-      </w:pPr>
-      <w:r>
-        <w:rPr>
-          <w:rFonts w:ascii="Times New Roman" w:eastAsia="Times New Roman" w:hAnsi="Times New Roman" w:cs="Times New Roman"/>
-          <w:sz w:val="24"/>
-          <w:szCs w:val="24"/>
-          <w:lang w:val="es-419" w:eastAsia="es-419"/>
-        </w:rPr>
-        <w:t>Finalmente, se llevará documentación interna para organizar el funcionamiento de la organización, como registros de voluntarios, mantenimiento de las máquinas, inventario de materiales y libros, contratos y comprobantes de las operaciones realizadas.</w:t>
-      </w:r>
-    </w:p>
-    <w:p>
-      <w:pPr>
-        <w:spacing w:line="276" w:lineRule="auto"/>
-        <w:jc w:val="both"/>
-        <w:rPr>
-          <w:rFonts w:ascii="Times New Roman" w:hAnsi="Times New Roman" w:cs="Times New Roman"/>
-          <w:lang w:val="es-ES"/>
-        </w:rPr>
-      </w:pPr>
+      <w:bookmarkEnd w:id="0"/>
     </w:p>
     <w:sectPr>
       <w:type w:val="continuous"/>
@@ -3101,6 +3153,56 @@
     </w:sectPr>
   </w:body>
 </w:document>
+</file>
+
+<file path=word/endnotes.xml><?xml version="1.0" encoding="utf-8"?>
+<w:endnotes xmlns:wpc="http://schemas.microsoft.com/office/word/2010/wordprocessingCanvas" xmlns:cx="http://schemas.microsoft.com/office/drawing/2014/chartex" xmlns:cx1="http://schemas.microsoft.com/office/drawing/2015/9/8/chartex" xmlns:cx2="http://schemas.microsoft.com/office/drawing/2015/10/21/chartex" xmlns:cx3="http://schemas.microsoft.com/office/drawing/2016/5/9/chartex" xmlns:cx4="http://schemas.microsoft.com/office/drawing/2016/5/10/chartex" xmlns:cx5="http://schemas.microsoft.com/office/drawing/2016/5/11/chartex" xmlns:cx6="http://schemas.microsoft.com/office/drawing/2016/5/12/chartex" xmlns:cx7="http://schemas.microsoft.com/office/drawing/2016/5/13/chartex" xmlns:cx8="http://schemas.microsoft.com/office/drawing/2016/5/14/chartex" xmlns:mc="http://schemas.openxmlformats.org/markup-compatibility/2006" xmlns:aink="http://schemas.microsoft.com/office/drawing/2016/ink" xmlns:am3d="http://schemas.microsoft.com/office/drawing/2017/model3d" xmlns:o="urn:schemas-microsoft-com:office:office" xmlns:r="http://schemas.openxmlformats.org/officeDocument/2006/relationships" xmlns:m="http://schemas.openxmlformats.org/officeDocument/2006/math" xmlns:v="urn:schemas-microsoft-com:vml" xmlns:wp14="http://schemas.microsoft.com/office/word/2010/wordprocessingDrawing" xmlns:wp="http://schemas.openxmlformats.org/drawingml/2006/wordprocessingDrawing" xmlns:w10="urn:schemas-microsoft-com:office:word" xmlns:w="http://schemas.openxmlformats.org/wordprocessingml/2006/main" xmlns:w14="http://schemas.microsoft.com/office/word/2010/wordml" xmlns:w15="http://schemas.microsoft.com/office/word/2012/wordml" xmlns:w16cex="http://schemas.microsoft.com/office/word/2018/wordml/cex" xmlns:w16cid="http://schemas.microsoft.com/office/word/2016/wordml/cid" xmlns:w16="http://schemas.microsoft.com/office/word/2018/wordml" xmlns:w16sdtdh="http://schemas.microsoft.com/office/word/2020/wordml/sdtdatahash" xmlns:w16se="http://schemas.microsoft.com/office/word/2015/wordml/symex" xmlns:wpg="http://schemas.microsoft.com/office/word/2010/wordprocessingGroup" xmlns:wpi="http://schemas.microsoft.com/office/word/2010/wordprocessingInk" xmlns:wne="http://schemas.microsoft.com/office/word/2006/wordml" xmlns:wps="http://schemas.microsoft.com/office/word/2010/wordprocessingShape" mc:Ignorable="w14 w15 w16se w16cid w16 w16cex w16sdtdh wp14">
+  <w:endnote w:type="separator" w:id="-1">
+    <w:p>
+      <w:pPr>
+        <w:spacing w:after="0" w:line="240" w:lineRule="auto"/>
+      </w:pPr>
+      <w:r>
+        <w:separator/>
+      </w:r>
+    </w:p>
+  </w:endnote>
+  <w:endnote w:type="continuationSeparator" w:id="0">
+    <w:p>
+      <w:pPr>
+        <w:spacing w:after="0" w:line="240" w:lineRule="auto"/>
+      </w:pPr>
+      <w:r>
+        <w:continuationSeparator/>
+      </w:r>
+    </w:p>
+  </w:endnote>
+</w:endnotes>
+</file>
+
+<file path=word/footnotes.xml><?xml version="1.0" encoding="utf-8"?>
+<w:footnotes xmlns:wpc="http://schemas.microsoft.com/office/word/2010/wordprocessingCanvas" xmlns:cx="http://schemas.microsoft.com/office/drawing/2014/chartex" xmlns:cx1="http://schemas.microsoft.com/office/drawing/2015/9/8/chartex" xmlns:cx2="http://schemas.microsoft.com/office/drawing/2015/10/21/chartex" xmlns:cx3="http://schemas.microsoft.com/office/drawing/2016/5/9/chartex" xmlns:cx4="http://schemas.microsoft.com/office/drawing/2016/5/10/chartex" xmlns:cx5="http://schemas.microsoft.com/office/drawing/2016/5/11/chartex" xmlns:cx6="http://schemas.microsoft.com/office/drawing/2016/5/12/chartex" xmlns:cx7="http://schemas.microsoft.com/office/drawing/2016/5/13/chartex" xmlns:cx8="http://schemas.microsoft.com/office/drawing/2016/5/14/chartex" xmlns:mc="http://schemas.openxmlformats.org/markup-compatibility/2006" xmlns:aink="http://schemas.microsoft.com/office/drawing/2016/ink" xmlns:am3d="http://schemas.microsoft.com/office/drawing/2017/model3d" xmlns:o="urn:schemas-microsoft-com:office:office" xmlns:r="http://schemas.openxmlformats.org/officeDocument/2006/relationships" xmlns:m="http://schemas.openxmlformats.org/officeDocument/2006/math" xmlns:v="urn:schemas-microsoft-com:vml" xmlns:wp14="http://schemas.microsoft.com/office/word/2010/wordprocessingDrawing" xmlns:wp="http://schemas.openxmlformats.org/drawingml/2006/wordprocessingDrawing" xmlns:w10="urn:schemas-microsoft-com:office:word" xmlns:w="http://schemas.openxmlformats.org/wordprocessingml/2006/main" xmlns:w14="http://schemas.microsoft.com/office/word/2010/wordml" xmlns:w15="http://schemas.microsoft.com/office/word/2012/wordml" xmlns:w16cex="http://schemas.microsoft.com/office/word/2018/wordml/cex" xmlns:w16cid="http://schemas.microsoft.com/office/word/2016/wordml/cid" xmlns:w16="http://schemas.microsoft.com/office/word/2018/wordml" xmlns:w16sdtdh="http://schemas.microsoft.com/office/word/2020/wordml/sdtdatahash" xmlns:w16se="http://schemas.microsoft.com/office/word/2015/wordml/symex" xmlns:wpg="http://schemas.microsoft.com/office/word/2010/wordprocessingGroup" xmlns:wpi="http://schemas.microsoft.com/office/word/2010/wordprocessingInk" xmlns:wne="http://schemas.microsoft.com/office/word/2006/wordml" xmlns:wps="http://schemas.microsoft.com/office/word/2010/wordprocessingShape" mc:Ignorable="w14 w15 w16se w16cid w16 w16cex w16sdtdh wp14">
+  <w:footnote w:type="separator" w:id="-1">
+    <w:p>
+      <w:pPr>
+        <w:spacing w:after="0" w:line="240" w:lineRule="auto"/>
+      </w:pPr>
+      <w:r>
+        <w:separator/>
+      </w:r>
+    </w:p>
+  </w:footnote>
+  <w:footnote w:type="continuationSeparator" w:id="0">
+    <w:p>
+      <w:pPr>
+        <w:spacing w:after="0" w:line="240" w:lineRule="auto"/>
+      </w:pPr>
+      <w:r>
+        <w:continuationSeparator/>
+      </w:r>
+    </w:p>
+  </w:footnote>
+</w:footnotes>
 </file>
 
 <file path=word/numbering.xml><?xml version="1.0" encoding="utf-8"?>
@@ -3126,7 +3228,7 @@
         <v:path o:extrusionok="f" gradientshapeok="t" o:connecttype="rect"/>
         <o:lock v:ext="edit" aspectratio="t"/>
       </v:shapetype>
-      <v:shape id="_x0000_i1217" type="#_x0000_t75" style="width:11.25pt;height:11.25pt" o:bullet="t">
+      <v:shape id="_x0000_i1282" type="#_x0000_t75" style="width:11.25pt;height:11.25pt" o:bullet="t">
         <v:imagedata r:id="rId1" o:title="mso4FA2"/>
       </v:shape>
     </w:pict>
@@ -4117,6 +4219,49 @@
     <w:name w:val="Normal"/>
     <w:qFormat/>
   </w:style>
+  <w:style w:type="paragraph" w:styleId="Ttulo1">
+    <w:name w:val="heading 1"/>
+    <w:basedOn w:val="Normal"/>
+    <w:next w:val="Normal"/>
+    <w:link w:val="Ttulo1Car"/>
+    <w:uiPriority w:val="9"/>
+    <w:qFormat/>
+    <w:rsid w:val="000A20F6"/>
+    <w:pPr>
+      <w:keepNext/>
+      <w:keepLines/>
+      <w:spacing w:before="240" w:after="0"/>
+      <w:outlineLvl w:val="0"/>
+    </w:pPr>
+    <w:rPr>
+      <w:rFonts w:asciiTheme="majorHAnsi" w:eastAsiaTheme="majorEastAsia" w:hAnsiTheme="majorHAnsi" w:cstheme="majorBidi"/>
+      <w:color w:val="2F5496" w:themeColor="accent1" w:themeShade="BF"/>
+      <w:sz w:val="32"/>
+      <w:szCs w:val="32"/>
+    </w:rPr>
+  </w:style>
+  <w:style w:type="paragraph" w:styleId="Ttulo2">
+    <w:name w:val="heading 2"/>
+    <w:basedOn w:val="Normal"/>
+    <w:next w:val="Normal"/>
+    <w:link w:val="Ttulo2Car"/>
+    <w:uiPriority w:val="9"/>
+    <w:unhideWhenUsed/>
+    <w:qFormat/>
+    <w:rsid w:val="000A20F6"/>
+    <w:pPr>
+      <w:keepNext/>
+      <w:keepLines/>
+      <w:spacing w:before="40" w:after="0"/>
+      <w:outlineLvl w:val="1"/>
+    </w:pPr>
+    <w:rPr>
+      <w:rFonts w:asciiTheme="majorHAnsi" w:eastAsiaTheme="majorEastAsia" w:hAnsiTheme="majorHAnsi" w:cstheme="majorBidi"/>
+      <w:color w:val="2F5496" w:themeColor="accent1" w:themeShade="BF"/>
+      <w:sz w:val="26"/>
+      <w:szCs w:val="26"/>
+    </w:rPr>
+  </w:style>
   <w:style w:type="paragraph" w:styleId="Ttulo3">
     <w:name w:val="heading 3"/>
     <w:basedOn w:val="Normal"/>
@@ -4249,6 +4394,76 @@
       <w:sz w:val="24"/>
       <w:szCs w:val="24"/>
       <w:lang w:val="es-419" w:eastAsia="es-419"/>
+    </w:rPr>
+  </w:style>
+  <w:style w:type="paragraph" w:styleId="Encabezado">
+    <w:name w:val="header"/>
+    <w:basedOn w:val="Normal"/>
+    <w:link w:val="EncabezadoCar"/>
+    <w:uiPriority w:val="99"/>
+    <w:unhideWhenUsed/>
+    <w:rsid w:val="003E67C2"/>
+    <w:pPr>
+      <w:tabs>
+        <w:tab w:val="center" w:pos="4252"/>
+        <w:tab w:val="right" w:pos="8504"/>
+      </w:tabs>
+      <w:spacing w:after="0" w:line="240" w:lineRule="auto"/>
+    </w:pPr>
+  </w:style>
+  <w:style w:type="character" w:customStyle="1" w:styleId="EncabezadoCar">
+    <w:name w:val="Encabezado Car"/>
+    <w:basedOn w:val="Fuentedeprrafopredeter"/>
+    <w:link w:val="Encabezado"/>
+    <w:uiPriority w:val="99"/>
+    <w:rsid w:val="003E67C2"/>
+  </w:style>
+  <w:style w:type="paragraph" w:styleId="Piedepgina">
+    <w:name w:val="footer"/>
+    <w:basedOn w:val="Normal"/>
+    <w:link w:val="PiedepginaCar"/>
+    <w:uiPriority w:val="99"/>
+    <w:unhideWhenUsed/>
+    <w:rsid w:val="003E67C2"/>
+    <w:pPr>
+      <w:tabs>
+        <w:tab w:val="center" w:pos="4252"/>
+        <w:tab w:val="right" w:pos="8504"/>
+      </w:tabs>
+      <w:spacing w:after="0" w:line="240" w:lineRule="auto"/>
+    </w:pPr>
+  </w:style>
+  <w:style w:type="character" w:customStyle="1" w:styleId="PiedepginaCar">
+    <w:name w:val="Pie de página Car"/>
+    <w:basedOn w:val="Fuentedeprrafopredeter"/>
+    <w:link w:val="Piedepgina"/>
+    <w:uiPriority w:val="99"/>
+    <w:rsid w:val="003E67C2"/>
+  </w:style>
+  <w:style w:type="character" w:customStyle="1" w:styleId="Ttulo1Car">
+    <w:name w:val="Título 1 Car"/>
+    <w:basedOn w:val="Fuentedeprrafopredeter"/>
+    <w:link w:val="Ttulo1"/>
+    <w:uiPriority w:val="9"/>
+    <w:rsid w:val="000A20F6"/>
+    <w:rPr>
+      <w:rFonts w:asciiTheme="majorHAnsi" w:eastAsiaTheme="majorEastAsia" w:hAnsiTheme="majorHAnsi" w:cstheme="majorBidi"/>
+      <w:color w:val="2F5496" w:themeColor="accent1" w:themeShade="BF"/>
+      <w:sz w:val="32"/>
+      <w:szCs w:val="32"/>
+    </w:rPr>
+  </w:style>
+  <w:style w:type="character" w:customStyle="1" w:styleId="Ttulo2Car">
+    <w:name w:val="Título 2 Car"/>
+    <w:basedOn w:val="Fuentedeprrafopredeter"/>
+    <w:link w:val="Ttulo2"/>
+    <w:uiPriority w:val="9"/>
+    <w:rsid w:val="000A20F6"/>
+    <w:rPr>
+      <w:rFonts w:asciiTheme="majorHAnsi" w:eastAsiaTheme="majorEastAsia" w:hAnsiTheme="majorHAnsi" w:cstheme="majorBidi"/>
+      <w:color w:val="2F5496" w:themeColor="accent1" w:themeShade="BF"/>
+      <w:sz w:val="26"/>
+      <w:szCs w:val="26"/>
     </w:rPr>
   </w:style>
 </w:styles>
@@ -4547,4 +4762,16 @@
     </a:ext>
   </a:extLst>
 </a:theme>
+</file>
+
+<file path=customXml/item1.xml><?xml version="1.0" encoding="utf-8"?>
+<b:Sources xmlns:b="http://schemas.openxmlformats.org/officeDocument/2006/bibliography" xmlns="http://schemas.openxmlformats.org/officeDocument/2006/bibliography" SelectedStyle="\APASixthEditionOfficeOnline.xsl" StyleName="APA" Version="6"/>
+</file>
+
+<file path=customXml/itemProps1.xml><?xml version="1.0" encoding="utf-8"?>
+<ds:datastoreItem xmlns:ds="http://schemas.openxmlformats.org/officeDocument/2006/customXml" ds:itemID="{7A770EC2-20A2-42E2-B81E-8C76CBE0F63A}">
+  <ds:schemaRefs>
+    <ds:schemaRef ds:uri="http://schemas.openxmlformats.org/officeDocument/2006/bibliography"/>
+  </ds:schemaRefs>
+</ds:datastoreItem>
 </file>
</xml_diff>